<commit_message>
todo Abgleich Musterlösung mit ABs eingefügt
</commit_message>
<xml_diff>
--- a/7_KI-Basismodule/KI-B1/KI-B1_Musterlösungen.docx
+++ b/7_KI-Basismodule/KI-B1/KI-B1_Musterlösungen.docx
@@ -1,6 +1,6 @@
 
 <file path=word/document.xml><?xml version="1.0" encoding="utf-8"?>
-<w:document xmlns:wpc="http://schemas.microsoft.com/office/word/2010/wordprocessingCanvas" xmlns:cx="http://schemas.microsoft.com/office/drawing/2014/chartex" xmlns:cx1="http://schemas.microsoft.com/office/drawing/2015/9/8/chartex" xmlns:cx2="http://schemas.microsoft.com/office/drawing/2015/10/21/chartex" xmlns:cx3="http://schemas.microsoft.com/office/drawing/2016/5/9/chartex" xmlns:cx4="http://schemas.microsoft.com/office/drawing/2016/5/10/chartex" xmlns:cx5="http://schemas.microsoft.com/office/drawing/2016/5/11/chartex" xmlns:cx6="http://schemas.microsoft.com/office/drawing/2016/5/12/chartex" xmlns:cx7="http://schemas.microsoft.com/office/drawing/2016/5/13/chartex" xmlns:cx8="http://schemas.microsoft.com/office/drawing/2016/5/14/chartex" xmlns:mc="http://schemas.openxmlformats.org/markup-compatibility/2006" xmlns:aink="http://schemas.microsoft.com/office/drawing/2016/ink" xmlns:am3d="http://schemas.microsoft.com/office/drawing/2017/model3d" xmlns:o="urn:schemas-microsoft-com:office:office" xmlns:oel="http://schemas.microsoft.com/office/2019/extlst" xmlns:r="http://schemas.openxmlformats.org/officeDocument/2006/relationships" xmlns:m="http://schemas.openxmlformats.org/officeDocument/2006/math" xmlns:v="urn:schemas-microsoft-com:vml" xmlns:wp14="http://schemas.microsoft.com/office/word/2010/wordprocessingDrawing" xmlns:wp="http://schemas.openxmlformats.org/drawingml/2006/wordprocessingDrawing" xmlns:w10="urn:schemas-microsoft-com:office:word" xmlns:w="http://schemas.openxmlformats.org/wordprocessingml/2006/main" xmlns:w14="http://schemas.microsoft.com/office/word/2010/wordml" xmlns:w15="http://schemas.microsoft.com/office/word/2012/wordml" xmlns:w16cex="http://schemas.microsoft.com/office/word/2018/wordml/cex" xmlns:w16cid="http://schemas.microsoft.com/office/word/2016/wordml/cid" xmlns:w16="http://schemas.microsoft.com/office/word/2018/wordml" xmlns:w16sdtdh="http://schemas.microsoft.com/office/word/2020/wordml/sdtdatahash" xmlns:w16se="http://schemas.microsoft.com/office/word/2015/wordml/symex" xmlns:wpg="http://schemas.microsoft.com/office/word/2010/wordprocessingGroup" xmlns:wpi="http://schemas.microsoft.com/office/word/2010/wordprocessingInk" xmlns:wne="http://schemas.microsoft.com/office/word/2006/wordml" xmlns:wps="http://schemas.microsoft.com/office/word/2010/wordprocessingShape" mc:Ignorable="w14 w15 w16se w16cid w16 w16cex w16sdtdh wp14">
+<w:document xmlns:wpc="http://schemas.microsoft.com/office/word/2010/wordprocessingCanvas" xmlns:cx="http://schemas.microsoft.com/office/drawing/2014/chartex" xmlns:cx1="http://schemas.microsoft.com/office/drawing/2015/9/8/chartex" xmlns:cx2="http://schemas.microsoft.com/office/drawing/2015/10/21/chartex" xmlns:cx3="http://schemas.microsoft.com/office/drawing/2016/5/9/chartex" xmlns:cx4="http://schemas.microsoft.com/office/drawing/2016/5/10/chartex" xmlns:cx5="http://schemas.microsoft.com/office/drawing/2016/5/11/chartex" xmlns:cx6="http://schemas.microsoft.com/office/drawing/2016/5/12/chartex" xmlns:cx7="http://schemas.microsoft.com/office/drawing/2016/5/13/chartex" xmlns:cx8="http://schemas.microsoft.com/office/drawing/2016/5/14/chartex" xmlns:mc="http://schemas.openxmlformats.org/markup-compatibility/2006" xmlns:aink="http://schemas.microsoft.com/office/drawing/2016/ink" xmlns:am3d="http://schemas.microsoft.com/office/drawing/2017/model3d" xmlns:o="urn:schemas-microsoft-com:office:office" xmlns:oel="http://schemas.microsoft.com/office/2019/extlst" xmlns:r="http://schemas.openxmlformats.org/officeDocument/2006/relationships" xmlns:m="http://schemas.openxmlformats.org/officeDocument/2006/math" xmlns:v="urn:schemas-microsoft-com:vml" xmlns:wp14="http://schemas.microsoft.com/office/word/2010/wordprocessingDrawing" xmlns:wp="http://schemas.openxmlformats.org/drawingml/2006/wordprocessingDrawing" xmlns:w10="urn:schemas-microsoft-com:office:word" xmlns:w="http://schemas.openxmlformats.org/wordprocessingml/2006/main" xmlns:w14="http://schemas.microsoft.com/office/word/2010/wordml" xmlns:w15="http://schemas.microsoft.com/office/word/2012/wordml" xmlns:w16cex="http://schemas.microsoft.com/office/word/2018/wordml/cex" xmlns:w16cid="http://schemas.microsoft.com/office/word/2016/wordml/cid" xmlns:w16="http://schemas.microsoft.com/office/word/2018/wordml" xmlns:w16du="http://schemas.microsoft.com/office/word/2023/wordml/word16du" xmlns:w16sdtdh="http://schemas.microsoft.com/office/word/2020/wordml/sdtdatahash" xmlns:w16se="http://schemas.microsoft.com/office/word/2015/wordml/symex" xmlns:wpg="http://schemas.microsoft.com/office/word/2010/wordprocessingGroup" xmlns:wpi="http://schemas.microsoft.com/office/word/2010/wordprocessingInk" xmlns:wne="http://schemas.microsoft.com/office/word/2006/wordml" xmlns:wps="http://schemas.microsoft.com/office/word/2010/wordprocessingShape" mc:Ignorable="w14 w15 w16se w16cid w16 w16cex w16sdtdh wp14">
   <w:body>
     <w:p>
       <w:pPr>
@@ -10,12 +10,42 @@
           <w:rFonts w:asciiTheme="minorHAnsi" w:hAnsiTheme="minorHAnsi" w:cstheme="minorHAnsi"/>
         </w:rPr>
       </w:pPr>
+      <w:commentRangeStart w:id="0"/>
+      <w:commentRangeStart w:id="1"/>
       <w:r>
         <w:rPr>
           <w:rFonts w:asciiTheme="minorHAnsi" w:hAnsiTheme="minorHAnsi" w:cstheme="minorHAnsi"/>
         </w:rPr>
-        <w:t>Musterlösung KI-B1.2 SekI</w:t>
+        <w:t>Musterlösung</w:t>
       </w:r>
+      <w:commentRangeEnd w:id="0"/>
+      <w:r>
+        <w:rPr>
+          <w:rStyle w:val="Kommentarzeichen"/>
+        </w:rPr>
+        <w:commentReference w:id="0"/>
+      </w:r>
+      <w:commentRangeEnd w:id="1"/>
+      <w:r>
+        <w:rPr>
+          <w:rStyle w:val="Kommentarzeichen"/>
+        </w:rPr>
+        <w:commentReference w:id="1"/>
+      </w:r>
+      <w:r>
+        <w:rPr>
+          <w:rFonts w:asciiTheme="minorHAnsi" w:hAnsiTheme="minorHAnsi" w:cstheme="minorHAnsi"/>
+        </w:rPr>
+        <w:t xml:space="preserve"> KI-B1.2 </w:t>
+      </w:r>
+      <w:proofErr w:type="spellStart"/>
+      <w:r>
+        <w:rPr>
+          <w:rFonts w:asciiTheme="minorHAnsi" w:hAnsiTheme="minorHAnsi" w:cstheme="minorHAnsi"/>
+        </w:rPr>
+        <w:t>SekI</w:t>
+      </w:r>
+      <w:proofErr w:type="spellEnd"/>
     </w:p>
     <w:p>
       <w:pPr>
@@ -106,7 +136,7 @@
         </w:rPr>
         <w:t>en lösen kann (</w:t>
       </w:r>
-      <w:hyperlink r:id="rId10" w:tooltip="https://www.meine-forscherwelt.de/text/was-ist-intelligenz" w:history="1">
+      <w:hyperlink r:id="rId14" w:tooltip="https://www.meine-forscherwelt.de/text/was-ist-intelligenz" w:history="1">
         <w:r>
           <w:rPr>
             <w:rStyle w:val="Hyperlink"/>
@@ -169,7 +199,7 @@
         </w:rPr>
         <w:t xml:space="preserve"> umschreibt die Fähigkeit, sich in neuen Situationen zurechtzufinden und Aufgaben durch Denken zu lösen (</w:t>
       </w:r>
-      <w:hyperlink r:id="rId11" w:tooltip="https://www.ndr.de/ratgeber/gesundheit/Was-ist-Intelligenz,intelligenz114.html" w:history="1">
+      <w:hyperlink r:id="rId15" w:tooltip="https://www.ndr.de/ratgeber/gesundheit/Was-ist-Intelligenz,intelligenz114.html" w:history="1">
         <w:r>
           <w:rPr>
             <w:rStyle w:val="Hyperlink"/>
@@ -206,7 +236,7 @@
         </w:rPr>
         <w:t>Fähigkeiten und Wissen einer Person (</w:t>
       </w:r>
-      <w:hyperlink r:id="rId12" w:tooltip="https://wirtschaftslexikon.gabler.de/definition/intelligenz-37696" w:history="1">
+      <w:hyperlink r:id="rId16" w:tooltip="https://wirtschaftslexikon.gabler.de/definition/intelligenz-37696" w:history="1">
         <w:r>
           <w:rPr>
             <w:rStyle w:val="Hyperlink"/>
@@ -242,7 +272,7 @@
         </w:rPr>
         <w:t>auf neue Anforderungen reagieren (</w:t>
       </w:r>
-      <w:hyperlink r:id="rId13" w:tooltip="https://www.br.de/wissen/intelligenz-iq-test-intelligenztest-hochbegabt-100.html" w:history="1">
+      <w:hyperlink r:id="rId17" w:tooltip="https://www.br.de/wissen/intelligenz-iq-test-intelligenztest-hochbegabt-100.html" w:history="1">
         <w:r>
           <w:rPr>
             <w:rStyle w:val="Hyperlink"/>
@@ -739,7 +769,25 @@
           <w:i/>
           <w:color w:val="000000"/>
         </w:rPr>
-        <w:t>Eine Suchanfrage nach „Gehirn versus Computer“ führt beispielsweise zu folgender Gegenüberstellung, die Russel &amp; Norvig (2012: S. 34) entnommen ist:</w:t>
+        <w:t xml:space="preserve">Eine Suchanfrage nach „Gehirn versus Computer“ führt beispielsweise zu folgender Gegenüberstellung, die Russel &amp; </w:t>
+      </w:r>
+      <w:proofErr w:type="spellStart"/>
+      <w:r>
+        <w:rPr>
+          <w:rFonts w:asciiTheme="minorHAnsi" w:hAnsiTheme="minorHAnsi" w:cstheme="minorHAnsi"/>
+          <w:i/>
+          <w:color w:val="000000"/>
+        </w:rPr>
+        <w:t>Norvig</w:t>
+      </w:r>
+      <w:proofErr w:type="spellEnd"/>
+      <w:r>
+        <w:rPr>
+          <w:rFonts w:asciiTheme="minorHAnsi" w:hAnsiTheme="minorHAnsi" w:cstheme="minorHAnsi"/>
+          <w:i/>
+          <w:color w:val="000000"/>
+        </w:rPr>
+        <w:t xml:space="preserve"> (2012: S. 34) entnommen ist:</w:t>
       </w:r>
     </w:p>
     <w:tbl>
@@ -1586,12 +1634,21 @@
                 <w:color w:val="000000"/>
               </w:rPr>
             </w:pPr>
+            <w:proofErr w:type="spellStart"/>
             <w:r>
               <w:rPr>
                 <w:rFonts w:asciiTheme="minorHAnsi" w:hAnsiTheme="minorHAnsi" w:cstheme="minorHAnsi"/>
                 <w:color w:val="000000"/>
               </w:rPr>
-              <w:t>Speicheraktuali-sierungen / s</w:t>
+              <w:t>Speicheraktuali-sierungen</w:t>
+            </w:r>
+            <w:proofErr w:type="spellEnd"/>
+            <w:r>
+              <w:rPr>
+                <w:rFonts w:asciiTheme="minorHAnsi" w:hAnsiTheme="minorHAnsi" w:cstheme="minorHAnsi"/>
+                <w:color w:val="000000"/>
+              </w:rPr>
+              <w:t xml:space="preserve"> / s</w:t>
             </w:r>
           </w:p>
         </w:tc>
@@ -1968,7 +2025,23 @@
           <w:rFonts w:asciiTheme="minorHAnsi" w:hAnsiTheme="minorHAnsi" w:cstheme="minorHAnsi"/>
           <w:color w:val="000000"/>
         </w:rPr>
-        <w:t xml:space="preserve"> Die Kriterien (erste Spalte), nach denen das menschliche Gehirn mit Computern verglichen werden soll, können alternativ/unterstützend auch von der Lehrkraft vorgegeben werden, um den SuS so konkretere Suchanfragen zu ermöglichen.</w:t>
+        <w:t xml:space="preserve"> Die Kriterien (erste Spalte), nach denen das menschliche Gehirn mit Computern verglichen werden soll, können alternativ/unterstützend auch von der Lehrkraft vorgegeben werden, um den </w:t>
+      </w:r>
+      <w:proofErr w:type="spellStart"/>
+      <w:r>
+        <w:rPr>
+          <w:rFonts w:asciiTheme="minorHAnsi" w:hAnsiTheme="minorHAnsi" w:cstheme="minorHAnsi"/>
+          <w:color w:val="000000"/>
+        </w:rPr>
+        <w:t>SuS</w:t>
+      </w:r>
+      <w:proofErr w:type="spellEnd"/>
+      <w:r>
+        <w:rPr>
+          <w:rFonts w:asciiTheme="minorHAnsi" w:hAnsiTheme="minorHAnsi" w:cstheme="minorHAnsi"/>
+          <w:color w:val="000000"/>
+        </w:rPr>
+        <w:t xml:space="preserve"> so konkretere Suchanfragen zu ermöglichen.</w:t>
       </w:r>
     </w:p>
     <w:p>
@@ -2012,7 +2085,23 @@
           <w:rFonts w:asciiTheme="minorHAnsi" w:hAnsiTheme="minorHAnsi" w:cstheme="minorHAnsi"/>
           <w:color w:val="000000"/>
         </w:rPr>
-        <w:t>Auffällig ist die jeweilige Abhängigkeit von externen Einflüssen: So ist das menschliche Gehirn beispielsweise deutlich leistungsfähiger, wenn angenehme Raumtemperaturen (ca. 20 Grad Celsius) vorherrschen, keine üblen Gerüche zu vernehmen sind und man sich insgesamt „wohl fühlt“. Computern ist es im Allgemeinen relativ egal, wonach es riecht: Leistungen können von ihnen konstanter abgerufen werden.</w:t>
+        <w:t xml:space="preserve">Auffällig ist die jeweilige Abhängigkeit von externen Einflüssen: So ist das menschliche Gehirn beispielsweise deutlich leistungsfähiger, wenn angenehme Raumtemperaturen (ca. 20 Grad Celsius) vorherrschen, keine üblen Gerüche zu vernehmen sind und man sich insgesamt „wohl fühlt“. Computern ist es im </w:t>
+      </w:r>
+      <w:proofErr w:type="gramStart"/>
+      <w:r>
+        <w:rPr>
+          <w:rFonts w:asciiTheme="minorHAnsi" w:hAnsiTheme="minorHAnsi" w:cstheme="minorHAnsi"/>
+          <w:color w:val="000000"/>
+        </w:rPr>
+        <w:t>Allgemeinen relativ</w:t>
+      </w:r>
+      <w:proofErr w:type="gramEnd"/>
+      <w:r>
+        <w:rPr>
+          <w:rFonts w:asciiTheme="minorHAnsi" w:hAnsiTheme="minorHAnsi" w:cstheme="minorHAnsi"/>
+          <w:color w:val="000000"/>
+        </w:rPr>
+        <w:t xml:space="preserve"> egal, wonach es riecht: Leistungen können von ihnen konstanter abgerufen werden.</w:t>
       </w:r>
     </w:p>
     <w:p>
@@ -2043,22 +2132,22 @@
         <w:spacing w:before="120" w:beforeAutospacing="0" w:after="120" w:afterAutospacing="0" w:line="360" w:lineRule="auto"/>
         <w:jc w:val="both"/>
         <w:rPr>
-          <w:rFonts w:asciiTheme="minorHAnsi" w:eastAsia="helvetica 45" w:hAnsiTheme="minorHAnsi" w:cstheme="minorHAnsi"/>
+          <w:rFonts w:asciiTheme="minorHAnsi" w:eastAsia="Helvetica 45" w:hAnsiTheme="minorHAnsi" w:cstheme="minorHAnsi"/>
           <w:color w:val="000000"/>
         </w:rPr>
       </w:pPr>
-      <w:hyperlink r:id="rId14" w:tooltip="https://www.swr.de/wissen/1000-antworten/gesundheit/1000-antworten-2194.html" w:history="1">
+      <w:hyperlink r:id="rId18" w:tooltip="https://www.swr.de/wissen/1000-antworten/gesundheit/1000-antworten-2194.html" w:history="1">
         <w:r>
           <w:rPr>
             <w:rStyle w:val="Hyperlink"/>
-            <w:rFonts w:asciiTheme="minorHAnsi" w:eastAsia="helvetica 45" w:hAnsiTheme="minorHAnsi" w:cstheme="minorHAnsi"/>
+            <w:rFonts w:asciiTheme="minorHAnsi" w:eastAsia="Helvetica 45" w:hAnsiTheme="minorHAnsi" w:cstheme="minorHAnsi"/>
           </w:rPr>
           <w:t>https://www.swr.de/wissen/1000-antworten/gesundheit/1000-antworten-2194.html</w:t>
         </w:r>
       </w:hyperlink>
       <w:r>
         <w:rPr>
-          <w:rFonts w:asciiTheme="minorHAnsi" w:eastAsia="helvetica 45" w:hAnsiTheme="minorHAnsi" w:cstheme="minorHAnsi"/>
+          <w:rFonts w:asciiTheme="minorHAnsi" w:eastAsia="Helvetica 45" w:hAnsiTheme="minorHAnsi" w:cstheme="minorHAnsi"/>
           <w:color w:val="000000"/>
         </w:rPr>
         <w:t xml:space="preserve"> </w:t>
@@ -2077,7 +2166,7 @@
           <w:color w:val="000000"/>
         </w:rPr>
       </w:pPr>
-      <w:hyperlink r:id="rId15" w:tooltip="https://www.dasgehirn.info/aktuell/frage-an-das-gehirn/funktioniert-das-gehirn-wirklich-wie-ein-computer" w:history="1">
+      <w:hyperlink r:id="rId19" w:tooltip="https://www.dasgehirn.info/aktuell/frage-an-das-gehirn/funktioniert-das-gehirn-wirklich-wie-ein-computer" w:history="1">
         <w:r>
           <w:rPr>
             <w:rStyle w:val="Hyperlink"/>
@@ -2100,7 +2189,7 @@
           <w:color w:val="000000"/>
         </w:rPr>
       </w:pPr>
-      <w:hyperlink r:id="rId16" w:tooltip="https://www.wiss.ch/de-CH/Blog/Themen/020919-Gehirn-versus-Computer" w:history="1">
+      <w:hyperlink r:id="rId20" w:tooltip="https://www.wiss.ch/de-CH/Blog/Themen/020919-Gehirn-versus-Computer" w:history="1">
         <w:r>
           <w:rPr>
             <w:rStyle w:val="Hyperlink"/>
@@ -2123,7 +2212,7 @@
           <w:color w:val="000000"/>
         </w:rPr>
       </w:pPr>
-      <w:hyperlink r:id="rId17" w:tooltip="https://amadeus.com/de/insights/blog/mensch-versus-computer" w:history="1">
+      <w:hyperlink r:id="rId21" w:tooltip="https://amadeus.com/de/insights/blog/mensch-versus-computer" w:history="1">
         <w:r>
           <w:rPr>
             <w:rStyle w:val="Hyperlink"/>
@@ -2146,7 +2235,7 @@
           <w:color w:val="000000"/>
         </w:rPr>
       </w:pPr>
-      <w:hyperlink r:id="rId18" w:tooltip="https://de.wikipedia.org/wiki/Gehirn" w:history="1">
+      <w:hyperlink r:id="rId22" w:tooltip="https://de.wikipedia.org/wiki/Gehirn" w:history="1">
         <w:r>
           <w:rPr>
             <w:rStyle w:val="Hyperlink"/>
@@ -2165,22 +2254,22 @@
         </w:numPr>
         <w:spacing w:before="120" w:beforeAutospacing="0" w:after="120" w:afterAutospacing="0" w:line="360" w:lineRule="auto"/>
         <w:rPr>
-          <w:rFonts w:asciiTheme="minorHAnsi" w:eastAsia="helvetica 45" w:hAnsiTheme="minorHAnsi" w:cstheme="minorHAnsi"/>
+          <w:rFonts w:asciiTheme="minorHAnsi" w:eastAsia="Helvetica 45" w:hAnsiTheme="minorHAnsi" w:cstheme="minorHAnsi"/>
           <w:color w:val="000000"/>
         </w:rPr>
       </w:pPr>
-      <w:hyperlink r:id="rId19" w:anchor="Ausgew%C3%A4hlte_aktuelle_Superrechner_(deutschlandweit)" w:tooltip="https://de.wikipedia.org/wiki/Supercomputer#Ausgew%C3%A4hlte_aktuelle_Superrechner_(deutschlandweit)" w:history="1">
+      <w:hyperlink r:id="rId23" w:anchor="Ausgew%C3%A4hlte_aktuelle_Superrechner_(deutschlandweit)" w:tooltip="https://de.wikipedia.org/wiki/Supercomputer#Ausgew%C3%A4hlte_aktuelle_Superrechner_(deutschlandweit)" w:history="1">
         <w:r>
           <w:rPr>
             <w:rStyle w:val="Hyperlink"/>
-            <w:rFonts w:asciiTheme="minorHAnsi" w:eastAsia="helvetica 45" w:hAnsiTheme="minorHAnsi" w:cstheme="minorHAnsi"/>
+            <w:rFonts w:asciiTheme="minorHAnsi" w:eastAsia="Helvetica 45" w:hAnsiTheme="minorHAnsi" w:cstheme="minorHAnsi"/>
           </w:rPr>
           <w:t>https://de.wikipedia.org/wiki/Supercomputer#Ausgew%C3%A4hlte_aktuelle_Superrechner_(deutschlandweit)</w:t>
         </w:r>
       </w:hyperlink>
       <w:r>
         <w:rPr>
-          <w:rFonts w:asciiTheme="minorHAnsi" w:eastAsia="helvetica 45" w:hAnsiTheme="minorHAnsi" w:cstheme="minorHAnsi"/>
+          <w:rFonts w:asciiTheme="minorHAnsi" w:eastAsia="Helvetica 45" w:hAnsiTheme="minorHAnsi" w:cstheme="minorHAnsi"/>
         </w:rPr>
         <w:t xml:space="preserve"> </w:t>
       </w:r>
@@ -2194,22 +2283,22 @@
         </w:numPr>
         <w:spacing w:before="120" w:beforeAutospacing="0" w:after="120" w:afterAutospacing="0" w:line="360" w:lineRule="auto"/>
         <w:rPr>
-          <w:rFonts w:asciiTheme="minorHAnsi" w:eastAsia="helvetica 45" w:hAnsiTheme="minorHAnsi" w:cstheme="minorHAnsi"/>
+          <w:rFonts w:asciiTheme="minorHAnsi" w:eastAsia="Helvetica 45" w:hAnsiTheme="minorHAnsi" w:cstheme="minorHAnsi"/>
           <w:color w:val="000000"/>
         </w:rPr>
       </w:pPr>
-      <w:hyperlink r:id="rId20" w:tooltip="http://www.chemgapedia.de/vsengine/vlu/vsc/de/ch/13/vlu/daten/neuronalenetze/einfuehrung.vlu/Page/vsc/de/ch/13/anc/daten/neuronalenetze/snn1_2.vscml.html" w:history="1">
+      <w:hyperlink r:id="rId24" w:tooltip="http://www.chemgapedia.de/vsengine/vlu/vsc/de/ch/13/vlu/daten/neuronalenetze/einfuehrung.vlu/Page/vsc/de/ch/13/anc/daten/neuronalenetze/snn1_2.vscml.html" w:history="1">
         <w:r>
           <w:rPr>
             <w:rStyle w:val="Hyperlink"/>
-            <w:rFonts w:asciiTheme="minorHAnsi" w:eastAsia="helvetica 45" w:hAnsiTheme="minorHAnsi" w:cstheme="minorHAnsi"/>
+            <w:rFonts w:asciiTheme="minorHAnsi" w:eastAsia="Helvetica 45" w:hAnsiTheme="minorHAnsi" w:cstheme="minorHAnsi"/>
           </w:rPr>
           <w:t>http://www.chemgapedia.de/vsengine/vlu/vsc/de/ch/13/vlu/daten/neuronalenetze/einfuehrung.vlu/Page/vsc/de/ch/13/anc/daten/neuronalenetze/snn1_2.vscml.html</w:t>
         </w:r>
       </w:hyperlink>
       <w:r>
         <w:rPr>
-          <w:rFonts w:asciiTheme="minorHAnsi" w:eastAsia="helvetica 45" w:hAnsiTheme="minorHAnsi" w:cstheme="minorHAnsi"/>
+          <w:rFonts w:asciiTheme="minorHAnsi" w:eastAsia="Helvetica 45" w:hAnsiTheme="minorHAnsi" w:cstheme="minorHAnsi"/>
         </w:rPr>
         <w:t xml:space="preserve"> </w:t>
       </w:r>
@@ -2220,7 +2309,7 @@
         <w:spacing w:before="120" w:beforeAutospacing="0" w:after="120" w:afterAutospacing="0" w:line="360" w:lineRule="auto"/>
         <w:ind w:left="720"/>
         <w:rPr>
-          <w:rFonts w:asciiTheme="minorHAnsi" w:eastAsia="helvetica 45" w:hAnsiTheme="minorHAnsi" w:cstheme="minorHAnsi"/>
+          <w:rFonts w:asciiTheme="minorHAnsi" w:eastAsia="Helvetica 45" w:hAnsiTheme="minorHAnsi" w:cstheme="minorHAnsi"/>
           <w:color w:val="000000"/>
         </w:rPr>
       </w:pPr>
@@ -2238,7 +2327,7 @@
           <w:color w:val="000000"/>
         </w:rPr>
       </w:pPr>
-      <w:hyperlink r:id="rId21" w:tooltip="http://www.informatics4kids.de/index.php/softcomputing-kuenstliche-intelligenz-komplexe-systeme/neuronale-netze/was-sind-neuronale-netze/103-gehirn-versus-computer" w:history="1">
+      <w:hyperlink r:id="rId25" w:tooltip="http://www.informatics4kids.de/index.php/softcomputing-kuenstliche-intelligenz-komplexe-systeme/neuronale-netze/was-sind-neuronale-netze/103-gehirn-versus-computer" w:history="1">
         <w:r>
           <w:rPr>
             <w:rStyle w:val="Hyperlink"/>
@@ -2262,7 +2351,7 @@
           <w:color w:val="000000"/>
         </w:rPr>
       </w:pPr>
-      <w:hyperlink r:id="rId22" w:tooltip="https://www.wasistwas.de/archiv-wissenschaft-details/aus-was-besteht-unser-gehirn.html" w:history="1">
+      <w:hyperlink r:id="rId26" w:tooltip="https://www.wasistwas.de/archiv-wissenschaft-details/aus-was-besteht-unser-gehirn.html" w:history="1">
         <w:r>
           <w:rPr>
             <w:rStyle w:val="Hyperlink"/>
@@ -2320,7 +2409,119 @@
           <w:rFonts w:asciiTheme="minorHAnsi" w:hAnsiTheme="minorHAnsi" w:cstheme="minorHAnsi"/>
           <w:color w:val="000000"/>
         </w:rPr>
-        <w:t>Der Begriff „Artificial Intelligence“ wurde erstmalig im Jahr 1955 von dem Programmierer John McCarthy verwendet. John McCarthy war der Ansicht, dass menschliche Intelligenz von Maschinen simuliert werden kann und schlug für einen Workshop im Rahmen der Darthmouth Konferenz in den USA den Begriff „Artificial Intelligence“ vor. In diesem Workshop wurde mit dem „Logic Theorist“ ein Computer-Programm geschrieben, das verschiedene mathematische Lehrsätze beweisen konnte und die erste AI darstellte. Im Zuge der Konferenz wurden vor allem viele Programme präsentiert, mit denen gegen einen Computer Schach oder Dame gespielt werden konnte.</w:t>
+        <w:t>Der Begriff „</w:t>
+      </w:r>
+      <w:proofErr w:type="spellStart"/>
+      <w:r>
+        <w:rPr>
+          <w:rFonts w:asciiTheme="minorHAnsi" w:hAnsiTheme="minorHAnsi" w:cstheme="minorHAnsi"/>
+          <w:color w:val="000000"/>
+        </w:rPr>
+        <w:t>Artificial</w:t>
+      </w:r>
+      <w:proofErr w:type="spellEnd"/>
+      <w:r>
+        <w:rPr>
+          <w:rFonts w:asciiTheme="minorHAnsi" w:hAnsiTheme="minorHAnsi" w:cstheme="minorHAnsi"/>
+          <w:color w:val="000000"/>
+        </w:rPr>
+        <w:t> </w:t>
+      </w:r>
+      <w:proofErr w:type="spellStart"/>
+      <w:r>
+        <w:rPr>
+          <w:rFonts w:asciiTheme="minorHAnsi" w:hAnsiTheme="minorHAnsi" w:cstheme="minorHAnsi"/>
+          <w:color w:val="000000"/>
+        </w:rPr>
+        <w:t>Intelligence</w:t>
+      </w:r>
+      <w:proofErr w:type="spellEnd"/>
+      <w:r>
+        <w:rPr>
+          <w:rFonts w:asciiTheme="minorHAnsi" w:hAnsiTheme="minorHAnsi" w:cstheme="minorHAnsi"/>
+          <w:color w:val="000000"/>
+        </w:rPr>
+        <w:t xml:space="preserve">“ wurde erstmalig im Jahr 1955 von dem Programmierer John McCarthy verwendet. John McCarthy war der Ansicht, dass menschliche Intelligenz von Maschinen simuliert werden kann und schlug für einen Workshop im Rahmen der </w:t>
+      </w:r>
+      <w:proofErr w:type="spellStart"/>
+      <w:r>
+        <w:rPr>
+          <w:rFonts w:asciiTheme="minorHAnsi" w:hAnsiTheme="minorHAnsi" w:cstheme="minorHAnsi"/>
+          <w:color w:val="000000"/>
+        </w:rPr>
+        <w:t>Darthmouth</w:t>
+      </w:r>
+      <w:proofErr w:type="spellEnd"/>
+      <w:r>
+        <w:rPr>
+          <w:rFonts w:asciiTheme="minorHAnsi" w:hAnsiTheme="minorHAnsi" w:cstheme="minorHAnsi"/>
+          <w:color w:val="000000"/>
+        </w:rPr>
+        <w:t xml:space="preserve"> Konferenz in den USA den Begriff „</w:t>
+      </w:r>
+      <w:proofErr w:type="spellStart"/>
+      <w:r>
+        <w:rPr>
+          <w:rFonts w:asciiTheme="minorHAnsi" w:hAnsiTheme="minorHAnsi" w:cstheme="minorHAnsi"/>
+          <w:color w:val="000000"/>
+        </w:rPr>
+        <w:t>Artificial</w:t>
+      </w:r>
+      <w:proofErr w:type="spellEnd"/>
+      <w:r>
+        <w:rPr>
+          <w:rFonts w:asciiTheme="minorHAnsi" w:hAnsiTheme="minorHAnsi" w:cstheme="minorHAnsi"/>
+          <w:color w:val="000000"/>
+        </w:rPr>
+        <w:t> </w:t>
+      </w:r>
+      <w:proofErr w:type="spellStart"/>
+      <w:r>
+        <w:rPr>
+          <w:rFonts w:asciiTheme="minorHAnsi" w:hAnsiTheme="minorHAnsi" w:cstheme="minorHAnsi"/>
+          <w:color w:val="000000"/>
+        </w:rPr>
+        <w:t>Intelligence</w:t>
+      </w:r>
+      <w:proofErr w:type="spellEnd"/>
+      <w:r>
+        <w:rPr>
+          <w:rFonts w:asciiTheme="minorHAnsi" w:hAnsiTheme="minorHAnsi" w:cstheme="minorHAnsi"/>
+          <w:color w:val="000000"/>
+        </w:rPr>
+        <w:t>“ vor. In diesem Workshop wurde mit dem „</w:t>
+      </w:r>
+      <w:proofErr w:type="spellStart"/>
+      <w:r>
+        <w:rPr>
+          <w:rFonts w:asciiTheme="minorHAnsi" w:hAnsiTheme="minorHAnsi" w:cstheme="minorHAnsi"/>
+          <w:color w:val="000000"/>
+        </w:rPr>
+        <w:t>Logic</w:t>
+      </w:r>
+      <w:proofErr w:type="spellEnd"/>
+      <w:r>
+        <w:rPr>
+          <w:rFonts w:asciiTheme="minorHAnsi" w:hAnsiTheme="minorHAnsi" w:cstheme="minorHAnsi"/>
+          <w:color w:val="000000"/>
+        </w:rPr>
+        <w:t xml:space="preserve"> </w:t>
+      </w:r>
+      <w:proofErr w:type="spellStart"/>
+      <w:r>
+        <w:rPr>
+          <w:rFonts w:asciiTheme="minorHAnsi" w:hAnsiTheme="minorHAnsi" w:cstheme="minorHAnsi"/>
+          <w:color w:val="000000"/>
+        </w:rPr>
+        <w:t>Theorist</w:t>
+      </w:r>
+      <w:proofErr w:type="spellEnd"/>
+      <w:r>
+        <w:rPr>
+          <w:rFonts w:asciiTheme="minorHAnsi" w:hAnsiTheme="minorHAnsi" w:cstheme="minorHAnsi"/>
+          <w:color w:val="000000"/>
+        </w:rPr>
+        <w:t>“ ein Computer-Programm geschrieben, das verschiedene mathematische Lehrsätze beweisen konnte und die erste AI darstellte. Im Zuge der Konferenz wurden vor allem viele Programme präsentiert, mit denen gegen einen Computer Schach oder Dame gespielt werden konnte.</w:t>
       </w:r>
     </w:p>
     <w:p>
@@ -2355,7 +2556,7 @@
           <w:color w:val="000000"/>
         </w:rPr>
       </w:pPr>
-      <w:hyperlink r:id="rId23" w:tooltip="http://www-formal.stanford.edu/jmc/history/dartmouth/dartmouth.html" w:history="1">
+      <w:hyperlink r:id="rId27" w:tooltip="http://www-formal.stanford.edu/jmc/history/dartmouth/dartmouth.html" w:history="1">
         <w:r>
           <w:rPr>
             <w:rStyle w:val="Hyperlink"/>
@@ -2378,7 +2579,7 @@
           <w:color w:val="000000"/>
         </w:rPr>
       </w:pPr>
-      <w:hyperlink r:id="rId24" w:tooltip="https://www.bosch.com/de/stories/geschichte-der-kuenstlichen-intelligenz/" w:history="1">
+      <w:hyperlink r:id="rId28" w:tooltip="https://www.bosch.com/de/stories/geschichte-der-kuenstlichen-intelligenz/" w:history="1">
         <w:r>
           <w:rPr>
             <w:rStyle w:val="Hyperlink"/>
@@ -2401,7 +2602,7 @@
           <w:color w:val="000000"/>
         </w:rPr>
       </w:pPr>
-      <w:hyperlink r:id="rId25" w:tooltip="https://de.wikipedia.org/wiki/Geschichte_der_k%C3%BCnstlichen_Intelligenz" w:history="1">
+      <w:hyperlink r:id="rId29" w:tooltip="https://de.wikipedia.org/wiki/Geschichte_der_k%C3%BCnstlichen_Intelligenz" w:history="1">
         <w:r>
           <w:rPr>
             <w:rStyle w:val="Hyperlink"/>
@@ -2542,7 +2743,39 @@
           <w:rFonts w:asciiTheme="minorHAnsi" w:hAnsiTheme="minorHAnsi" w:cstheme="minorHAnsi"/>
           <w:color w:val="000000"/>
         </w:rPr>
-        <w:t>Der Vergleich von künstlichen Intelligenzen, die verschiedene Fähigkeiten und Fertigkeiten haben, ist schwierig und liegt im Auge des Betrachters bzw. der Betrachterin: Ist z. B. Gesichtserkennung „intelligenter“ als Spracherkennung? Muss man zum Gitarre Spielen „intelligenter“ sein als zum Klavier Spielen? Entsprechende Fragestellungen sind schon bei menschlicher Intelligenz nur schwammig zu beantworten. Entsprechend können auch künstliche Intelligenzen für unterschiedliche Anwendungsprobleme nur bedingt miteinander verglichen werden.</w:t>
+        <w:t xml:space="preserve">Der Vergleich von künstlichen Intelligenzen, die verschiedene Fähigkeiten und Fertigkeiten haben, ist schwierig und liegt im Auge des Betrachters bzw. der Betrachterin: Ist z. B. Gesichtserkennung „intelligenter“ als Spracherkennung? Muss man zum Gitarre </w:t>
+      </w:r>
+      <w:proofErr w:type="spellStart"/>
+      <w:r>
+        <w:rPr>
+          <w:rFonts w:asciiTheme="minorHAnsi" w:hAnsiTheme="minorHAnsi" w:cstheme="minorHAnsi"/>
+          <w:color w:val="000000"/>
+        </w:rPr>
+        <w:t>Spielen</w:t>
+      </w:r>
+      <w:proofErr w:type="spellEnd"/>
+      <w:r>
+        <w:rPr>
+          <w:rFonts w:asciiTheme="minorHAnsi" w:hAnsiTheme="minorHAnsi" w:cstheme="minorHAnsi"/>
+          <w:color w:val="000000"/>
+        </w:rPr>
+        <w:t xml:space="preserve"> „intelligenter“ sein als zum Klavier </w:t>
+      </w:r>
+      <w:proofErr w:type="spellStart"/>
+      <w:r>
+        <w:rPr>
+          <w:rFonts w:asciiTheme="minorHAnsi" w:hAnsiTheme="minorHAnsi" w:cstheme="minorHAnsi"/>
+          <w:color w:val="000000"/>
+        </w:rPr>
+        <w:t>Spielen</w:t>
+      </w:r>
+      <w:proofErr w:type="spellEnd"/>
+      <w:r>
+        <w:rPr>
+          <w:rFonts w:asciiTheme="minorHAnsi" w:hAnsiTheme="minorHAnsi" w:cstheme="minorHAnsi"/>
+          <w:color w:val="000000"/>
+        </w:rPr>
+        <w:t>? Entsprechende Fragestellungen sind schon bei menschlicher Intelligenz nur schwammig zu beantworten. Entsprechend können auch künstliche Intelligenzen für unterschiedliche Anwendungsprobleme nur bedingt miteinander verglichen werden.</w:t>
       </w:r>
     </w:p>
     <w:p>
@@ -2624,16 +2857,32 @@
         </w:numPr>
         <w:spacing w:before="120" w:beforeAutospacing="0" w:after="120" w:afterAutospacing="0" w:line="360" w:lineRule="auto"/>
         <w:rPr>
-          <w:rFonts w:asciiTheme="minorHAnsi" w:eastAsia="helvetica 45" w:hAnsiTheme="minorHAnsi" w:cstheme="minorHAnsi"/>
+          <w:rFonts w:asciiTheme="minorHAnsi" w:eastAsia="Helvetica 45" w:hAnsiTheme="minorHAnsi" w:cstheme="minorHAnsi"/>
           <w:lang w:val="en-US"/>
         </w:rPr>
       </w:pPr>
       <w:r>
         <w:rPr>
-          <w:rFonts w:asciiTheme="minorHAnsi" w:eastAsia="helvetica 45" w:hAnsiTheme="minorHAnsi" w:cstheme="minorHAnsi"/>
+          <w:rFonts w:asciiTheme="minorHAnsi" w:eastAsia="Helvetica 45" w:hAnsiTheme="minorHAnsi" w:cstheme="minorHAnsi"/>
           <w:lang w:val="en-US"/>
         </w:rPr>
-        <w:t>ja, bspw.</w:t>
+        <w:t xml:space="preserve">ja, </w:t>
+      </w:r>
+      <w:proofErr w:type="spellStart"/>
+      <w:r>
+        <w:rPr>
+          <w:rFonts w:asciiTheme="minorHAnsi" w:eastAsia="Helvetica 45" w:hAnsiTheme="minorHAnsi" w:cstheme="minorHAnsi"/>
+          <w:lang w:val="en-US"/>
+        </w:rPr>
+        <w:t>bspw</w:t>
+      </w:r>
+      <w:proofErr w:type="spellEnd"/>
+      <w:r>
+        <w:rPr>
+          <w:rFonts w:asciiTheme="minorHAnsi" w:eastAsia="Helvetica 45" w:hAnsiTheme="minorHAnsi" w:cstheme="minorHAnsi"/>
+          <w:lang w:val="en-US"/>
+        </w:rPr>
+        <w:t>.</w:t>
       </w:r>
     </w:p>
     <w:p>
@@ -2645,22 +2894,31 @@
         </w:numPr>
         <w:spacing w:before="120" w:beforeAutospacing="0" w:after="120" w:afterAutospacing="0" w:line="360" w:lineRule="auto"/>
         <w:rPr>
-          <w:rFonts w:asciiTheme="minorHAnsi" w:eastAsia="helvetica 45" w:hAnsiTheme="minorHAnsi" w:cstheme="minorHAnsi"/>
+          <w:rFonts w:asciiTheme="minorHAnsi" w:eastAsia="Helvetica 45" w:hAnsiTheme="minorHAnsi" w:cstheme="minorHAnsi"/>
           <w:lang w:val="en-US"/>
         </w:rPr>
       </w:pPr>
+      <w:proofErr w:type="spellStart"/>
       <w:r>
         <w:rPr>
-          <w:rFonts w:asciiTheme="minorHAnsi" w:eastAsia="helvetica 45" w:hAnsiTheme="minorHAnsi" w:cstheme="minorHAnsi"/>
+          <w:rFonts w:asciiTheme="minorHAnsi" w:eastAsia="Helvetica 45" w:hAnsiTheme="minorHAnsi" w:cstheme="minorHAnsi"/>
           <w:lang w:val="en-US"/>
         </w:rPr>
-        <w:t>RoboKeeper (</w:t>
+        <w:t>RoboKeeper</w:t>
       </w:r>
-      <w:hyperlink r:id="rId26" w:tooltip="https://www.youtube.com/watch?v=CtNAghrZhr8" w:history="1">
+      <w:proofErr w:type="spellEnd"/>
+      <w:r>
+        <w:rPr>
+          <w:rFonts w:asciiTheme="minorHAnsi" w:eastAsia="Helvetica 45" w:hAnsiTheme="minorHAnsi" w:cstheme="minorHAnsi"/>
+          <w:lang w:val="en-US"/>
+        </w:rPr>
+        <w:t xml:space="preserve"> (</w:t>
+      </w:r>
+      <w:hyperlink r:id="rId30" w:tooltip="https://www.youtube.com/watch?v=CtNAghrZhr8" w:history="1">
         <w:r>
           <w:rPr>
             <w:rStyle w:val="Hyperlink"/>
-            <w:rFonts w:asciiTheme="minorHAnsi" w:eastAsia="helvetica 45" w:hAnsiTheme="minorHAnsi" w:cstheme="minorHAnsi"/>
+            <w:rFonts w:asciiTheme="minorHAnsi" w:eastAsia="Helvetica 45" w:hAnsiTheme="minorHAnsi" w:cstheme="minorHAnsi"/>
             <w:lang w:val="en-US"/>
           </w:rPr>
           <w:t>https://www.youtube.com/watch?v=CtNAghrZhr8</w:t>
@@ -2668,7 +2926,7 @@
       </w:hyperlink>
       <w:r>
         <w:rPr>
-          <w:rFonts w:asciiTheme="minorHAnsi" w:eastAsia="helvetica 45" w:hAnsiTheme="minorHAnsi" w:cstheme="minorHAnsi"/>
+          <w:rFonts w:asciiTheme="minorHAnsi" w:eastAsia="Helvetica 45" w:hAnsiTheme="minorHAnsi" w:cstheme="minorHAnsi"/>
           <w:lang w:val="en-US"/>
         </w:rPr>
         <w:t>)</w:t>
@@ -2683,22 +2941,31 @@
         </w:numPr>
         <w:spacing w:before="120" w:beforeAutospacing="0" w:after="120" w:afterAutospacing="0" w:line="360" w:lineRule="auto"/>
         <w:rPr>
-          <w:rFonts w:asciiTheme="minorHAnsi" w:eastAsia="helvetica 45" w:hAnsiTheme="minorHAnsi" w:cstheme="minorHAnsi"/>
+          <w:rFonts w:asciiTheme="minorHAnsi" w:eastAsia="Helvetica 45" w:hAnsiTheme="minorHAnsi" w:cstheme="minorHAnsi"/>
           <w:lang w:val="en-US"/>
         </w:rPr>
       </w:pPr>
+      <w:proofErr w:type="spellStart"/>
       <w:r>
         <w:rPr>
-          <w:rFonts w:asciiTheme="minorHAnsi" w:eastAsia="helvetica 45" w:hAnsiTheme="minorHAnsi" w:cstheme="minorHAnsi"/>
+          <w:rFonts w:asciiTheme="minorHAnsi" w:eastAsia="Helvetica 45" w:hAnsiTheme="minorHAnsi" w:cstheme="minorHAnsi"/>
           <w:lang w:val="en-US"/>
         </w:rPr>
-        <w:t>robocup (</w:t>
+        <w:t>robocup</w:t>
       </w:r>
-      <w:hyperlink r:id="rId27" w:tooltip="http://www.ais.uni-bonn.de/nimbro/papers/fa05_behnke.pdf" w:history="1">
+      <w:proofErr w:type="spellEnd"/>
+      <w:r>
+        <w:rPr>
+          <w:rFonts w:asciiTheme="minorHAnsi" w:eastAsia="Helvetica 45" w:hAnsiTheme="minorHAnsi" w:cstheme="minorHAnsi"/>
+          <w:lang w:val="en-US"/>
+        </w:rPr>
+        <w:t xml:space="preserve"> (</w:t>
+      </w:r>
+      <w:hyperlink r:id="rId31" w:tooltip="http://www.ais.uni-bonn.de/nimbro/papers/fa05_behnke.pdf" w:history="1">
         <w:r>
           <w:rPr>
             <w:rStyle w:val="Hyperlink"/>
-            <w:rFonts w:asciiTheme="minorHAnsi" w:eastAsia="helvetica 45" w:hAnsiTheme="minorHAnsi" w:cstheme="minorHAnsi"/>
+            <w:rFonts w:asciiTheme="minorHAnsi" w:eastAsia="Helvetica 45" w:hAnsiTheme="minorHAnsi" w:cstheme="minorHAnsi"/>
             <w:lang w:val="en-US"/>
           </w:rPr>
           <w:t>http://www.ais.uni-bonn.de/nimbro/papers/fa05_behnke.pdf</w:t>
@@ -2706,7 +2973,7 @@
       </w:hyperlink>
       <w:r>
         <w:rPr>
-          <w:rFonts w:asciiTheme="minorHAnsi" w:eastAsia="helvetica 45" w:hAnsiTheme="minorHAnsi" w:cstheme="minorHAnsi"/>
+          <w:rFonts w:asciiTheme="minorHAnsi" w:eastAsia="Helvetica 45" w:hAnsiTheme="minorHAnsi" w:cstheme="minorHAnsi"/>
           <w:lang w:val="en-US"/>
         </w:rPr>
         <w:t>)</w:t>
@@ -2850,9 +3117,41 @@
           <w:rFonts w:asciiTheme="minorHAnsi" w:hAnsiTheme="minorHAnsi" w:cstheme="minorHAnsi"/>
           <w:color w:val="000000"/>
         </w:rPr>
-        <w:t>ja, die KI „AlphaGO Zero“ von Google Deepmind gewinnt bereits im Schach und Go gegen einen Großmeister (</w:t>
+        <w:t>ja, die KI „</w:t>
       </w:r>
-      <w:hyperlink r:id="rId28" w:tooltip="https://de.wikipedia.org/wiki/AlphaZero" w:history="1">
+      <w:proofErr w:type="spellStart"/>
+      <w:r>
+        <w:rPr>
+          <w:rFonts w:asciiTheme="minorHAnsi" w:hAnsiTheme="minorHAnsi" w:cstheme="minorHAnsi"/>
+          <w:color w:val="000000"/>
+        </w:rPr>
+        <w:t>AlphaGO</w:t>
+      </w:r>
+      <w:proofErr w:type="spellEnd"/>
+      <w:r>
+        <w:rPr>
+          <w:rFonts w:asciiTheme="minorHAnsi" w:hAnsiTheme="minorHAnsi" w:cstheme="minorHAnsi"/>
+          <w:color w:val="000000"/>
+        </w:rPr>
+        <w:t xml:space="preserve"> Zero“ von Google </w:t>
+      </w:r>
+      <w:proofErr w:type="spellStart"/>
+      <w:r>
+        <w:rPr>
+          <w:rFonts w:asciiTheme="minorHAnsi" w:hAnsiTheme="minorHAnsi" w:cstheme="minorHAnsi"/>
+          <w:color w:val="000000"/>
+        </w:rPr>
+        <w:t>Deepmind</w:t>
+      </w:r>
+      <w:proofErr w:type="spellEnd"/>
+      <w:r>
+        <w:rPr>
+          <w:rFonts w:asciiTheme="minorHAnsi" w:hAnsiTheme="minorHAnsi" w:cstheme="minorHAnsi"/>
+          <w:color w:val="000000"/>
+        </w:rPr>
+        <w:t xml:space="preserve"> gewinnt bereits im Schach und Go gegen einen Großmeister (</w:t>
+      </w:r>
+      <w:hyperlink r:id="rId32" w:tooltip="https://de.wikipedia.org/wiki/AlphaZero" w:history="1">
         <w:r>
           <w:rPr>
             <w:rStyle w:val="Hyperlink"/>
@@ -2908,7 +3207,7 @@
         </w:rPr>
         <w:t xml:space="preserve">ja, „Google Duplex AI Assistent“ kann Termine vereinbaren und dafür auch Telefonate führen, siehe bspw. folgendes Video: </w:t>
       </w:r>
-      <w:hyperlink r:id="rId29" w:tooltip="https://www.youtube.com/watch?v=D5VN56jQMWM" w:history="1">
+      <w:hyperlink r:id="rId33" w:tooltip="https://www.youtube.com/watch?v=D5VN56jQMWM" w:history="1">
         <w:r>
           <w:rPr>
             <w:rStyle w:val="Hyperlink"/>
@@ -2981,7 +3280,23 @@
           <w:rFonts w:asciiTheme="minorHAnsi" w:hAnsiTheme="minorHAnsi" w:cstheme="minorHAnsi"/>
           <w:color w:val="000000"/>
         </w:rPr>
-        <w:t>mit dem chinesische Chatbot „Xiaoice“ können richtige Konversationen geführt werden</w:t>
+        <w:t>mit dem chinesische Chatbot „</w:t>
+      </w:r>
+      <w:proofErr w:type="spellStart"/>
+      <w:r>
+        <w:rPr>
+          <w:rFonts w:asciiTheme="minorHAnsi" w:hAnsiTheme="minorHAnsi" w:cstheme="minorHAnsi"/>
+          <w:color w:val="000000"/>
+        </w:rPr>
+        <w:t>Xiaoice</w:t>
+      </w:r>
+      <w:proofErr w:type="spellEnd"/>
+      <w:r>
+        <w:rPr>
+          <w:rFonts w:asciiTheme="minorHAnsi" w:hAnsiTheme="minorHAnsi" w:cstheme="minorHAnsi"/>
+          <w:color w:val="000000"/>
+        </w:rPr>
+        <w:t>“ können richtige Konversationen geführt werden</w:t>
       </w:r>
     </w:p>
     <w:p>
@@ -3003,7 +3318,7 @@
         </w:rPr>
         <w:t>„Replika“ (</w:t>
       </w:r>
-      <w:hyperlink r:id="rId30" w:tooltip="https://www.tagesspiegel.de/gesellschaft/beziehung-mit-einer-ki-wie-ich-versucht-habe-mich-in-einen-chatbot-zu-verlieben/25495680.html" w:history="1">
+      <w:hyperlink r:id="rId34" w:tooltip="https://www.tagesspiegel.de/gesellschaft/beziehung-mit-einer-ki-wie-ich-versucht-habe-mich-in-einen-chatbot-zu-verlieben/25495680.html" w:history="1">
         <w:r>
           <w:rPr>
             <w:rStyle w:val="Hyperlink"/>
@@ -3036,7 +3351,23 @@
           <w:rFonts w:asciiTheme="minorHAnsi" w:hAnsiTheme="minorHAnsi" w:cstheme="minorHAnsi"/>
           <w:color w:val="000000"/>
         </w:rPr>
-        <w:t>Geben Sie Ihren SuS doch einmal die Aufgabe, ihre persönlichen Sprachassistenten um Trost bei Liebeskummer zu bitten (bspw. „Hey Siri, ich habe Liebeskummer“ oder „Hey Google, was kann ich gegen Liebeskummer tun?“)</w:t>
+        <w:t xml:space="preserve">Geben Sie Ihren </w:t>
+      </w:r>
+      <w:proofErr w:type="spellStart"/>
+      <w:r>
+        <w:rPr>
+          <w:rFonts w:asciiTheme="minorHAnsi" w:hAnsiTheme="minorHAnsi" w:cstheme="minorHAnsi"/>
+          <w:color w:val="000000"/>
+        </w:rPr>
+        <w:t>SuS</w:t>
+      </w:r>
+      <w:proofErr w:type="spellEnd"/>
+      <w:r>
+        <w:rPr>
+          <w:rFonts w:asciiTheme="minorHAnsi" w:hAnsiTheme="minorHAnsi" w:cstheme="minorHAnsi"/>
+          <w:color w:val="000000"/>
+        </w:rPr>
+        <w:t xml:space="preserve"> doch einmal die Aufgabe, ihre persönlichen Sprachassistenten um Trost bei Liebeskummer zu bitten (bspw. „Hey Siri, ich habe Liebeskummer“ oder „Hey Google, was kann ich gegen Liebeskummer tun?“)</w:t>
       </w:r>
     </w:p>
     <w:p>
@@ -3119,7 +3450,7 @@
         <w:lastRenderedPageBreak/>
         <w:t xml:space="preserve">aber es gibt bereits Robotersysteme, die Ärztinnen und Ärzten ferngesteuerte Operationen ermöglichen (siehe bspw. </w:t>
       </w:r>
-      <w:hyperlink r:id="rId31" w:tooltip="https://de.wikipedia.org/wiki/Da-Vinci-Operationssystem" w:history="1">
+      <w:hyperlink r:id="rId35" w:tooltip="https://de.wikipedia.org/wiki/Da-Vinci-Operationssystem" w:history="1">
         <w:r>
           <w:rPr>
             <w:rStyle w:val="Hyperlink"/>
@@ -3172,9 +3503,25 @@
           <w:rFonts w:asciiTheme="minorHAnsi" w:hAnsiTheme="minorHAnsi" w:cstheme="minorHAnsi"/>
           <w:color w:val="000000"/>
         </w:rPr>
-        <w:t>ja, bspw. kann die KI A.I.Duett von eine eingespielte Melodie Antworten (</w:t>
+        <w:t xml:space="preserve">ja, bspw. kann die KI </w:t>
       </w:r>
-      <w:hyperlink r:id="rId32" w:tooltip="https://experiments.withgoogle.com/ai/ai-duet/view/" w:history="1">
+      <w:proofErr w:type="spellStart"/>
+      <w:r>
+        <w:rPr>
+          <w:rFonts w:asciiTheme="minorHAnsi" w:hAnsiTheme="minorHAnsi" w:cstheme="minorHAnsi"/>
+          <w:color w:val="000000"/>
+        </w:rPr>
+        <w:t>A.I.Duett</w:t>
+      </w:r>
+      <w:proofErr w:type="spellEnd"/>
+      <w:r>
+        <w:rPr>
+          <w:rFonts w:asciiTheme="minorHAnsi" w:hAnsiTheme="minorHAnsi" w:cstheme="minorHAnsi"/>
+          <w:color w:val="000000"/>
+        </w:rPr>
+        <w:t xml:space="preserve"> von eine eingespielte Melodie Antworten (</w:t>
+      </w:r>
+      <w:hyperlink r:id="rId36" w:tooltip="https://experiments.withgoogle.com/ai/ai-duet/view/" w:history="1">
         <w:r>
           <w:rPr>
             <w:rStyle w:val="Hyperlink"/>
@@ -3208,9 +3555,25 @@
           <w:rFonts w:asciiTheme="minorHAnsi" w:hAnsiTheme="minorHAnsi" w:cstheme="minorHAnsi"/>
           <w:color w:val="000000"/>
         </w:rPr>
-        <w:t>ja, bspw. kann der Continuator (</w:t>
+        <w:t xml:space="preserve">ja, bspw. kann der </w:t>
       </w:r>
-      <w:hyperlink r:id="rId33" w:tooltip="https://www.youtube.com/watch?v=EmKyySG6qp8" w:history="1">
+      <w:proofErr w:type="spellStart"/>
+      <w:r>
+        <w:rPr>
+          <w:rFonts w:asciiTheme="minorHAnsi" w:hAnsiTheme="minorHAnsi" w:cstheme="minorHAnsi"/>
+          <w:color w:val="000000"/>
+        </w:rPr>
+        <w:t>Continuator</w:t>
+      </w:r>
+      <w:proofErr w:type="spellEnd"/>
+      <w:r>
+        <w:rPr>
+          <w:rFonts w:asciiTheme="minorHAnsi" w:hAnsiTheme="minorHAnsi" w:cstheme="minorHAnsi"/>
+          <w:color w:val="000000"/>
+        </w:rPr>
+        <w:t xml:space="preserve"> (</w:t>
+      </w:r>
+      <w:hyperlink r:id="rId37" w:tooltip="https://www.youtube.com/watch?v=EmKyySG6qp8" w:history="1">
         <w:r>
           <w:rPr>
             <w:rStyle w:val="Hyperlink"/>
@@ -3239,7 +3602,7 @@
           <w:rFonts w:asciiTheme="minorHAnsi" w:hAnsiTheme="minorHAnsi" w:cstheme="minorHAnsi"/>
         </w:rPr>
       </w:pPr>
-      <w:hyperlink r:id="rId34" w:tooltip="https://www.br-klassik.de/aktuell/news-kritik/musik-kuenstliche-intelligenz-computer-100.html" w:history="1">
+      <w:hyperlink r:id="rId38" w:tooltip="https://www.br-klassik.de/aktuell/news-kritik/musik-kuenstliche-intelligenz-computer-100.html" w:history="1">
         <w:r>
           <w:rPr>
             <w:rStyle w:val="Hyperlink"/>
@@ -3324,7 +3687,7 @@
           <w:rFonts w:asciiTheme="minorHAnsi" w:hAnsiTheme="minorHAnsi" w:cstheme="minorHAnsi"/>
         </w:rPr>
       </w:pPr>
-      <w:hyperlink r:id="rId35" w:tooltip="https://algopop.tumblr.com/post/137616217543/generating-scenes-of-friends-with-a-nueral-network" w:history="1">
+      <w:hyperlink r:id="rId39" w:tooltip="https://algopop.tumblr.com/post/137616217543/generating-scenes-of-friends-with-a-nueral-network" w:history="1">
         <w:r>
           <w:rPr>
             <w:rStyle w:val="Hyperlink"/>
@@ -3353,7 +3716,7 @@
           <w:rFonts w:asciiTheme="minorHAnsi" w:hAnsiTheme="minorHAnsi" w:cstheme="minorHAnsi"/>
         </w:rPr>
       </w:pPr>
-      <w:hyperlink r:id="rId36" w:tooltip="https://www.serieslyawesome.tv/kuenstliche-intelligenz-lernt-friends-drehbuecher-zu-schreiben/" w:history="1">
+      <w:hyperlink r:id="rId40" w:tooltip="https://www.serieslyawesome.tv/kuenstliche-intelligenz-lernt-friends-drehbuecher-zu-schreiben/" w:history="1">
         <w:r>
           <w:rPr>
             <w:rStyle w:val="Hyperlink"/>
@@ -3385,7 +3748,21 @@
         <w:rPr>
           <w:rFonts w:asciiTheme="minorHAnsi" w:hAnsiTheme="minorHAnsi" w:cstheme="minorHAnsi"/>
         </w:rPr>
-        <w:t>auch ein Kurzfilm namens „Sunspring“ geht auf die Feder einer KI zurück</w:t>
+        <w:t>auch ein Kurzfilm namens „</w:t>
+      </w:r>
+      <w:proofErr w:type="spellStart"/>
+      <w:r>
+        <w:rPr>
+          <w:rFonts w:asciiTheme="minorHAnsi" w:hAnsiTheme="minorHAnsi" w:cstheme="minorHAnsi"/>
+        </w:rPr>
+        <w:t>Sunspring</w:t>
+      </w:r>
+      <w:proofErr w:type="spellEnd"/>
+      <w:r>
+        <w:rPr>
+          <w:rFonts w:asciiTheme="minorHAnsi" w:hAnsiTheme="minorHAnsi" w:cstheme="minorHAnsi"/>
+        </w:rPr>
+        <w:t>“ geht auf die Feder einer KI zurück</w:t>
       </w:r>
     </w:p>
     <w:p>
@@ -3400,7 +3777,7 @@
           <w:rFonts w:asciiTheme="minorHAnsi" w:hAnsiTheme="minorHAnsi" w:cstheme="minorHAnsi"/>
         </w:rPr>
       </w:pPr>
-      <w:hyperlink r:id="rId37" w:tooltip="https://www.zeit.de/zustimmung?url=https%3A%2F%2Fwww.zeit.de%2Fdigital%2Finternet%2F2016-06%2Fsunspring-kurzfilm-kuenstliche-intelligenz" w:history="1">
+      <w:hyperlink r:id="rId41" w:tooltip="https://www.zeit.de/zustimmung?url=https%3A%2F%2Fwww.zeit.de%2Fdigital%2Finternet%2F2016-06%2Fsunspring-kurzfilm-kuenstliche-intelligenz" w:history="1">
         <w:r>
           <w:rPr>
             <w:rStyle w:val="Hyperlink"/>
@@ -3608,14 +3985,14 @@
             <w:pPr>
               <w:cnfStyle w:val="000000100000" w:firstRow="0" w:lastRow="0" w:firstColumn="0" w:lastColumn="0" w:oddVBand="0" w:evenVBand="0" w:oddHBand="1" w:evenHBand="0" w:firstRowFirstColumn="0" w:firstRowLastColumn="0" w:lastRowFirstColumn="0" w:lastRowLastColumn="0"/>
               <w:rPr>
-                <w:rFonts w:asciiTheme="minorHAnsi" w:eastAsia="helvetica 45" w:hAnsiTheme="minorHAnsi" w:cstheme="minorHAnsi"/>
-                <w:sz w:val="20"/>
-                <w:szCs w:val="20"/>
-              </w:rPr>
-            </w:pPr>
-            <w:r>
-              <w:rPr>
-                <w:rFonts w:asciiTheme="minorHAnsi" w:eastAsia="helvetica 45" w:hAnsiTheme="minorHAnsi" w:cstheme="minorHAnsi"/>
+                <w:rFonts w:asciiTheme="minorHAnsi" w:eastAsia="Helvetica 45" w:hAnsiTheme="minorHAnsi" w:cstheme="minorHAnsi"/>
+                <w:sz w:val="20"/>
+                <w:szCs w:val="20"/>
+              </w:rPr>
+            </w:pPr>
+            <w:r>
+              <w:rPr>
+                <w:rFonts w:asciiTheme="minorHAnsi" w:eastAsia="Helvetica 45" w:hAnsiTheme="minorHAnsi" w:cstheme="minorHAnsi"/>
                 <w:i/>
                 <w:sz w:val="20"/>
                 <w:szCs w:val="20"/>
@@ -3627,7 +4004,7 @@
             <w:pPr>
               <w:cnfStyle w:val="000000100000" w:firstRow="0" w:lastRow="0" w:firstColumn="0" w:lastColumn="0" w:oddVBand="0" w:evenVBand="0" w:oddHBand="1" w:evenHBand="0" w:firstRowFirstColumn="0" w:firstRowLastColumn="0" w:lastRowFirstColumn="0" w:lastRowLastColumn="0"/>
               <w:rPr>
-                <w:rFonts w:asciiTheme="minorHAnsi" w:eastAsia="helvetica 45" w:hAnsiTheme="minorHAnsi" w:cstheme="minorHAnsi"/>
+                <w:rFonts w:asciiTheme="minorHAnsi" w:eastAsia="Helvetica 45" w:hAnsiTheme="minorHAnsi" w:cstheme="minorHAnsi"/>
                 <w:sz w:val="20"/>
                 <w:szCs w:val="20"/>
               </w:rPr>
@@ -3637,14 +4014,14 @@
             <w:pPr>
               <w:cnfStyle w:val="000000100000" w:firstRow="0" w:lastRow="0" w:firstColumn="0" w:lastColumn="0" w:oddVBand="0" w:evenVBand="0" w:oddHBand="1" w:evenHBand="0" w:firstRowFirstColumn="0" w:firstRowLastColumn="0" w:lastRowFirstColumn="0" w:lastRowLastColumn="0"/>
               <w:rPr>
-                <w:rFonts w:asciiTheme="minorHAnsi" w:eastAsia="helvetica 45" w:hAnsiTheme="minorHAnsi" w:cstheme="minorHAnsi"/>
-                <w:sz w:val="20"/>
-                <w:szCs w:val="20"/>
-              </w:rPr>
-            </w:pPr>
-            <w:r>
-              <w:rPr>
-                <w:rFonts w:asciiTheme="minorHAnsi" w:eastAsia="helvetica 45" w:hAnsiTheme="minorHAnsi" w:cstheme="minorHAnsi"/>
+                <w:rFonts w:asciiTheme="minorHAnsi" w:eastAsia="Helvetica 45" w:hAnsiTheme="minorHAnsi" w:cstheme="minorHAnsi"/>
+                <w:sz w:val="20"/>
+                <w:szCs w:val="20"/>
+              </w:rPr>
+            </w:pPr>
+            <w:r>
+              <w:rPr>
+                <w:rFonts w:asciiTheme="minorHAnsi" w:eastAsia="Helvetica 45" w:hAnsiTheme="minorHAnsi" w:cstheme="minorHAnsi"/>
                 <w:i/>
                 <w:sz w:val="20"/>
                 <w:szCs w:val="20"/>
@@ -3673,7 +4050,7 @@
             </w:pPr>
             <w:r>
               <w:rPr>
-                <w:rFonts w:asciiTheme="minorHAnsi" w:eastAsia="helvetica 45" w:hAnsiTheme="minorHAnsi" w:cstheme="minorHAnsi"/>
+                <w:rFonts w:asciiTheme="minorHAnsi" w:eastAsia="Helvetica 45" w:hAnsiTheme="minorHAnsi" w:cstheme="minorHAnsi"/>
                 <w:i/>
                 <w:sz w:val="20"/>
                 <w:szCs w:val="20"/>
@@ -3690,14 +4067,14 @@
             <w:pPr>
               <w:cnfStyle w:val="000000100000" w:firstRow="0" w:lastRow="0" w:firstColumn="0" w:lastColumn="0" w:oddVBand="0" w:evenVBand="0" w:oddHBand="1" w:evenHBand="0" w:firstRowFirstColumn="0" w:firstRowLastColumn="0" w:lastRowFirstColumn="0" w:lastRowLastColumn="0"/>
               <w:rPr>
-                <w:rFonts w:asciiTheme="minorHAnsi" w:eastAsia="helvetica 45" w:hAnsiTheme="minorHAnsi" w:cstheme="minorHAnsi"/>
-                <w:sz w:val="20"/>
-                <w:szCs w:val="20"/>
-              </w:rPr>
-            </w:pPr>
-            <w:r>
-              <w:rPr>
-                <w:rFonts w:asciiTheme="minorHAnsi" w:eastAsia="helvetica 45" w:hAnsiTheme="minorHAnsi" w:cstheme="minorHAnsi"/>
+                <w:rFonts w:asciiTheme="minorHAnsi" w:eastAsia="Helvetica 45" w:hAnsiTheme="minorHAnsi" w:cstheme="minorHAnsi"/>
+                <w:sz w:val="20"/>
+                <w:szCs w:val="20"/>
+              </w:rPr>
+            </w:pPr>
+            <w:r>
+              <w:rPr>
+                <w:rFonts w:asciiTheme="minorHAnsi" w:eastAsia="Helvetica 45" w:hAnsiTheme="minorHAnsi" w:cstheme="minorHAnsi"/>
                 <w:bCs w:val="0"/>
                 <w:sz w:val="20"/>
                 <w:szCs w:val="20"/>
@@ -3758,14 +4135,14 @@
             <w:pPr>
               <w:cnfStyle w:val="000000000000" w:firstRow="0" w:lastRow="0" w:firstColumn="0" w:lastColumn="0" w:oddVBand="0" w:evenVBand="0" w:oddHBand="0" w:evenHBand="0" w:firstRowFirstColumn="0" w:firstRowLastColumn="0" w:lastRowFirstColumn="0" w:lastRowLastColumn="0"/>
               <w:rPr>
-                <w:rFonts w:asciiTheme="minorHAnsi" w:eastAsia="helvetica 45" w:hAnsiTheme="minorHAnsi" w:cstheme="minorHAnsi"/>
-                <w:sz w:val="20"/>
-                <w:szCs w:val="20"/>
-              </w:rPr>
-            </w:pPr>
-            <w:r>
-              <w:rPr>
-                <w:rFonts w:asciiTheme="minorHAnsi" w:eastAsia="helvetica 45" w:hAnsiTheme="minorHAnsi" w:cstheme="minorHAnsi"/>
+                <w:rFonts w:asciiTheme="minorHAnsi" w:eastAsia="Helvetica 45" w:hAnsiTheme="minorHAnsi" w:cstheme="minorHAnsi"/>
+                <w:sz w:val="20"/>
+                <w:szCs w:val="20"/>
+              </w:rPr>
+            </w:pPr>
+            <w:r>
+              <w:rPr>
+                <w:rFonts w:asciiTheme="minorHAnsi" w:eastAsia="Helvetica 45" w:hAnsiTheme="minorHAnsi" w:cstheme="minorHAnsi"/>
                 <w:i/>
                 <w:sz w:val="20"/>
                 <w:szCs w:val="20"/>
@@ -3841,7 +4218,7 @@
             </w:pPr>
             <w:r>
               <w:rPr>
-                <w:rFonts w:asciiTheme="minorHAnsi" w:eastAsia="helvetica 45" w:hAnsiTheme="minorHAnsi" w:cstheme="minorHAnsi"/>
+                <w:rFonts w:asciiTheme="minorHAnsi" w:eastAsia="Helvetica 45" w:hAnsiTheme="minorHAnsi" w:cstheme="minorHAnsi"/>
                 <w:i/>
                 <w:sz w:val="20"/>
                 <w:szCs w:val="20"/>
@@ -3897,7 +4274,25 @@
                 <w:sz w:val="20"/>
                 <w:szCs w:val="20"/>
               </w:rPr>
-              <w:t>Für die Echtzeit-Erkennung im Einzelhandel benötigt die KI Videodateien in Echtzeit</w:t>
+              <w:t xml:space="preserve">Für die Echtzeit-Erkennung im Einzelhandel benötigt die </w:t>
+            </w:r>
+            <w:proofErr w:type="gramStart"/>
+            <w:r>
+              <w:rPr>
+                <w:rFonts w:asciiTheme="minorHAnsi" w:hAnsiTheme="minorHAnsi" w:cstheme="minorHAnsi"/>
+                <w:sz w:val="20"/>
+                <w:szCs w:val="20"/>
+              </w:rPr>
+              <w:t>KI Videodateien</w:t>
+            </w:r>
+            <w:proofErr w:type="gramEnd"/>
+            <w:r>
+              <w:rPr>
+                <w:rFonts w:asciiTheme="minorHAnsi" w:hAnsiTheme="minorHAnsi" w:cstheme="minorHAnsi"/>
+                <w:sz w:val="20"/>
+                <w:szCs w:val="20"/>
+              </w:rPr>
+              <w:t xml:space="preserve"> in Echtzeit</w:t>
             </w:r>
           </w:p>
           <w:p>
@@ -3953,7 +4348,7 @@
             </w:pPr>
             <w:r>
               <w:rPr>
-                <w:rFonts w:asciiTheme="minorHAnsi" w:eastAsia="helvetica 45" w:hAnsiTheme="minorHAnsi" w:cstheme="minorHAnsi"/>
+                <w:rFonts w:asciiTheme="minorHAnsi" w:eastAsia="Helvetica 45" w:hAnsiTheme="minorHAnsi" w:cstheme="minorHAnsi"/>
                 <w:i/>
                 <w:sz w:val="20"/>
                 <w:szCs w:val="20"/>
@@ -4029,7 +4424,7 @@
             </w:pPr>
             <w:r>
               <w:rPr>
-                <w:rFonts w:asciiTheme="minorHAnsi" w:eastAsia="helvetica 45" w:hAnsiTheme="minorHAnsi" w:cstheme="minorHAnsi"/>
+                <w:rFonts w:asciiTheme="minorHAnsi" w:eastAsia="Helvetica 45" w:hAnsiTheme="minorHAnsi" w:cstheme="minorHAnsi"/>
                 <w:i/>
                 <w:sz w:val="20"/>
                 <w:szCs w:val="20"/>
@@ -4057,8 +4452,18 @@
                 <w:sz w:val="20"/>
                 <w:szCs w:val="20"/>
               </w:rPr>
-              <w:t>Denkbar ist, dass diese KI ein Audiosignal ausgibt sowie eine Bilddatei, der Person, die sich auffällig verhält</w:t>
-            </w:r>
+              <w:t xml:space="preserve">Denkbar ist, dass diese KI ein Audiosignal ausgibt sowie eine Bilddatei, der Person, die sich auffällig </w:t>
+            </w:r>
+            <w:proofErr w:type="gramStart"/>
+            <w:r>
+              <w:rPr>
+                <w:rFonts w:asciiTheme="minorHAnsi" w:hAnsiTheme="minorHAnsi" w:cstheme="minorHAnsi"/>
+                <w:sz w:val="20"/>
+                <w:szCs w:val="20"/>
+              </w:rPr>
+              <w:t>verhält</w:t>
+            </w:r>
+            <w:proofErr w:type="gramEnd"/>
           </w:p>
         </w:tc>
       </w:tr>
@@ -4104,7 +4509,7 @@
             </w:pPr>
             <w:r>
               <w:rPr>
-                <w:rFonts w:asciiTheme="minorHAnsi" w:eastAsia="helvetica 45" w:hAnsiTheme="minorHAnsi" w:cstheme="minorHAnsi"/>
+                <w:rFonts w:asciiTheme="minorHAnsi" w:eastAsia="Helvetica 45" w:hAnsiTheme="minorHAnsi" w:cstheme="minorHAnsi"/>
                 <w:i/>
                 <w:sz w:val="20"/>
                 <w:szCs w:val="20"/>
@@ -4180,7 +4585,7 @@
             </w:pPr>
             <w:r>
               <w:rPr>
-                <w:rFonts w:asciiTheme="minorHAnsi" w:eastAsia="helvetica 45" w:hAnsiTheme="minorHAnsi" w:cstheme="minorHAnsi"/>
+                <w:rFonts w:asciiTheme="minorHAnsi" w:eastAsia="Helvetica 45" w:hAnsiTheme="minorHAnsi" w:cstheme="minorHAnsi"/>
                 <w:i/>
                 <w:sz w:val="20"/>
                 <w:szCs w:val="20"/>
@@ -4204,7 +4609,7 @@
             </w:pPr>
             <w:r>
               <w:rPr>
-                <w:rFonts w:asciiTheme="minorHAnsi" w:eastAsia="helvetica 45" w:hAnsiTheme="minorHAnsi" w:cstheme="minorHAnsi"/>
+                <w:rFonts w:asciiTheme="minorHAnsi" w:eastAsia="Helvetica 45" w:hAnsiTheme="minorHAnsi" w:cstheme="minorHAnsi"/>
                 <w:sz w:val="20"/>
                 <w:szCs w:val="20"/>
               </w:rPr>
@@ -4294,14 +4699,14 @@
             <w:pPr>
               <w:cnfStyle w:val="100000000000" w:firstRow="1" w:lastRow="0" w:firstColumn="0" w:lastColumn="0" w:oddVBand="0" w:evenVBand="0" w:oddHBand="0" w:evenHBand="0" w:firstRowFirstColumn="0" w:firstRowLastColumn="0" w:lastRowFirstColumn="0" w:lastRowLastColumn="0"/>
               <w:rPr>
-                <w:rFonts w:asciiTheme="minorHAnsi" w:eastAsia="helvetica 45" w:hAnsiTheme="minorHAnsi" w:cstheme="minorHAnsi"/>
-                <w:sz w:val="20"/>
-                <w:szCs w:val="20"/>
-              </w:rPr>
-            </w:pPr>
-            <w:r>
-              <w:rPr>
-                <w:rFonts w:asciiTheme="minorHAnsi" w:eastAsia="helvetica 45" w:hAnsiTheme="minorHAnsi" w:cstheme="minorHAnsi"/>
+                <w:rFonts w:asciiTheme="minorHAnsi" w:eastAsia="Helvetica 45" w:hAnsiTheme="minorHAnsi" w:cstheme="minorHAnsi"/>
+                <w:sz w:val="20"/>
+                <w:szCs w:val="20"/>
+              </w:rPr>
+            </w:pPr>
+            <w:r>
+              <w:rPr>
+                <w:rFonts w:asciiTheme="minorHAnsi" w:eastAsia="Helvetica 45" w:hAnsiTheme="minorHAnsi" w:cstheme="minorHAnsi"/>
                 <w:sz w:val="20"/>
                 <w:szCs w:val="20"/>
               </w:rPr>
@@ -4309,7 +4714,7 @@
             </w:r>
             <w:r>
               <w:rPr>
-                <w:rFonts w:asciiTheme="minorHAnsi" w:eastAsia="helvetica 45" w:hAnsiTheme="minorHAnsi" w:cstheme="minorHAnsi"/>
+                <w:rFonts w:asciiTheme="minorHAnsi" w:eastAsia="Helvetica 45" w:hAnsiTheme="minorHAnsi" w:cstheme="minorHAnsi"/>
                 <w:bCs w:val="0"/>
                 <w:sz w:val="20"/>
                 <w:szCs w:val="20"/>
@@ -4321,14 +4726,14 @@
             <w:pPr>
               <w:cnfStyle w:val="100000000000" w:firstRow="1" w:lastRow="0" w:firstColumn="0" w:lastColumn="0" w:oddVBand="0" w:evenVBand="0" w:oddHBand="0" w:evenHBand="0" w:firstRowFirstColumn="0" w:firstRowLastColumn="0" w:lastRowFirstColumn="0" w:lastRowLastColumn="0"/>
               <w:rPr>
-                <w:rFonts w:asciiTheme="minorHAnsi" w:eastAsia="helvetica 45" w:hAnsiTheme="minorHAnsi" w:cstheme="minorHAnsi"/>
-                <w:sz w:val="20"/>
-                <w:szCs w:val="20"/>
-              </w:rPr>
-            </w:pPr>
-            <w:r>
-              <w:rPr>
-                <w:rFonts w:asciiTheme="minorHAnsi" w:eastAsia="helvetica 45" w:hAnsiTheme="minorHAnsi" w:cstheme="minorHAnsi"/>
+                <w:rFonts w:asciiTheme="minorHAnsi" w:eastAsia="Helvetica 45" w:hAnsiTheme="minorHAnsi" w:cstheme="minorHAnsi"/>
+                <w:sz w:val="20"/>
+                <w:szCs w:val="20"/>
+              </w:rPr>
+            </w:pPr>
+            <w:r>
+              <w:rPr>
+                <w:rFonts w:asciiTheme="minorHAnsi" w:eastAsia="Helvetica 45" w:hAnsiTheme="minorHAnsi" w:cstheme="minorHAnsi"/>
                 <w:b w:val="0"/>
                 <w:bCs w:val="0"/>
                 <w:sz w:val="20"/>
@@ -4375,14 +4780,14 @@
             <w:pPr>
               <w:cnfStyle w:val="000000100000" w:firstRow="0" w:lastRow="0" w:firstColumn="0" w:lastColumn="0" w:oddVBand="0" w:evenVBand="0" w:oddHBand="1" w:evenHBand="0" w:firstRowFirstColumn="0" w:firstRowLastColumn="0" w:lastRowFirstColumn="0" w:lastRowLastColumn="0"/>
               <w:rPr>
-                <w:rFonts w:asciiTheme="minorHAnsi" w:eastAsia="helvetica 45" w:hAnsiTheme="minorHAnsi" w:cstheme="minorHAnsi"/>
-                <w:sz w:val="20"/>
-                <w:szCs w:val="20"/>
-              </w:rPr>
-            </w:pPr>
-            <w:r>
-              <w:rPr>
-                <w:rFonts w:asciiTheme="minorHAnsi" w:eastAsia="helvetica 45" w:hAnsiTheme="minorHAnsi" w:cstheme="minorHAnsi"/>
+                <w:rFonts w:asciiTheme="minorHAnsi" w:eastAsia="Helvetica 45" w:hAnsiTheme="minorHAnsi" w:cstheme="minorHAnsi"/>
+                <w:sz w:val="20"/>
+                <w:szCs w:val="20"/>
+              </w:rPr>
+            </w:pPr>
+            <w:r>
+              <w:rPr>
+                <w:rFonts w:asciiTheme="minorHAnsi" w:eastAsia="Helvetica 45" w:hAnsiTheme="minorHAnsi" w:cstheme="minorHAnsi"/>
                 <w:i/>
                 <w:sz w:val="20"/>
                 <w:szCs w:val="20"/>
@@ -4394,14 +4799,14 @@
             <w:pPr>
               <w:cnfStyle w:val="000000100000" w:firstRow="0" w:lastRow="0" w:firstColumn="0" w:lastColumn="0" w:oddVBand="0" w:evenVBand="0" w:oddHBand="1" w:evenHBand="0" w:firstRowFirstColumn="0" w:firstRowLastColumn="0" w:lastRowFirstColumn="0" w:lastRowLastColumn="0"/>
               <w:rPr>
-                <w:rFonts w:asciiTheme="minorHAnsi" w:eastAsia="helvetica 45" w:hAnsiTheme="minorHAnsi" w:cstheme="minorHAnsi"/>
-                <w:sz w:val="20"/>
-                <w:szCs w:val="20"/>
-              </w:rPr>
-            </w:pPr>
-            <w:r>
-              <w:rPr>
-                <w:rFonts w:asciiTheme="minorHAnsi" w:eastAsia="helvetica 45" w:hAnsiTheme="minorHAnsi" w:cstheme="minorHAnsi"/>
+                <w:rFonts w:asciiTheme="minorHAnsi" w:eastAsia="Helvetica 45" w:hAnsiTheme="minorHAnsi" w:cstheme="minorHAnsi"/>
+                <w:sz w:val="20"/>
+                <w:szCs w:val="20"/>
+              </w:rPr>
+            </w:pPr>
+            <w:r>
+              <w:rPr>
+                <w:rFonts w:asciiTheme="minorHAnsi" w:eastAsia="Helvetica 45" w:hAnsiTheme="minorHAnsi" w:cstheme="minorHAnsi"/>
                 <w:i/>
                 <w:sz w:val="20"/>
                 <w:szCs w:val="20"/>
@@ -4420,7 +4825,7 @@
             </w:pPr>
             <w:r>
               <w:rPr>
-                <w:rFonts w:asciiTheme="minorHAnsi" w:eastAsia="helvetica 45" w:hAnsiTheme="minorHAnsi" w:cstheme="minorHAnsi"/>
+                <w:rFonts w:asciiTheme="minorHAnsi" w:eastAsia="Helvetica 45" w:hAnsiTheme="minorHAnsi" w:cstheme="minorHAnsi"/>
                 <w:i/>
                 <w:sz w:val="20"/>
                 <w:szCs w:val="20"/>
@@ -4437,14 +4842,14 @@
             <w:pPr>
               <w:cnfStyle w:val="000000100000" w:firstRow="0" w:lastRow="0" w:firstColumn="0" w:lastColumn="0" w:oddVBand="0" w:evenVBand="0" w:oddHBand="1" w:evenHBand="0" w:firstRowFirstColumn="0" w:firstRowLastColumn="0" w:lastRowFirstColumn="0" w:lastRowLastColumn="0"/>
               <w:rPr>
-                <w:rFonts w:asciiTheme="minorHAnsi" w:eastAsia="helvetica 45" w:hAnsiTheme="minorHAnsi" w:cstheme="minorHAnsi"/>
-                <w:sz w:val="20"/>
-                <w:szCs w:val="20"/>
-              </w:rPr>
-            </w:pPr>
-            <w:r>
-              <w:rPr>
-                <w:rFonts w:asciiTheme="minorHAnsi" w:eastAsia="helvetica 45" w:hAnsiTheme="minorHAnsi" w:cstheme="minorHAnsi"/>
+                <w:rFonts w:asciiTheme="minorHAnsi" w:eastAsia="Helvetica 45" w:hAnsiTheme="minorHAnsi" w:cstheme="minorHAnsi"/>
+                <w:sz w:val="20"/>
+                <w:szCs w:val="20"/>
+              </w:rPr>
+            </w:pPr>
+            <w:r>
+              <w:rPr>
+                <w:rFonts w:asciiTheme="minorHAnsi" w:eastAsia="Helvetica 45" w:hAnsiTheme="minorHAnsi" w:cstheme="minorHAnsi"/>
                 <w:sz w:val="20"/>
                 <w:szCs w:val="20"/>
               </w:rPr>
@@ -4455,14 +4860,14 @@
             <w:pPr>
               <w:cnfStyle w:val="000000100000" w:firstRow="0" w:lastRow="0" w:firstColumn="0" w:lastColumn="0" w:oddVBand="0" w:evenVBand="0" w:oddHBand="1" w:evenHBand="0" w:firstRowFirstColumn="0" w:firstRowLastColumn="0" w:lastRowFirstColumn="0" w:lastRowLastColumn="0"/>
               <w:rPr>
-                <w:rFonts w:asciiTheme="minorHAnsi" w:eastAsia="helvetica 45" w:hAnsiTheme="minorHAnsi" w:cstheme="minorHAnsi"/>
-                <w:sz w:val="20"/>
-                <w:szCs w:val="20"/>
-              </w:rPr>
-            </w:pPr>
-            <w:r>
-              <w:rPr>
-                <w:rFonts w:asciiTheme="minorHAnsi" w:eastAsia="helvetica 45" w:hAnsiTheme="minorHAnsi" w:cstheme="minorHAnsi"/>
+                <w:rFonts w:asciiTheme="minorHAnsi" w:eastAsia="Helvetica 45" w:hAnsiTheme="minorHAnsi" w:cstheme="minorHAnsi"/>
+                <w:sz w:val="20"/>
+                <w:szCs w:val="20"/>
+              </w:rPr>
+            </w:pPr>
+            <w:r>
+              <w:rPr>
+                <w:rFonts w:asciiTheme="minorHAnsi" w:eastAsia="Helvetica 45" w:hAnsiTheme="minorHAnsi" w:cstheme="minorHAnsi"/>
                 <w:sz w:val="20"/>
                 <w:szCs w:val="20"/>
               </w:rPr>
@@ -4505,14 +4910,14 @@
             <w:pPr>
               <w:cnfStyle w:val="000000000000" w:firstRow="0" w:lastRow="0" w:firstColumn="0" w:lastColumn="0" w:oddVBand="0" w:evenVBand="0" w:oddHBand="0" w:evenHBand="0" w:firstRowFirstColumn="0" w:firstRowLastColumn="0" w:lastRowFirstColumn="0" w:lastRowLastColumn="0"/>
               <w:rPr>
-                <w:rFonts w:asciiTheme="minorHAnsi" w:eastAsia="helvetica 45" w:hAnsiTheme="minorHAnsi" w:cstheme="minorHAnsi"/>
-                <w:sz w:val="20"/>
-                <w:szCs w:val="20"/>
-              </w:rPr>
-            </w:pPr>
-            <w:r>
-              <w:rPr>
-                <w:rFonts w:asciiTheme="minorHAnsi" w:eastAsia="helvetica 45" w:hAnsiTheme="minorHAnsi" w:cstheme="minorHAnsi"/>
+                <w:rFonts w:asciiTheme="minorHAnsi" w:eastAsia="Helvetica 45" w:hAnsiTheme="minorHAnsi" w:cstheme="minorHAnsi"/>
+                <w:sz w:val="20"/>
+                <w:szCs w:val="20"/>
+              </w:rPr>
+            </w:pPr>
+            <w:r>
+              <w:rPr>
+                <w:rFonts w:asciiTheme="minorHAnsi" w:eastAsia="Helvetica 45" w:hAnsiTheme="minorHAnsi" w:cstheme="minorHAnsi"/>
                 <w:i/>
                 <w:sz w:val="20"/>
                 <w:szCs w:val="20"/>
@@ -4588,7 +4993,7 @@
             </w:pPr>
             <w:r>
               <w:rPr>
-                <w:rFonts w:asciiTheme="minorHAnsi" w:eastAsia="helvetica 45" w:hAnsiTheme="minorHAnsi" w:cstheme="minorHAnsi"/>
+                <w:rFonts w:asciiTheme="minorHAnsi" w:eastAsia="Helvetica 45" w:hAnsiTheme="minorHAnsi" w:cstheme="minorHAnsi"/>
                 <w:i/>
                 <w:sz w:val="20"/>
                 <w:szCs w:val="20"/>
@@ -4605,14 +5010,14 @@
             <w:pPr>
               <w:cnfStyle w:val="000000100000" w:firstRow="0" w:lastRow="0" w:firstColumn="0" w:lastColumn="0" w:oddVBand="0" w:evenVBand="0" w:oddHBand="1" w:evenHBand="0" w:firstRowFirstColumn="0" w:firstRowLastColumn="0" w:lastRowFirstColumn="0" w:lastRowLastColumn="0"/>
               <w:rPr>
-                <w:rFonts w:asciiTheme="minorHAnsi" w:eastAsia="helvetica 45" w:hAnsiTheme="minorHAnsi" w:cstheme="minorHAnsi"/>
-                <w:sz w:val="20"/>
-                <w:szCs w:val="20"/>
-              </w:rPr>
-            </w:pPr>
-            <w:r>
-              <w:rPr>
-                <w:rFonts w:asciiTheme="minorHAnsi" w:eastAsia="helvetica 45" w:hAnsiTheme="minorHAnsi" w:cstheme="minorHAnsi"/>
+                <w:rFonts w:asciiTheme="minorHAnsi" w:eastAsia="Helvetica 45" w:hAnsiTheme="minorHAnsi" w:cstheme="minorHAnsi"/>
+                <w:sz w:val="20"/>
+                <w:szCs w:val="20"/>
+              </w:rPr>
+            </w:pPr>
+            <w:r>
+              <w:rPr>
+                <w:rFonts w:asciiTheme="minorHAnsi" w:eastAsia="Helvetica 45" w:hAnsiTheme="minorHAnsi" w:cstheme="minorHAnsi"/>
                 <w:sz w:val="20"/>
                 <w:szCs w:val="20"/>
               </w:rPr>
@@ -4662,7 +5067,7 @@
             </w:pPr>
             <w:r>
               <w:rPr>
-                <w:rFonts w:asciiTheme="minorHAnsi" w:eastAsia="helvetica 45" w:hAnsiTheme="minorHAnsi" w:cstheme="minorHAnsi"/>
+                <w:rFonts w:asciiTheme="minorHAnsi" w:eastAsia="Helvetica 45" w:hAnsiTheme="minorHAnsi" w:cstheme="minorHAnsi"/>
                 <w:i/>
                 <w:sz w:val="20"/>
                 <w:szCs w:val="20"/>
@@ -4679,14 +5084,14 @@
             <w:pPr>
               <w:cnfStyle w:val="000000000000" w:firstRow="0" w:lastRow="0" w:firstColumn="0" w:lastColumn="0" w:oddVBand="0" w:evenVBand="0" w:oddHBand="0" w:evenHBand="0" w:firstRowFirstColumn="0" w:firstRowLastColumn="0" w:lastRowFirstColumn="0" w:lastRowLastColumn="0"/>
               <w:rPr>
-                <w:rFonts w:asciiTheme="minorHAnsi" w:eastAsia="helvetica 45" w:hAnsiTheme="minorHAnsi" w:cstheme="minorHAnsi"/>
-                <w:sz w:val="20"/>
-                <w:szCs w:val="20"/>
-              </w:rPr>
-            </w:pPr>
-            <w:r>
-              <w:rPr>
-                <w:rFonts w:asciiTheme="minorHAnsi" w:eastAsia="helvetica 45" w:hAnsiTheme="minorHAnsi" w:cstheme="minorHAnsi"/>
+                <w:rFonts w:asciiTheme="minorHAnsi" w:eastAsia="Helvetica 45" w:hAnsiTheme="minorHAnsi" w:cstheme="minorHAnsi"/>
+                <w:sz w:val="20"/>
+                <w:szCs w:val="20"/>
+              </w:rPr>
+            </w:pPr>
+            <w:r>
+              <w:rPr>
+                <w:rFonts w:asciiTheme="minorHAnsi" w:eastAsia="Helvetica 45" w:hAnsiTheme="minorHAnsi" w:cstheme="minorHAnsi"/>
                 <w:sz w:val="20"/>
                 <w:szCs w:val="20"/>
               </w:rPr>
@@ -4697,14 +5102,14 @@
             <w:pPr>
               <w:cnfStyle w:val="000000000000" w:firstRow="0" w:lastRow="0" w:firstColumn="0" w:lastColumn="0" w:oddVBand="0" w:evenVBand="0" w:oddHBand="0" w:evenHBand="0" w:firstRowFirstColumn="0" w:firstRowLastColumn="0" w:lastRowFirstColumn="0" w:lastRowLastColumn="0"/>
               <w:rPr>
-                <w:rFonts w:asciiTheme="minorHAnsi" w:eastAsia="helvetica 45" w:hAnsiTheme="minorHAnsi" w:cstheme="minorHAnsi"/>
-                <w:sz w:val="20"/>
-                <w:szCs w:val="20"/>
-              </w:rPr>
-            </w:pPr>
-            <w:r>
-              <w:rPr>
-                <w:rFonts w:asciiTheme="minorHAnsi" w:eastAsia="helvetica 45" w:hAnsiTheme="minorHAnsi" w:cstheme="minorHAnsi"/>
+                <w:rFonts w:asciiTheme="minorHAnsi" w:eastAsia="Helvetica 45" w:hAnsiTheme="minorHAnsi" w:cstheme="minorHAnsi"/>
+                <w:sz w:val="20"/>
+                <w:szCs w:val="20"/>
+              </w:rPr>
+            </w:pPr>
+            <w:r>
+              <w:rPr>
+                <w:rFonts w:asciiTheme="minorHAnsi" w:eastAsia="Helvetica 45" w:hAnsiTheme="minorHAnsi" w:cstheme="minorHAnsi"/>
                 <w:sz w:val="20"/>
                 <w:szCs w:val="20"/>
               </w:rPr>
@@ -4715,14 +5120,14 @@
             <w:pPr>
               <w:cnfStyle w:val="000000000000" w:firstRow="0" w:lastRow="0" w:firstColumn="0" w:lastColumn="0" w:oddVBand="0" w:evenVBand="0" w:oddHBand="0" w:evenHBand="0" w:firstRowFirstColumn="0" w:firstRowLastColumn="0" w:lastRowFirstColumn="0" w:lastRowLastColumn="0"/>
               <w:rPr>
-                <w:rFonts w:asciiTheme="minorHAnsi" w:eastAsia="helvetica 45" w:hAnsiTheme="minorHAnsi" w:cstheme="minorHAnsi"/>
-                <w:sz w:val="20"/>
-                <w:szCs w:val="20"/>
-              </w:rPr>
-            </w:pPr>
-            <w:r>
-              <w:rPr>
-                <w:rFonts w:asciiTheme="minorHAnsi" w:eastAsia="helvetica 45" w:hAnsiTheme="minorHAnsi" w:cstheme="minorHAnsi"/>
+                <w:rFonts w:asciiTheme="minorHAnsi" w:eastAsia="Helvetica 45" w:hAnsiTheme="minorHAnsi" w:cstheme="minorHAnsi"/>
+                <w:sz w:val="20"/>
+                <w:szCs w:val="20"/>
+              </w:rPr>
+            </w:pPr>
+            <w:r>
+              <w:rPr>
+                <w:rFonts w:asciiTheme="minorHAnsi" w:eastAsia="Helvetica 45" w:hAnsiTheme="minorHAnsi" w:cstheme="minorHAnsi"/>
                 <w:sz w:val="20"/>
                 <w:szCs w:val="20"/>
               </w:rPr>
@@ -4774,7 +5179,7 @@
             </w:pPr>
             <w:r>
               <w:rPr>
-                <w:rFonts w:asciiTheme="minorHAnsi" w:eastAsia="helvetica 45" w:hAnsiTheme="minorHAnsi" w:cstheme="minorHAnsi"/>
+                <w:rFonts w:asciiTheme="minorHAnsi" w:eastAsia="Helvetica 45" w:hAnsiTheme="minorHAnsi" w:cstheme="minorHAnsi"/>
                 <w:i/>
                 <w:sz w:val="20"/>
                 <w:szCs w:val="20"/>
@@ -4791,14 +5196,14 @@
             <w:pPr>
               <w:cnfStyle w:val="000000100000" w:firstRow="0" w:lastRow="0" w:firstColumn="0" w:lastColumn="0" w:oddVBand="0" w:evenVBand="0" w:oddHBand="1" w:evenHBand="0" w:firstRowFirstColumn="0" w:firstRowLastColumn="0" w:lastRowFirstColumn="0" w:lastRowLastColumn="0"/>
               <w:rPr>
-                <w:rFonts w:asciiTheme="minorHAnsi" w:eastAsia="helvetica 45" w:hAnsiTheme="minorHAnsi" w:cstheme="minorHAnsi"/>
-                <w:sz w:val="20"/>
-                <w:szCs w:val="20"/>
-              </w:rPr>
-            </w:pPr>
-            <w:r>
-              <w:rPr>
-                <w:rFonts w:asciiTheme="minorHAnsi" w:eastAsia="helvetica 45" w:hAnsiTheme="minorHAnsi" w:cstheme="minorHAnsi"/>
+                <w:rFonts w:asciiTheme="minorHAnsi" w:eastAsia="Helvetica 45" w:hAnsiTheme="minorHAnsi" w:cstheme="minorHAnsi"/>
+                <w:sz w:val="20"/>
+                <w:szCs w:val="20"/>
+              </w:rPr>
+            </w:pPr>
+            <w:r>
+              <w:rPr>
+                <w:rFonts w:asciiTheme="minorHAnsi" w:eastAsia="Helvetica 45" w:hAnsiTheme="minorHAnsi" w:cstheme="minorHAnsi"/>
                 <w:sz w:val="20"/>
                 <w:szCs w:val="20"/>
               </w:rPr>
@@ -4849,7 +5254,7 @@
             </w:pPr>
             <w:r>
               <w:rPr>
-                <w:rFonts w:asciiTheme="minorHAnsi" w:eastAsia="helvetica 45" w:hAnsiTheme="minorHAnsi" w:cstheme="minorHAnsi"/>
+                <w:rFonts w:asciiTheme="minorHAnsi" w:eastAsia="Helvetica 45" w:hAnsiTheme="minorHAnsi" w:cstheme="minorHAnsi"/>
                 <w:i/>
                 <w:sz w:val="20"/>
                 <w:szCs w:val="20"/>
@@ -4866,14 +5271,14 @@
             <w:pPr>
               <w:cnfStyle w:val="000000000000" w:firstRow="0" w:lastRow="0" w:firstColumn="0" w:lastColumn="0" w:oddVBand="0" w:evenVBand="0" w:oddHBand="0" w:evenHBand="0" w:firstRowFirstColumn="0" w:firstRowLastColumn="0" w:lastRowFirstColumn="0" w:lastRowLastColumn="0"/>
               <w:rPr>
-                <w:rFonts w:asciiTheme="minorHAnsi" w:eastAsia="helvetica 45" w:hAnsiTheme="minorHAnsi" w:cstheme="minorHAnsi"/>
-                <w:sz w:val="20"/>
-                <w:szCs w:val="20"/>
-              </w:rPr>
-            </w:pPr>
-            <w:r>
-              <w:rPr>
-                <w:rFonts w:asciiTheme="minorHAnsi" w:eastAsia="helvetica 45" w:hAnsiTheme="minorHAnsi" w:cstheme="minorHAnsi"/>
+                <w:rFonts w:asciiTheme="minorHAnsi" w:eastAsia="Helvetica 45" w:hAnsiTheme="minorHAnsi" w:cstheme="minorHAnsi"/>
+                <w:sz w:val="20"/>
+                <w:szCs w:val="20"/>
+              </w:rPr>
+            </w:pPr>
+            <w:r>
+              <w:rPr>
+                <w:rFonts w:asciiTheme="minorHAnsi" w:eastAsia="Helvetica 45" w:hAnsiTheme="minorHAnsi" w:cstheme="minorHAnsi"/>
                 <w:sz w:val="20"/>
                 <w:szCs w:val="20"/>
               </w:rPr>
@@ -4925,7 +5330,7 @@
             </w:pPr>
             <w:r>
               <w:rPr>
-                <w:rFonts w:asciiTheme="minorHAnsi" w:eastAsia="helvetica 45" w:hAnsiTheme="minorHAnsi" w:cstheme="minorHAnsi"/>
+                <w:rFonts w:asciiTheme="minorHAnsi" w:eastAsia="Helvetica 45" w:hAnsiTheme="minorHAnsi" w:cstheme="minorHAnsi"/>
                 <w:i/>
                 <w:sz w:val="20"/>
                 <w:szCs w:val="20"/>
@@ -4942,14 +5347,14 @@
             <w:pPr>
               <w:cnfStyle w:val="000000100000" w:firstRow="0" w:lastRow="0" w:firstColumn="0" w:lastColumn="0" w:oddVBand="0" w:evenVBand="0" w:oddHBand="1" w:evenHBand="0" w:firstRowFirstColumn="0" w:firstRowLastColumn="0" w:lastRowFirstColumn="0" w:lastRowLastColumn="0"/>
               <w:rPr>
-                <w:rFonts w:asciiTheme="minorHAnsi" w:eastAsia="helvetica 45" w:hAnsiTheme="minorHAnsi" w:cstheme="minorHAnsi"/>
-                <w:sz w:val="20"/>
-                <w:szCs w:val="20"/>
-              </w:rPr>
-            </w:pPr>
-            <w:r>
-              <w:rPr>
-                <w:rFonts w:asciiTheme="minorHAnsi" w:eastAsia="helvetica 45" w:hAnsiTheme="minorHAnsi" w:cstheme="minorHAnsi"/>
+                <w:rFonts w:asciiTheme="minorHAnsi" w:eastAsia="Helvetica 45" w:hAnsiTheme="minorHAnsi" w:cstheme="minorHAnsi"/>
+                <w:sz w:val="20"/>
+                <w:szCs w:val="20"/>
+              </w:rPr>
+            </w:pPr>
+            <w:r>
+              <w:rPr>
+                <w:rFonts w:asciiTheme="minorHAnsi" w:eastAsia="Helvetica 45" w:hAnsiTheme="minorHAnsi" w:cstheme="minorHAnsi"/>
                 <w:sz w:val="20"/>
                 <w:szCs w:val="20"/>
               </w:rPr>
@@ -4957,7 +5362,7 @@
             </w:r>
             <w:r>
               <w:rPr>
-                <w:rFonts w:asciiTheme="minorHAnsi" w:eastAsia="helvetica 45" w:hAnsiTheme="minorHAnsi" w:cstheme="minorHAnsi"/>
+                <w:rFonts w:asciiTheme="minorHAnsi" w:eastAsia="Helvetica 45" w:hAnsiTheme="minorHAnsi" w:cstheme="minorHAnsi"/>
                 <w:sz w:val="20"/>
                 <w:szCs w:val="20"/>
               </w:rPr>
@@ -5049,7 +5454,7 @@
             <w:pPr>
               <w:cnfStyle w:val="100000000000" w:firstRow="1" w:lastRow="0" w:firstColumn="0" w:lastColumn="0" w:oddVBand="0" w:evenVBand="0" w:oddHBand="0" w:evenHBand="0" w:firstRowFirstColumn="0" w:firstRowLastColumn="0" w:lastRowFirstColumn="0" w:lastRowLastColumn="0"/>
               <w:rPr>
-                <w:rFonts w:asciiTheme="minorHAnsi" w:eastAsia="helvetica 45" w:hAnsiTheme="minorHAnsi" w:cstheme="minorHAnsi"/>
+                <w:rFonts w:asciiTheme="minorHAnsi" w:eastAsia="Helvetica 45" w:hAnsiTheme="minorHAnsi" w:cstheme="minorHAnsi"/>
                 <w:bCs w:val="0"/>
                 <w:sz w:val="20"/>
                 <w:szCs w:val="20"/>
@@ -5057,7 +5462,7 @@
             </w:pPr>
             <w:r>
               <w:rPr>
-                <w:rFonts w:asciiTheme="minorHAnsi" w:eastAsia="helvetica 45" w:hAnsiTheme="minorHAnsi" w:cstheme="minorHAnsi"/>
+                <w:rFonts w:asciiTheme="minorHAnsi" w:eastAsia="Helvetica 45" w:hAnsiTheme="minorHAnsi" w:cstheme="minorHAnsi"/>
                 <w:bCs w:val="0"/>
                 <w:sz w:val="20"/>
                 <w:szCs w:val="20"/>
@@ -5069,14 +5474,14 @@
             <w:pPr>
               <w:cnfStyle w:val="100000000000" w:firstRow="1" w:lastRow="0" w:firstColumn="0" w:lastColumn="0" w:oddVBand="0" w:evenVBand="0" w:oddHBand="0" w:evenHBand="0" w:firstRowFirstColumn="0" w:firstRowLastColumn="0" w:lastRowFirstColumn="0" w:lastRowLastColumn="0"/>
               <w:rPr>
-                <w:rFonts w:asciiTheme="minorHAnsi" w:eastAsia="helvetica 45" w:hAnsiTheme="minorHAnsi" w:cstheme="minorHAnsi"/>
-                <w:sz w:val="20"/>
-                <w:szCs w:val="20"/>
-              </w:rPr>
-            </w:pPr>
-            <w:r>
-              <w:rPr>
-                <w:rFonts w:asciiTheme="minorHAnsi" w:eastAsia="helvetica 45" w:hAnsiTheme="minorHAnsi" w:cstheme="minorHAnsi"/>
+                <w:rFonts w:asciiTheme="minorHAnsi" w:eastAsia="Helvetica 45" w:hAnsiTheme="minorHAnsi" w:cstheme="minorHAnsi"/>
+                <w:sz w:val="20"/>
+                <w:szCs w:val="20"/>
+              </w:rPr>
+            </w:pPr>
+            <w:r>
+              <w:rPr>
+                <w:rFonts w:asciiTheme="minorHAnsi" w:eastAsia="Helvetica 45" w:hAnsiTheme="minorHAnsi" w:cstheme="minorHAnsi"/>
                 <w:b w:val="0"/>
                 <w:bCs w:val="0"/>
                 <w:sz w:val="20"/>
@@ -5123,14 +5528,14 @@
             <w:pPr>
               <w:cnfStyle w:val="000000100000" w:firstRow="0" w:lastRow="0" w:firstColumn="0" w:lastColumn="0" w:oddVBand="0" w:evenVBand="0" w:oddHBand="1" w:evenHBand="0" w:firstRowFirstColumn="0" w:firstRowLastColumn="0" w:lastRowFirstColumn="0" w:lastRowLastColumn="0"/>
               <w:rPr>
-                <w:rFonts w:asciiTheme="minorHAnsi" w:eastAsia="helvetica 45" w:hAnsiTheme="minorHAnsi" w:cstheme="minorHAnsi"/>
-                <w:sz w:val="20"/>
-                <w:szCs w:val="20"/>
-              </w:rPr>
-            </w:pPr>
-            <w:r>
-              <w:rPr>
-                <w:rFonts w:asciiTheme="minorHAnsi" w:eastAsia="helvetica 45" w:hAnsiTheme="minorHAnsi" w:cstheme="minorHAnsi"/>
+                <w:rFonts w:asciiTheme="minorHAnsi" w:eastAsia="Helvetica 45" w:hAnsiTheme="minorHAnsi" w:cstheme="minorHAnsi"/>
+                <w:sz w:val="20"/>
+                <w:szCs w:val="20"/>
+              </w:rPr>
+            </w:pPr>
+            <w:r>
+              <w:rPr>
+                <w:rFonts w:asciiTheme="minorHAnsi" w:eastAsia="Helvetica 45" w:hAnsiTheme="minorHAnsi" w:cstheme="minorHAnsi"/>
                 <w:i/>
                 <w:sz w:val="20"/>
                 <w:szCs w:val="20"/>
@@ -5142,7 +5547,7 @@
             <w:pPr>
               <w:cnfStyle w:val="000000100000" w:firstRow="0" w:lastRow="0" w:firstColumn="0" w:lastColumn="0" w:oddVBand="0" w:evenVBand="0" w:oddHBand="1" w:evenHBand="0" w:firstRowFirstColumn="0" w:firstRowLastColumn="0" w:lastRowFirstColumn="0" w:lastRowLastColumn="0"/>
               <w:rPr>
-                <w:rFonts w:asciiTheme="minorHAnsi" w:eastAsia="helvetica 45" w:hAnsiTheme="minorHAnsi" w:cstheme="minorHAnsi"/>
+                <w:rFonts w:asciiTheme="minorHAnsi" w:eastAsia="Helvetica 45" w:hAnsiTheme="minorHAnsi" w:cstheme="minorHAnsi"/>
                 <w:sz w:val="20"/>
                 <w:szCs w:val="20"/>
               </w:rPr>
@@ -5152,14 +5557,14 @@
             <w:pPr>
               <w:cnfStyle w:val="000000100000" w:firstRow="0" w:lastRow="0" w:firstColumn="0" w:lastColumn="0" w:oddVBand="0" w:evenVBand="0" w:oddHBand="1" w:evenHBand="0" w:firstRowFirstColumn="0" w:firstRowLastColumn="0" w:lastRowFirstColumn="0" w:lastRowLastColumn="0"/>
               <w:rPr>
-                <w:rFonts w:asciiTheme="minorHAnsi" w:eastAsia="helvetica 45" w:hAnsiTheme="minorHAnsi" w:cstheme="minorHAnsi"/>
-                <w:sz w:val="20"/>
-                <w:szCs w:val="20"/>
-              </w:rPr>
-            </w:pPr>
-            <w:r>
-              <w:rPr>
-                <w:rFonts w:asciiTheme="minorHAnsi" w:eastAsia="helvetica 45" w:hAnsiTheme="minorHAnsi" w:cstheme="minorHAnsi"/>
+                <w:rFonts w:asciiTheme="minorHAnsi" w:eastAsia="Helvetica 45" w:hAnsiTheme="minorHAnsi" w:cstheme="minorHAnsi"/>
+                <w:sz w:val="20"/>
+                <w:szCs w:val="20"/>
+              </w:rPr>
+            </w:pPr>
+            <w:r>
+              <w:rPr>
+                <w:rFonts w:asciiTheme="minorHAnsi" w:eastAsia="Helvetica 45" w:hAnsiTheme="minorHAnsi" w:cstheme="minorHAnsi"/>
                 <w:i/>
                 <w:sz w:val="20"/>
                 <w:szCs w:val="20"/>
@@ -5188,7 +5593,7 @@
             </w:pPr>
             <w:r>
               <w:rPr>
-                <w:rFonts w:asciiTheme="minorHAnsi" w:eastAsia="helvetica 45" w:hAnsiTheme="minorHAnsi" w:cstheme="minorHAnsi"/>
+                <w:rFonts w:asciiTheme="minorHAnsi" w:eastAsia="Helvetica 45" w:hAnsiTheme="minorHAnsi" w:cstheme="minorHAnsi"/>
                 <w:i/>
                 <w:sz w:val="20"/>
                 <w:szCs w:val="20"/>
@@ -5205,14 +5610,14 @@
             <w:pPr>
               <w:cnfStyle w:val="000000100000" w:firstRow="0" w:lastRow="0" w:firstColumn="0" w:lastColumn="0" w:oddVBand="0" w:evenVBand="0" w:oddHBand="1" w:evenHBand="0" w:firstRowFirstColumn="0" w:firstRowLastColumn="0" w:lastRowFirstColumn="0" w:lastRowLastColumn="0"/>
               <w:rPr>
-                <w:rFonts w:asciiTheme="minorHAnsi" w:eastAsia="helvetica 45" w:hAnsiTheme="minorHAnsi" w:cstheme="minorHAnsi"/>
-                <w:sz w:val="20"/>
-                <w:szCs w:val="20"/>
-              </w:rPr>
-            </w:pPr>
-            <w:r>
-              <w:rPr>
-                <w:rFonts w:asciiTheme="minorHAnsi" w:eastAsia="helvetica 45" w:hAnsiTheme="minorHAnsi" w:cstheme="minorHAnsi"/>
+                <w:rFonts w:asciiTheme="minorHAnsi" w:eastAsia="Helvetica 45" w:hAnsiTheme="minorHAnsi" w:cstheme="minorHAnsi"/>
+                <w:sz w:val="20"/>
+                <w:szCs w:val="20"/>
+              </w:rPr>
+            </w:pPr>
+            <w:r>
+              <w:rPr>
+                <w:rFonts w:asciiTheme="minorHAnsi" w:eastAsia="Helvetica 45" w:hAnsiTheme="minorHAnsi" w:cstheme="minorHAnsi"/>
                 <w:sz w:val="20"/>
                 <w:szCs w:val="20"/>
               </w:rPr>
@@ -5223,14 +5628,14 @@
             <w:pPr>
               <w:cnfStyle w:val="000000100000" w:firstRow="0" w:lastRow="0" w:firstColumn="0" w:lastColumn="0" w:oddVBand="0" w:evenVBand="0" w:oddHBand="1" w:evenHBand="0" w:firstRowFirstColumn="0" w:firstRowLastColumn="0" w:lastRowFirstColumn="0" w:lastRowLastColumn="0"/>
               <w:rPr>
-                <w:rFonts w:asciiTheme="minorHAnsi" w:eastAsia="helvetica 45" w:hAnsiTheme="minorHAnsi" w:cstheme="minorHAnsi"/>
-                <w:sz w:val="20"/>
-                <w:szCs w:val="20"/>
-              </w:rPr>
-            </w:pPr>
-            <w:r>
-              <w:rPr>
-                <w:rFonts w:asciiTheme="minorHAnsi" w:eastAsia="helvetica 45" w:hAnsiTheme="minorHAnsi" w:cstheme="minorHAnsi"/>
+                <w:rFonts w:asciiTheme="minorHAnsi" w:eastAsia="Helvetica 45" w:hAnsiTheme="minorHAnsi" w:cstheme="minorHAnsi"/>
+                <w:sz w:val="20"/>
+                <w:szCs w:val="20"/>
+              </w:rPr>
+            </w:pPr>
+            <w:r>
+              <w:rPr>
+                <w:rFonts w:asciiTheme="minorHAnsi" w:eastAsia="Helvetica 45" w:hAnsiTheme="minorHAnsi" w:cstheme="minorHAnsi"/>
                 <w:sz w:val="20"/>
                 <w:szCs w:val="20"/>
               </w:rPr>
@@ -5272,14 +5677,14 @@
             <w:pPr>
               <w:cnfStyle w:val="000000000000" w:firstRow="0" w:lastRow="0" w:firstColumn="0" w:lastColumn="0" w:oddVBand="0" w:evenVBand="0" w:oddHBand="0" w:evenHBand="0" w:firstRowFirstColumn="0" w:firstRowLastColumn="0" w:lastRowFirstColumn="0" w:lastRowLastColumn="0"/>
               <w:rPr>
-                <w:rFonts w:asciiTheme="minorHAnsi" w:eastAsia="helvetica 45" w:hAnsiTheme="minorHAnsi" w:cstheme="minorHAnsi"/>
-                <w:sz w:val="20"/>
-                <w:szCs w:val="20"/>
-              </w:rPr>
-            </w:pPr>
-            <w:r>
-              <w:rPr>
-                <w:rFonts w:asciiTheme="minorHAnsi" w:eastAsia="helvetica 45" w:hAnsiTheme="minorHAnsi" w:cstheme="minorHAnsi"/>
+                <w:rFonts w:asciiTheme="minorHAnsi" w:eastAsia="Helvetica 45" w:hAnsiTheme="minorHAnsi" w:cstheme="minorHAnsi"/>
+                <w:sz w:val="20"/>
+                <w:szCs w:val="20"/>
+              </w:rPr>
+            </w:pPr>
+            <w:r>
+              <w:rPr>
+                <w:rFonts w:asciiTheme="minorHAnsi" w:eastAsia="Helvetica 45" w:hAnsiTheme="minorHAnsi" w:cstheme="minorHAnsi"/>
                 <w:i/>
                 <w:sz w:val="20"/>
                 <w:szCs w:val="20"/>
@@ -5303,7 +5708,7 @@
             </w:pPr>
             <w:r>
               <w:rPr>
-                <w:rFonts w:asciiTheme="minorHAnsi" w:eastAsia="helvetica 45" w:hAnsiTheme="minorHAnsi" w:cstheme="minorHAnsi"/>
+                <w:rFonts w:asciiTheme="minorHAnsi" w:eastAsia="Helvetica 45" w:hAnsiTheme="minorHAnsi" w:cstheme="minorHAnsi"/>
                 <w:sz w:val="20"/>
                 <w:szCs w:val="20"/>
               </w:rPr>
@@ -5355,7 +5760,7 @@
             </w:pPr>
             <w:r>
               <w:rPr>
-                <w:rFonts w:asciiTheme="minorHAnsi" w:eastAsia="helvetica 45" w:hAnsiTheme="minorHAnsi" w:cstheme="minorHAnsi"/>
+                <w:rFonts w:asciiTheme="minorHAnsi" w:eastAsia="Helvetica 45" w:hAnsiTheme="minorHAnsi" w:cstheme="minorHAnsi"/>
                 <w:i/>
                 <w:sz w:val="20"/>
                 <w:szCs w:val="20"/>
@@ -5372,14 +5777,14 @@
             <w:pPr>
               <w:cnfStyle w:val="000000100000" w:firstRow="0" w:lastRow="0" w:firstColumn="0" w:lastColumn="0" w:oddVBand="0" w:evenVBand="0" w:oddHBand="1" w:evenHBand="0" w:firstRowFirstColumn="0" w:firstRowLastColumn="0" w:lastRowFirstColumn="0" w:lastRowLastColumn="0"/>
               <w:rPr>
-                <w:rFonts w:asciiTheme="minorHAnsi" w:eastAsia="helvetica 45" w:hAnsiTheme="minorHAnsi" w:cstheme="minorHAnsi"/>
-                <w:sz w:val="20"/>
-                <w:szCs w:val="20"/>
-              </w:rPr>
-            </w:pPr>
-            <w:r>
-              <w:rPr>
-                <w:rFonts w:asciiTheme="minorHAnsi" w:eastAsia="helvetica 45" w:hAnsiTheme="minorHAnsi" w:cstheme="minorHAnsi"/>
+                <w:rFonts w:asciiTheme="minorHAnsi" w:eastAsia="Helvetica 45" w:hAnsiTheme="minorHAnsi" w:cstheme="minorHAnsi"/>
+                <w:sz w:val="20"/>
+                <w:szCs w:val="20"/>
+              </w:rPr>
+            </w:pPr>
+            <w:r>
+              <w:rPr>
+                <w:rFonts w:asciiTheme="minorHAnsi" w:eastAsia="Helvetica 45" w:hAnsiTheme="minorHAnsi" w:cstheme="minorHAnsi"/>
                 <w:sz w:val="20"/>
                 <w:szCs w:val="20"/>
               </w:rPr>
@@ -5390,7 +5795,7 @@
             <w:pPr>
               <w:cnfStyle w:val="000000100000" w:firstRow="0" w:lastRow="0" w:firstColumn="0" w:lastColumn="0" w:oddVBand="0" w:evenVBand="0" w:oddHBand="1" w:evenHBand="0" w:firstRowFirstColumn="0" w:firstRowLastColumn="0" w:lastRowFirstColumn="0" w:lastRowLastColumn="0"/>
               <w:rPr>
-                <w:rFonts w:asciiTheme="minorHAnsi" w:eastAsia="helvetica 45" w:hAnsiTheme="minorHAnsi" w:cstheme="minorHAnsi"/>
+                <w:rFonts w:asciiTheme="minorHAnsi" w:eastAsia="Helvetica 45" w:hAnsiTheme="minorHAnsi" w:cstheme="minorHAnsi"/>
                 <w:sz w:val="20"/>
                 <w:szCs w:val="20"/>
               </w:rPr>
@@ -5400,14 +5805,14 @@
             <w:pPr>
               <w:cnfStyle w:val="000000100000" w:firstRow="0" w:lastRow="0" w:firstColumn="0" w:lastColumn="0" w:oddVBand="0" w:evenVBand="0" w:oddHBand="1" w:evenHBand="0" w:firstRowFirstColumn="0" w:firstRowLastColumn="0" w:lastRowFirstColumn="0" w:lastRowLastColumn="0"/>
               <w:rPr>
-                <w:rFonts w:asciiTheme="minorHAnsi" w:eastAsia="helvetica 45" w:hAnsiTheme="minorHAnsi" w:cstheme="minorHAnsi"/>
-                <w:sz w:val="20"/>
-                <w:szCs w:val="20"/>
-              </w:rPr>
-            </w:pPr>
-            <w:r>
-              <w:rPr>
-                <w:rFonts w:asciiTheme="minorHAnsi" w:eastAsia="helvetica 45" w:hAnsiTheme="minorHAnsi" w:cstheme="minorHAnsi"/>
+                <w:rFonts w:asciiTheme="minorHAnsi" w:eastAsia="Helvetica 45" w:hAnsiTheme="minorHAnsi" w:cstheme="minorHAnsi"/>
+                <w:sz w:val="20"/>
+                <w:szCs w:val="20"/>
+              </w:rPr>
+            </w:pPr>
+            <w:r>
+              <w:rPr>
+                <w:rFonts w:asciiTheme="minorHAnsi" w:eastAsia="Helvetica 45" w:hAnsiTheme="minorHAnsi" w:cstheme="minorHAnsi"/>
                 <w:sz w:val="20"/>
                 <w:szCs w:val="20"/>
               </w:rPr>
@@ -5457,7 +5862,7 @@
             </w:pPr>
             <w:r>
               <w:rPr>
-                <w:rFonts w:asciiTheme="minorHAnsi" w:eastAsia="helvetica 45" w:hAnsiTheme="minorHAnsi" w:cstheme="minorHAnsi"/>
+                <w:rFonts w:asciiTheme="minorHAnsi" w:eastAsia="Helvetica 45" w:hAnsiTheme="minorHAnsi" w:cstheme="minorHAnsi"/>
                 <w:i/>
                 <w:sz w:val="20"/>
                 <w:szCs w:val="20"/>
@@ -5501,7 +5906,7 @@
             <w:pPr>
               <w:cnfStyle w:val="000000000000" w:firstRow="0" w:lastRow="0" w:firstColumn="0" w:lastColumn="0" w:oddVBand="0" w:evenVBand="0" w:oddHBand="0" w:evenHBand="0" w:firstRowFirstColumn="0" w:firstRowLastColumn="0" w:lastRowFirstColumn="0" w:lastRowLastColumn="0"/>
               <w:rPr>
-                <w:rFonts w:asciiTheme="minorHAnsi" w:eastAsia="helvetica 45" w:hAnsiTheme="minorHAnsi" w:cstheme="minorHAnsi"/>
+                <w:rFonts w:asciiTheme="minorHAnsi" w:eastAsia="Helvetica 45" w:hAnsiTheme="minorHAnsi" w:cstheme="minorHAnsi"/>
                 <w:sz w:val="20"/>
                 <w:szCs w:val="20"/>
               </w:rPr>
@@ -5511,14 +5916,14 @@
             <w:pPr>
               <w:cnfStyle w:val="000000000000" w:firstRow="0" w:lastRow="0" w:firstColumn="0" w:lastColumn="0" w:oddVBand="0" w:evenVBand="0" w:oddHBand="0" w:evenHBand="0" w:firstRowFirstColumn="0" w:firstRowLastColumn="0" w:lastRowFirstColumn="0" w:lastRowLastColumn="0"/>
               <w:rPr>
-                <w:rFonts w:asciiTheme="minorHAnsi" w:eastAsia="helvetica 45" w:hAnsiTheme="minorHAnsi" w:cstheme="minorHAnsi"/>
-                <w:sz w:val="20"/>
-                <w:szCs w:val="20"/>
-              </w:rPr>
-            </w:pPr>
-            <w:r>
-              <w:rPr>
-                <w:rFonts w:asciiTheme="minorHAnsi" w:eastAsia="helvetica 45" w:hAnsiTheme="minorHAnsi" w:cstheme="minorHAnsi"/>
+                <w:rFonts w:asciiTheme="minorHAnsi" w:eastAsia="Helvetica 45" w:hAnsiTheme="minorHAnsi" w:cstheme="minorHAnsi"/>
+                <w:sz w:val="20"/>
+                <w:szCs w:val="20"/>
+              </w:rPr>
+            </w:pPr>
+            <w:r>
+              <w:rPr>
+                <w:rFonts w:asciiTheme="minorHAnsi" w:eastAsia="Helvetica 45" w:hAnsiTheme="minorHAnsi" w:cstheme="minorHAnsi"/>
                 <w:sz w:val="20"/>
                 <w:szCs w:val="20"/>
               </w:rPr>
@@ -5571,7 +5976,7 @@
             </w:pPr>
             <w:r>
               <w:rPr>
-                <w:rFonts w:asciiTheme="minorHAnsi" w:eastAsia="helvetica 45" w:hAnsiTheme="minorHAnsi" w:cstheme="minorHAnsi"/>
+                <w:rFonts w:asciiTheme="minorHAnsi" w:eastAsia="Helvetica 45" w:hAnsiTheme="minorHAnsi" w:cstheme="minorHAnsi"/>
                 <w:i/>
                 <w:sz w:val="20"/>
                 <w:szCs w:val="20"/>
@@ -5595,7 +6000,7 @@
             </w:pPr>
             <w:r>
               <w:rPr>
-                <w:rFonts w:asciiTheme="minorHAnsi" w:eastAsia="helvetica 45" w:hAnsiTheme="minorHAnsi" w:cstheme="minorHAnsi"/>
+                <w:rFonts w:asciiTheme="minorHAnsi" w:eastAsia="Helvetica 45" w:hAnsiTheme="minorHAnsi" w:cstheme="minorHAnsi"/>
                 <w:sz w:val="20"/>
                 <w:szCs w:val="20"/>
               </w:rPr>
@@ -5646,7 +6051,7 @@
             </w:pPr>
             <w:r>
               <w:rPr>
-                <w:rFonts w:asciiTheme="minorHAnsi" w:eastAsia="helvetica 45" w:hAnsiTheme="minorHAnsi" w:cstheme="minorHAnsi"/>
+                <w:rFonts w:asciiTheme="minorHAnsi" w:eastAsia="Helvetica 45" w:hAnsiTheme="minorHAnsi" w:cstheme="minorHAnsi"/>
                 <w:i/>
                 <w:sz w:val="20"/>
                 <w:szCs w:val="20"/>
@@ -5663,14 +6068,14 @@
             <w:pPr>
               <w:cnfStyle w:val="000000000000" w:firstRow="0" w:lastRow="0" w:firstColumn="0" w:lastColumn="0" w:oddVBand="0" w:evenVBand="0" w:oddHBand="0" w:evenHBand="0" w:firstRowFirstColumn="0" w:firstRowLastColumn="0" w:lastRowFirstColumn="0" w:lastRowLastColumn="0"/>
               <w:rPr>
-                <w:rFonts w:asciiTheme="minorHAnsi" w:eastAsia="helvetica 45" w:hAnsiTheme="minorHAnsi" w:cstheme="minorHAnsi"/>
-                <w:sz w:val="20"/>
-                <w:szCs w:val="20"/>
-              </w:rPr>
-            </w:pPr>
-            <w:r>
-              <w:rPr>
-                <w:rFonts w:asciiTheme="minorHAnsi" w:eastAsia="helvetica 45" w:hAnsiTheme="minorHAnsi" w:cstheme="minorHAnsi"/>
+                <w:rFonts w:asciiTheme="minorHAnsi" w:eastAsia="Helvetica 45" w:hAnsiTheme="minorHAnsi" w:cstheme="minorHAnsi"/>
+                <w:sz w:val="20"/>
+                <w:szCs w:val="20"/>
+              </w:rPr>
+            </w:pPr>
+            <w:r>
+              <w:rPr>
+                <w:rFonts w:asciiTheme="minorHAnsi" w:eastAsia="Helvetica 45" w:hAnsiTheme="minorHAnsi" w:cstheme="minorHAnsi"/>
                 <w:sz w:val="20"/>
                 <w:szCs w:val="20"/>
               </w:rPr>
@@ -5722,7 +6127,7 @@
             </w:pPr>
             <w:r>
               <w:rPr>
-                <w:rFonts w:asciiTheme="minorHAnsi" w:eastAsia="helvetica 45" w:hAnsiTheme="minorHAnsi" w:cstheme="minorHAnsi"/>
+                <w:rFonts w:asciiTheme="minorHAnsi" w:eastAsia="Helvetica 45" w:hAnsiTheme="minorHAnsi" w:cstheme="minorHAnsi"/>
                 <w:i/>
                 <w:sz w:val="20"/>
                 <w:szCs w:val="20"/>
@@ -5739,14 +6144,14 @@
             <w:pPr>
               <w:cnfStyle w:val="000000100000" w:firstRow="0" w:lastRow="0" w:firstColumn="0" w:lastColumn="0" w:oddVBand="0" w:evenVBand="0" w:oddHBand="1" w:evenHBand="0" w:firstRowFirstColumn="0" w:firstRowLastColumn="0" w:lastRowFirstColumn="0" w:lastRowLastColumn="0"/>
               <w:rPr>
-                <w:rFonts w:asciiTheme="minorHAnsi" w:eastAsia="helvetica 45" w:hAnsiTheme="minorHAnsi" w:cstheme="minorHAnsi"/>
-                <w:sz w:val="20"/>
-                <w:szCs w:val="20"/>
-              </w:rPr>
-            </w:pPr>
-            <w:r>
-              <w:rPr>
-                <w:rFonts w:asciiTheme="minorHAnsi" w:eastAsia="helvetica 45" w:hAnsiTheme="minorHAnsi" w:cstheme="minorHAnsi"/>
+                <w:rFonts w:asciiTheme="minorHAnsi" w:eastAsia="Helvetica 45" w:hAnsiTheme="minorHAnsi" w:cstheme="minorHAnsi"/>
+                <w:sz w:val="20"/>
+                <w:szCs w:val="20"/>
+              </w:rPr>
+            </w:pPr>
+            <w:r>
+              <w:rPr>
+                <w:rFonts w:asciiTheme="minorHAnsi" w:eastAsia="Helvetica 45" w:hAnsiTheme="minorHAnsi" w:cstheme="minorHAnsi"/>
                 <w:sz w:val="20"/>
                 <w:szCs w:val="20"/>
               </w:rPr>
@@ -5757,18 +6162,28 @@
             <w:pPr>
               <w:cnfStyle w:val="000000100000" w:firstRow="0" w:lastRow="0" w:firstColumn="0" w:lastColumn="0" w:oddVBand="0" w:evenVBand="0" w:oddHBand="1" w:evenHBand="0" w:firstRowFirstColumn="0" w:firstRowLastColumn="0" w:lastRowFirstColumn="0" w:lastRowLastColumn="0"/>
               <w:rPr>
-                <w:rFonts w:asciiTheme="minorHAnsi" w:eastAsia="helvetica 45" w:hAnsiTheme="minorHAnsi" w:cstheme="minorHAnsi"/>
-                <w:sz w:val="20"/>
-                <w:szCs w:val="20"/>
-              </w:rPr>
-            </w:pPr>
-            <w:r>
-              <w:rPr>
-                <w:rFonts w:asciiTheme="minorHAnsi" w:eastAsia="helvetica 45" w:hAnsiTheme="minorHAnsi" w:cstheme="minorHAnsi"/>
-                <w:sz w:val="20"/>
-                <w:szCs w:val="20"/>
-              </w:rPr>
-              <w:t>Das bestmögliche aufwerten eines Bildes (aufhübschen)</w:t>
+                <w:rFonts w:asciiTheme="minorHAnsi" w:eastAsia="Helvetica 45" w:hAnsiTheme="minorHAnsi" w:cstheme="minorHAnsi"/>
+                <w:sz w:val="20"/>
+                <w:szCs w:val="20"/>
+              </w:rPr>
+            </w:pPr>
+            <w:proofErr w:type="gramStart"/>
+            <w:r>
+              <w:rPr>
+                <w:rFonts w:asciiTheme="minorHAnsi" w:eastAsia="Helvetica 45" w:hAnsiTheme="minorHAnsi" w:cstheme="minorHAnsi"/>
+                <w:sz w:val="20"/>
+                <w:szCs w:val="20"/>
+              </w:rPr>
+              <w:t>Das bestmögliche aufwerten</w:t>
+            </w:r>
+            <w:proofErr w:type="gramEnd"/>
+            <w:r>
+              <w:rPr>
+                <w:rFonts w:asciiTheme="minorHAnsi" w:eastAsia="Helvetica 45" w:hAnsiTheme="minorHAnsi" w:cstheme="minorHAnsi"/>
+                <w:sz w:val="20"/>
+                <w:szCs w:val="20"/>
+              </w:rPr>
+              <w:t xml:space="preserve"> eines Bildes (aufhübschen)</w:t>
             </w:r>
           </w:p>
         </w:tc>
@@ -5854,14 +6269,14 @@
             <w:pPr>
               <w:cnfStyle w:val="100000000000" w:firstRow="1" w:lastRow="0" w:firstColumn="0" w:lastColumn="0" w:oddVBand="0" w:evenVBand="0" w:oddHBand="0" w:evenHBand="0" w:firstRowFirstColumn="0" w:firstRowLastColumn="0" w:lastRowFirstColumn="0" w:lastRowLastColumn="0"/>
               <w:rPr>
-                <w:rFonts w:asciiTheme="minorHAnsi" w:eastAsia="helvetica 45" w:hAnsiTheme="minorHAnsi" w:cstheme="minorHAnsi"/>
-                <w:sz w:val="20"/>
-                <w:szCs w:val="20"/>
-              </w:rPr>
-            </w:pPr>
-            <w:r>
-              <w:rPr>
-                <w:rFonts w:asciiTheme="minorHAnsi" w:eastAsia="helvetica 45" w:hAnsiTheme="minorHAnsi" w:cstheme="minorHAnsi"/>
+                <w:rFonts w:asciiTheme="minorHAnsi" w:eastAsia="Helvetica 45" w:hAnsiTheme="minorHAnsi" w:cstheme="minorHAnsi"/>
+                <w:sz w:val="20"/>
+                <w:szCs w:val="20"/>
+              </w:rPr>
+            </w:pPr>
+            <w:r>
+              <w:rPr>
+                <w:rFonts w:asciiTheme="minorHAnsi" w:eastAsia="Helvetica 45" w:hAnsiTheme="minorHAnsi" w:cstheme="minorHAnsi"/>
                 <w:sz w:val="20"/>
                 <w:szCs w:val="20"/>
               </w:rPr>
@@ -5872,14 +6287,14 @@
             <w:pPr>
               <w:cnfStyle w:val="100000000000" w:firstRow="1" w:lastRow="0" w:firstColumn="0" w:lastColumn="0" w:oddVBand="0" w:evenVBand="0" w:oddHBand="0" w:evenHBand="0" w:firstRowFirstColumn="0" w:firstRowLastColumn="0" w:lastRowFirstColumn="0" w:lastRowLastColumn="0"/>
               <w:rPr>
-                <w:rFonts w:asciiTheme="minorHAnsi" w:eastAsia="helvetica 45" w:hAnsiTheme="minorHAnsi" w:cstheme="minorHAnsi"/>
-                <w:sz w:val="20"/>
-                <w:szCs w:val="20"/>
-              </w:rPr>
-            </w:pPr>
-            <w:r>
-              <w:rPr>
-                <w:rFonts w:asciiTheme="minorHAnsi" w:eastAsia="helvetica 45" w:hAnsiTheme="minorHAnsi" w:cstheme="minorHAnsi"/>
+                <w:rFonts w:asciiTheme="minorHAnsi" w:eastAsia="Helvetica 45" w:hAnsiTheme="minorHAnsi" w:cstheme="minorHAnsi"/>
+                <w:sz w:val="20"/>
+                <w:szCs w:val="20"/>
+              </w:rPr>
+            </w:pPr>
+            <w:r>
+              <w:rPr>
+                <w:rFonts w:asciiTheme="minorHAnsi" w:eastAsia="Helvetica 45" w:hAnsiTheme="minorHAnsi" w:cstheme="minorHAnsi"/>
                 <w:b w:val="0"/>
                 <w:bCs w:val="0"/>
                 <w:sz w:val="20"/>
@@ -5926,14 +6341,14 @@
             <w:pPr>
               <w:cnfStyle w:val="000000100000" w:firstRow="0" w:lastRow="0" w:firstColumn="0" w:lastColumn="0" w:oddVBand="0" w:evenVBand="0" w:oddHBand="1" w:evenHBand="0" w:firstRowFirstColumn="0" w:firstRowLastColumn="0" w:lastRowFirstColumn="0" w:lastRowLastColumn="0"/>
               <w:rPr>
-                <w:rFonts w:asciiTheme="minorHAnsi" w:eastAsia="helvetica 45" w:hAnsiTheme="minorHAnsi" w:cstheme="minorHAnsi"/>
-                <w:sz w:val="20"/>
-                <w:szCs w:val="20"/>
-              </w:rPr>
-            </w:pPr>
-            <w:r>
-              <w:rPr>
-                <w:rFonts w:asciiTheme="minorHAnsi" w:eastAsia="helvetica 45" w:hAnsiTheme="minorHAnsi" w:cstheme="minorHAnsi"/>
+                <w:rFonts w:asciiTheme="minorHAnsi" w:eastAsia="Helvetica 45" w:hAnsiTheme="minorHAnsi" w:cstheme="minorHAnsi"/>
+                <w:sz w:val="20"/>
+                <w:szCs w:val="20"/>
+              </w:rPr>
+            </w:pPr>
+            <w:r>
+              <w:rPr>
+                <w:rFonts w:asciiTheme="minorHAnsi" w:eastAsia="Helvetica 45" w:hAnsiTheme="minorHAnsi" w:cstheme="minorHAnsi"/>
                 <w:i/>
                 <w:sz w:val="20"/>
                 <w:szCs w:val="20"/>
@@ -5945,14 +6360,14 @@
             <w:pPr>
               <w:cnfStyle w:val="000000100000" w:firstRow="0" w:lastRow="0" w:firstColumn="0" w:lastColumn="0" w:oddVBand="0" w:evenVBand="0" w:oddHBand="1" w:evenHBand="0" w:firstRowFirstColumn="0" w:firstRowLastColumn="0" w:lastRowFirstColumn="0" w:lastRowLastColumn="0"/>
               <w:rPr>
-                <w:rFonts w:asciiTheme="minorHAnsi" w:eastAsia="helvetica 45" w:hAnsiTheme="minorHAnsi" w:cstheme="minorHAnsi"/>
-                <w:sz w:val="20"/>
-                <w:szCs w:val="20"/>
-              </w:rPr>
-            </w:pPr>
-            <w:r>
-              <w:rPr>
-                <w:rFonts w:asciiTheme="minorHAnsi" w:eastAsia="helvetica 45" w:hAnsiTheme="minorHAnsi" w:cstheme="minorHAnsi"/>
+                <w:rFonts w:asciiTheme="minorHAnsi" w:eastAsia="Helvetica 45" w:hAnsiTheme="minorHAnsi" w:cstheme="minorHAnsi"/>
+                <w:sz w:val="20"/>
+                <w:szCs w:val="20"/>
+              </w:rPr>
+            </w:pPr>
+            <w:r>
+              <w:rPr>
+                <w:rFonts w:asciiTheme="minorHAnsi" w:eastAsia="Helvetica 45" w:hAnsiTheme="minorHAnsi" w:cstheme="minorHAnsi"/>
                 <w:i/>
                 <w:sz w:val="20"/>
                 <w:szCs w:val="20"/>
@@ -5971,7 +6386,7 @@
             </w:pPr>
             <w:r>
               <w:rPr>
-                <w:rFonts w:asciiTheme="minorHAnsi" w:eastAsia="helvetica 45" w:hAnsiTheme="minorHAnsi" w:cstheme="minorHAnsi"/>
+                <w:rFonts w:asciiTheme="minorHAnsi" w:eastAsia="Helvetica 45" w:hAnsiTheme="minorHAnsi" w:cstheme="minorHAnsi"/>
                 <w:i/>
                 <w:sz w:val="20"/>
                 <w:szCs w:val="20"/>
@@ -5988,14 +6403,14 @@
             <w:pPr>
               <w:cnfStyle w:val="000000100000" w:firstRow="0" w:lastRow="0" w:firstColumn="0" w:lastColumn="0" w:oddVBand="0" w:evenVBand="0" w:oddHBand="1" w:evenHBand="0" w:firstRowFirstColumn="0" w:firstRowLastColumn="0" w:lastRowFirstColumn="0" w:lastRowLastColumn="0"/>
               <w:rPr>
-                <w:rFonts w:asciiTheme="minorHAnsi" w:eastAsia="helvetica 45" w:hAnsiTheme="minorHAnsi" w:cstheme="minorHAnsi"/>
-                <w:sz w:val="20"/>
-                <w:szCs w:val="20"/>
-              </w:rPr>
-            </w:pPr>
-            <w:r>
-              <w:rPr>
-                <w:rFonts w:asciiTheme="minorHAnsi" w:eastAsia="helvetica 45" w:hAnsiTheme="minorHAnsi" w:cstheme="minorHAnsi"/>
+                <w:rFonts w:asciiTheme="minorHAnsi" w:eastAsia="Helvetica 45" w:hAnsiTheme="minorHAnsi" w:cstheme="minorHAnsi"/>
+                <w:sz w:val="20"/>
+                <w:szCs w:val="20"/>
+              </w:rPr>
+            </w:pPr>
+            <w:r>
+              <w:rPr>
+                <w:rFonts w:asciiTheme="minorHAnsi" w:eastAsia="Helvetica 45" w:hAnsiTheme="minorHAnsi" w:cstheme="minorHAnsi"/>
                 <w:sz w:val="20"/>
                 <w:szCs w:val="20"/>
               </w:rPr>
@@ -6021,7 +6436,7 @@
             </w:r>
             <w:r>
               <w:rPr>
-                <w:rFonts w:asciiTheme="minorHAnsi" w:eastAsia="helvetica 45" w:hAnsiTheme="minorHAnsi" w:cstheme="minorHAnsi"/>
+                <w:rFonts w:asciiTheme="minorHAnsi" w:eastAsia="Helvetica 45" w:hAnsiTheme="minorHAnsi" w:cstheme="minorHAnsi"/>
                 <w:sz w:val="20"/>
                 <w:szCs w:val="20"/>
               </w:rPr>
@@ -6063,14 +6478,14 @@
             <w:pPr>
               <w:cnfStyle w:val="000000000000" w:firstRow="0" w:lastRow="0" w:firstColumn="0" w:lastColumn="0" w:oddVBand="0" w:evenVBand="0" w:oddHBand="0" w:evenHBand="0" w:firstRowFirstColumn="0" w:firstRowLastColumn="0" w:lastRowFirstColumn="0" w:lastRowLastColumn="0"/>
               <w:rPr>
-                <w:rFonts w:asciiTheme="minorHAnsi" w:eastAsia="helvetica 45" w:hAnsiTheme="minorHAnsi" w:cstheme="minorHAnsi"/>
-                <w:sz w:val="20"/>
-                <w:szCs w:val="20"/>
-              </w:rPr>
-            </w:pPr>
-            <w:r>
-              <w:rPr>
-                <w:rFonts w:asciiTheme="minorHAnsi" w:eastAsia="helvetica 45" w:hAnsiTheme="minorHAnsi" w:cstheme="minorHAnsi"/>
+                <w:rFonts w:asciiTheme="minorHAnsi" w:eastAsia="Helvetica 45" w:hAnsiTheme="minorHAnsi" w:cstheme="minorHAnsi"/>
+                <w:sz w:val="20"/>
+                <w:szCs w:val="20"/>
+              </w:rPr>
+            </w:pPr>
+            <w:r>
+              <w:rPr>
+                <w:rFonts w:asciiTheme="minorHAnsi" w:eastAsia="Helvetica 45" w:hAnsiTheme="minorHAnsi" w:cstheme="minorHAnsi"/>
                 <w:i/>
                 <w:sz w:val="20"/>
                 <w:szCs w:val="20"/>
@@ -6087,14 +6502,14 @@
             <w:pPr>
               <w:cnfStyle w:val="000000000000" w:firstRow="0" w:lastRow="0" w:firstColumn="0" w:lastColumn="0" w:oddVBand="0" w:evenVBand="0" w:oddHBand="0" w:evenHBand="0" w:firstRowFirstColumn="0" w:firstRowLastColumn="0" w:lastRowFirstColumn="0" w:lastRowLastColumn="0"/>
               <w:rPr>
-                <w:rFonts w:asciiTheme="minorHAnsi" w:eastAsia="helvetica 45" w:hAnsiTheme="minorHAnsi" w:cstheme="minorHAnsi"/>
-                <w:sz w:val="20"/>
-                <w:szCs w:val="20"/>
-              </w:rPr>
-            </w:pPr>
-            <w:r>
-              <w:rPr>
-                <w:rFonts w:asciiTheme="minorHAnsi" w:eastAsia="helvetica 45" w:hAnsiTheme="minorHAnsi" w:cstheme="minorHAnsi"/>
+                <w:rFonts w:asciiTheme="minorHAnsi" w:eastAsia="Helvetica 45" w:hAnsiTheme="minorHAnsi" w:cstheme="minorHAnsi"/>
+                <w:sz w:val="20"/>
+                <w:szCs w:val="20"/>
+              </w:rPr>
+            </w:pPr>
+            <w:r>
+              <w:rPr>
+                <w:rFonts w:asciiTheme="minorHAnsi" w:eastAsia="Helvetica 45" w:hAnsiTheme="minorHAnsi" w:cstheme="minorHAnsi"/>
                 <w:sz w:val="20"/>
                 <w:szCs w:val="20"/>
               </w:rPr>
@@ -6146,7 +6561,7 @@
             </w:pPr>
             <w:r>
               <w:rPr>
-                <w:rFonts w:asciiTheme="minorHAnsi" w:eastAsia="helvetica 45" w:hAnsiTheme="minorHAnsi" w:cstheme="minorHAnsi"/>
+                <w:rFonts w:asciiTheme="minorHAnsi" w:eastAsia="Helvetica 45" w:hAnsiTheme="minorHAnsi" w:cstheme="minorHAnsi"/>
                 <w:i/>
                 <w:sz w:val="20"/>
                 <w:szCs w:val="20"/>
@@ -6248,7 +6663,7 @@
             </w:pPr>
             <w:r>
               <w:rPr>
-                <w:rFonts w:asciiTheme="minorHAnsi" w:eastAsia="helvetica 45" w:hAnsiTheme="minorHAnsi" w:cstheme="minorHAnsi"/>
+                <w:rFonts w:asciiTheme="minorHAnsi" w:eastAsia="Helvetica 45" w:hAnsiTheme="minorHAnsi" w:cstheme="minorHAnsi"/>
                 <w:i/>
                 <w:sz w:val="20"/>
                 <w:szCs w:val="20"/>
@@ -6324,7 +6739,7 @@
             </w:pPr>
             <w:r>
               <w:rPr>
-                <w:rFonts w:asciiTheme="minorHAnsi" w:eastAsia="helvetica 45" w:hAnsiTheme="minorHAnsi" w:cstheme="minorHAnsi"/>
+                <w:rFonts w:asciiTheme="minorHAnsi" w:eastAsia="Helvetica 45" w:hAnsiTheme="minorHAnsi" w:cstheme="minorHAnsi"/>
                 <w:i/>
                 <w:sz w:val="20"/>
                 <w:szCs w:val="20"/>
@@ -6399,7 +6814,7 @@
             </w:pPr>
             <w:r>
               <w:rPr>
-                <w:rFonts w:asciiTheme="minorHAnsi" w:eastAsia="helvetica 45" w:hAnsiTheme="minorHAnsi" w:cstheme="minorHAnsi"/>
+                <w:rFonts w:asciiTheme="minorHAnsi" w:eastAsia="Helvetica 45" w:hAnsiTheme="minorHAnsi" w:cstheme="minorHAnsi"/>
                 <w:i/>
                 <w:sz w:val="20"/>
                 <w:szCs w:val="20"/>
@@ -6475,7 +6890,7 @@
             </w:pPr>
             <w:r>
               <w:rPr>
-                <w:rFonts w:asciiTheme="minorHAnsi" w:eastAsia="helvetica 45" w:hAnsiTheme="minorHAnsi" w:cstheme="minorHAnsi"/>
+                <w:rFonts w:asciiTheme="minorHAnsi" w:eastAsia="Helvetica 45" w:hAnsiTheme="minorHAnsi" w:cstheme="minorHAnsi"/>
                 <w:i/>
                 <w:sz w:val="20"/>
                 <w:szCs w:val="20"/>
@@ -6492,14 +6907,14 @@
             <w:pPr>
               <w:cnfStyle w:val="000000100000" w:firstRow="0" w:lastRow="0" w:firstColumn="0" w:lastColumn="0" w:oddVBand="0" w:evenVBand="0" w:oddHBand="1" w:evenHBand="0" w:firstRowFirstColumn="0" w:firstRowLastColumn="0" w:lastRowFirstColumn="0" w:lastRowLastColumn="0"/>
               <w:rPr>
-                <w:rFonts w:asciiTheme="minorHAnsi" w:eastAsia="helvetica 45" w:hAnsiTheme="minorHAnsi" w:cstheme="minorHAnsi"/>
-                <w:sz w:val="20"/>
-                <w:szCs w:val="20"/>
-              </w:rPr>
-            </w:pPr>
-            <w:r>
-              <w:rPr>
-                <w:rFonts w:asciiTheme="minorHAnsi" w:eastAsia="helvetica 45" w:hAnsiTheme="minorHAnsi" w:cstheme="minorHAnsi"/>
+                <w:rFonts w:asciiTheme="minorHAnsi" w:eastAsia="Helvetica 45" w:hAnsiTheme="minorHAnsi" w:cstheme="minorHAnsi"/>
+                <w:sz w:val="20"/>
+                <w:szCs w:val="20"/>
+              </w:rPr>
+            </w:pPr>
+            <w:r>
+              <w:rPr>
+                <w:rFonts w:asciiTheme="minorHAnsi" w:eastAsia="Helvetica 45" w:hAnsiTheme="minorHAnsi" w:cstheme="minorHAnsi"/>
                 <w:sz w:val="20"/>
                 <w:szCs w:val="20"/>
               </w:rPr>
@@ -6603,14 +7018,14 @@
             <w:pPr>
               <w:cnfStyle w:val="100000000000" w:firstRow="1" w:lastRow="0" w:firstColumn="0" w:lastColumn="0" w:oddVBand="0" w:evenVBand="0" w:oddHBand="0" w:evenHBand="0" w:firstRowFirstColumn="0" w:firstRowLastColumn="0" w:lastRowFirstColumn="0" w:lastRowLastColumn="0"/>
               <w:rPr>
-                <w:rFonts w:asciiTheme="minorHAnsi" w:eastAsia="helvetica 45" w:hAnsiTheme="minorHAnsi" w:cstheme="minorHAnsi"/>
-                <w:sz w:val="20"/>
-                <w:szCs w:val="20"/>
-              </w:rPr>
-            </w:pPr>
-            <w:r>
-              <w:rPr>
-                <w:rFonts w:asciiTheme="minorHAnsi" w:eastAsia="helvetica 45" w:hAnsiTheme="minorHAnsi" w:cstheme="minorHAnsi"/>
+                <w:rFonts w:asciiTheme="minorHAnsi" w:eastAsia="Helvetica 45" w:hAnsiTheme="minorHAnsi" w:cstheme="minorHAnsi"/>
+                <w:sz w:val="20"/>
+                <w:szCs w:val="20"/>
+              </w:rPr>
+            </w:pPr>
+            <w:r>
+              <w:rPr>
+                <w:rFonts w:asciiTheme="minorHAnsi" w:eastAsia="Helvetica 45" w:hAnsiTheme="minorHAnsi" w:cstheme="minorHAnsi"/>
                 <w:bCs w:val="0"/>
                 <w:sz w:val="20"/>
                 <w:szCs w:val="20"/>
@@ -6656,14 +7071,14 @@
             <w:pPr>
               <w:cnfStyle w:val="000000100000" w:firstRow="0" w:lastRow="0" w:firstColumn="0" w:lastColumn="0" w:oddVBand="0" w:evenVBand="0" w:oddHBand="1" w:evenHBand="0" w:firstRowFirstColumn="0" w:firstRowLastColumn="0" w:lastRowFirstColumn="0" w:lastRowLastColumn="0"/>
               <w:rPr>
-                <w:rFonts w:asciiTheme="minorHAnsi" w:eastAsia="helvetica 45" w:hAnsiTheme="minorHAnsi" w:cstheme="minorHAnsi"/>
-                <w:sz w:val="20"/>
-                <w:szCs w:val="20"/>
-              </w:rPr>
-            </w:pPr>
-            <w:r>
-              <w:rPr>
-                <w:rFonts w:asciiTheme="minorHAnsi" w:eastAsia="helvetica 45" w:hAnsiTheme="minorHAnsi" w:cstheme="minorHAnsi"/>
+                <w:rFonts w:asciiTheme="minorHAnsi" w:eastAsia="Helvetica 45" w:hAnsiTheme="minorHAnsi" w:cstheme="minorHAnsi"/>
+                <w:sz w:val="20"/>
+                <w:szCs w:val="20"/>
+              </w:rPr>
+            </w:pPr>
+            <w:r>
+              <w:rPr>
+                <w:rFonts w:asciiTheme="minorHAnsi" w:eastAsia="Helvetica 45" w:hAnsiTheme="minorHAnsi" w:cstheme="minorHAnsi"/>
                 <w:i/>
                 <w:sz w:val="20"/>
                 <w:szCs w:val="20"/>
@@ -6675,14 +7090,14 @@
             <w:pPr>
               <w:cnfStyle w:val="000000100000" w:firstRow="0" w:lastRow="0" w:firstColumn="0" w:lastColumn="0" w:oddVBand="0" w:evenVBand="0" w:oddHBand="1" w:evenHBand="0" w:firstRowFirstColumn="0" w:firstRowLastColumn="0" w:lastRowFirstColumn="0" w:lastRowLastColumn="0"/>
               <w:rPr>
-                <w:rFonts w:asciiTheme="minorHAnsi" w:eastAsia="helvetica 45" w:hAnsiTheme="minorHAnsi" w:cstheme="minorHAnsi"/>
-                <w:sz w:val="20"/>
-                <w:szCs w:val="20"/>
-              </w:rPr>
-            </w:pPr>
-            <w:r>
-              <w:rPr>
-                <w:rFonts w:asciiTheme="minorHAnsi" w:eastAsia="helvetica 45" w:hAnsiTheme="minorHAnsi" w:cstheme="minorHAnsi"/>
+                <w:rFonts w:asciiTheme="minorHAnsi" w:eastAsia="Helvetica 45" w:hAnsiTheme="minorHAnsi" w:cstheme="minorHAnsi"/>
+                <w:sz w:val="20"/>
+                <w:szCs w:val="20"/>
+              </w:rPr>
+            </w:pPr>
+            <w:r>
+              <w:rPr>
+                <w:rFonts w:asciiTheme="minorHAnsi" w:eastAsia="Helvetica 45" w:hAnsiTheme="minorHAnsi" w:cstheme="minorHAnsi"/>
                 <w:i/>
                 <w:sz w:val="20"/>
                 <w:szCs w:val="20"/>
@@ -6701,7 +7116,7 @@
             </w:pPr>
             <w:r>
               <w:rPr>
-                <w:rFonts w:asciiTheme="minorHAnsi" w:eastAsia="helvetica 45" w:hAnsiTheme="minorHAnsi" w:cstheme="minorHAnsi"/>
+                <w:rFonts w:asciiTheme="minorHAnsi" w:eastAsia="Helvetica 45" w:hAnsiTheme="minorHAnsi" w:cstheme="minorHAnsi"/>
                 <w:i/>
                 <w:sz w:val="20"/>
                 <w:szCs w:val="20"/>
@@ -6725,7 +7140,7 @@
             </w:pPr>
             <w:r>
               <w:rPr>
-                <w:rFonts w:asciiTheme="minorHAnsi" w:eastAsia="helvetica 45" w:hAnsiTheme="minorHAnsi" w:cstheme="minorHAnsi"/>
+                <w:rFonts w:asciiTheme="minorHAnsi" w:eastAsia="Helvetica 45" w:hAnsiTheme="minorHAnsi" w:cstheme="minorHAnsi"/>
                 <w:sz w:val="20"/>
                 <w:szCs w:val="20"/>
               </w:rPr>
@@ -6767,14 +7182,14 @@
             <w:pPr>
               <w:cnfStyle w:val="000000000000" w:firstRow="0" w:lastRow="0" w:firstColumn="0" w:lastColumn="0" w:oddVBand="0" w:evenVBand="0" w:oddHBand="0" w:evenHBand="0" w:firstRowFirstColumn="0" w:firstRowLastColumn="0" w:lastRowFirstColumn="0" w:lastRowLastColumn="0"/>
               <w:rPr>
-                <w:rFonts w:asciiTheme="minorHAnsi" w:eastAsia="helvetica 45" w:hAnsiTheme="minorHAnsi" w:cstheme="minorHAnsi"/>
-                <w:sz w:val="20"/>
-                <w:szCs w:val="20"/>
-              </w:rPr>
-            </w:pPr>
-            <w:r>
-              <w:rPr>
-                <w:rFonts w:asciiTheme="minorHAnsi" w:eastAsia="helvetica 45" w:hAnsiTheme="minorHAnsi" w:cstheme="minorHAnsi"/>
+                <w:rFonts w:asciiTheme="minorHAnsi" w:eastAsia="Helvetica 45" w:hAnsiTheme="minorHAnsi" w:cstheme="minorHAnsi"/>
+                <w:sz w:val="20"/>
+                <w:szCs w:val="20"/>
+              </w:rPr>
+            </w:pPr>
+            <w:r>
+              <w:rPr>
+                <w:rFonts w:asciiTheme="minorHAnsi" w:eastAsia="Helvetica 45" w:hAnsiTheme="minorHAnsi" w:cstheme="minorHAnsi"/>
                 <w:i/>
                 <w:sz w:val="20"/>
                 <w:szCs w:val="20"/>
@@ -6850,7 +7265,7 @@
             </w:pPr>
             <w:r>
               <w:rPr>
-                <w:rFonts w:asciiTheme="minorHAnsi" w:eastAsia="helvetica 45" w:hAnsiTheme="minorHAnsi" w:cstheme="minorHAnsi"/>
+                <w:rFonts w:asciiTheme="minorHAnsi" w:eastAsia="Helvetica 45" w:hAnsiTheme="minorHAnsi" w:cstheme="minorHAnsi"/>
                 <w:i/>
                 <w:sz w:val="20"/>
                 <w:szCs w:val="20"/>
@@ -6940,7 +7355,7 @@
             </w:pPr>
             <w:r>
               <w:rPr>
-                <w:rFonts w:asciiTheme="minorHAnsi" w:eastAsia="helvetica 45" w:hAnsiTheme="minorHAnsi" w:cstheme="minorHAnsi"/>
+                <w:rFonts w:asciiTheme="minorHAnsi" w:eastAsia="Helvetica 45" w:hAnsiTheme="minorHAnsi" w:cstheme="minorHAnsi"/>
                 <w:i/>
                 <w:sz w:val="20"/>
                 <w:szCs w:val="20"/>
@@ -7016,7 +7431,7 @@
             </w:pPr>
             <w:r>
               <w:rPr>
-                <w:rFonts w:asciiTheme="minorHAnsi" w:eastAsia="helvetica 45" w:hAnsiTheme="minorHAnsi" w:cstheme="minorHAnsi"/>
+                <w:rFonts w:asciiTheme="minorHAnsi" w:eastAsia="Helvetica 45" w:hAnsiTheme="minorHAnsi" w:cstheme="minorHAnsi"/>
                 <w:i/>
                 <w:sz w:val="20"/>
                 <w:szCs w:val="20"/>
@@ -7091,7 +7506,7 @@
             </w:pPr>
             <w:r>
               <w:rPr>
-                <w:rFonts w:asciiTheme="minorHAnsi" w:eastAsia="helvetica 45" w:hAnsiTheme="minorHAnsi" w:cstheme="minorHAnsi"/>
+                <w:rFonts w:asciiTheme="minorHAnsi" w:eastAsia="Helvetica 45" w:hAnsiTheme="minorHAnsi" w:cstheme="minorHAnsi"/>
                 <w:i/>
                 <w:sz w:val="20"/>
                 <w:szCs w:val="20"/>
@@ -7167,7 +7582,7 @@
             </w:pPr>
             <w:r>
               <w:rPr>
-                <w:rFonts w:asciiTheme="minorHAnsi" w:eastAsia="helvetica 45" w:hAnsiTheme="minorHAnsi" w:cstheme="minorHAnsi"/>
+                <w:rFonts w:asciiTheme="minorHAnsi" w:eastAsia="Helvetica 45" w:hAnsiTheme="minorHAnsi" w:cstheme="minorHAnsi"/>
                 <w:i/>
                 <w:sz w:val="20"/>
                 <w:szCs w:val="20"/>
@@ -7281,14 +7696,14 @@
             <w:pPr>
               <w:cnfStyle w:val="100000000000" w:firstRow="1" w:lastRow="0" w:firstColumn="0" w:lastColumn="0" w:oddVBand="0" w:evenVBand="0" w:oddHBand="0" w:evenHBand="0" w:firstRowFirstColumn="0" w:firstRowLastColumn="0" w:lastRowFirstColumn="0" w:lastRowLastColumn="0"/>
               <w:rPr>
-                <w:rFonts w:asciiTheme="minorHAnsi" w:eastAsia="helvetica 45" w:hAnsiTheme="minorHAnsi" w:cstheme="minorHAnsi"/>
-                <w:sz w:val="20"/>
-                <w:szCs w:val="20"/>
-              </w:rPr>
-            </w:pPr>
-            <w:r>
-              <w:rPr>
-                <w:rFonts w:asciiTheme="minorHAnsi" w:eastAsia="helvetica 45" w:hAnsiTheme="minorHAnsi" w:cstheme="minorHAnsi"/>
+                <w:rFonts w:asciiTheme="minorHAnsi" w:eastAsia="Helvetica 45" w:hAnsiTheme="minorHAnsi" w:cstheme="minorHAnsi"/>
+                <w:sz w:val="20"/>
+                <w:szCs w:val="20"/>
+              </w:rPr>
+            </w:pPr>
+            <w:r>
+              <w:rPr>
+                <w:rFonts w:asciiTheme="minorHAnsi" w:eastAsia="Helvetica 45" w:hAnsiTheme="minorHAnsi" w:cstheme="minorHAnsi"/>
                 <w:sz w:val="20"/>
                 <w:szCs w:val="20"/>
               </w:rPr>
@@ -7333,14 +7748,14 @@
             <w:pPr>
               <w:cnfStyle w:val="000000100000" w:firstRow="0" w:lastRow="0" w:firstColumn="0" w:lastColumn="0" w:oddVBand="0" w:evenVBand="0" w:oddHBand="1" w:evenHBand="0" w:firstRowFirstColumn="0" w:firstRowLastColumn="0" w:lastRowFirstColumn="0" w:lastRowLastColumn="0"/>
               <w:rPr>
-                <w:rFonts w:asciiTheme="minorHAnsi" w:eastAsia="helvetica 45" w:hAnsiTheme="minorHAnsi" w:cstheme="minorHAnsi"/>
-                <w:sz w:val="20"/>
-                <w:szCs w:val="20"/>
-              </w:rPr>
-            </w:pPr>
-            <w:r>
-              <w:rPr>
-                <w:rFonts w:asciiTheme="minorHAnsi" w:eastAsia="helvetica 45" w:hAnsiTheme="minorHAnsi" w:cstheme="minorHAnsi"/>
+                <w:rFonts w:asciiTheme="minorHAnsi" w:eastAsia="Helvetica 45" w:hAnsiTheme="minorHAnsi" w:cstheme="minorHAnsi"/>
+                <w:sz w:val="20"/>
+                <w:szCs w:val="20"/>
+              </w:rPr>
+            </w:pPr>
+            <w:r>
+              <w:rPr>
+                <w:rFonts w:asciiTheme="minorHAnsi" w:eastAsia="Helvetica 45" w:hAnsiTheme="minorHAnsi" w:cstheme="minorHAnsi"/>
                 <w:i/>
                 <w:sz w:val="20"/>
                 <w:szCs w:val="20"/>
@@ -7352,14 +7767,14 @@
             <w:pPr>
               <w:cnfStyle w:val="000000100000" w:firstRow="0" w:lastRow="0" w:firstColumn="0" w:lastColumn="0" w:oddVBand="0" w:evenVBand="0" w:oddHBand="1" w:evenHBand="0" w:firstRowFirstColumn="0" w:firstRowLastColumn="0" w:lastRowFirstColumn="0" w:lastRowLastColumn="0"/>
               <w:rPr>
-                <w:rFonts w:asciiTheme="minorHAnsi" w:eastAsia="helvetica 45" w:hAnsiTheme="minorHAnsi" w:cstheme="minorHAnsi"/>
-                <w:sz w:val="20"/>
-                <w:szCs w:val="20"/>
-              </w:rPr>
-            </w:pPr>
-            <w:r>
-              <w:rPr>
-                <w:rFonts w:asciiTheme="minorHAnsi" w:eastAsia="helvetica 45" w:hAnsiTheme="minorHAnsi" w:cstheme="minorHAnsi"/>
+                <w:rFonts w:asciiTheme="minorHAnsi" w:eastAsia="Helvetica 45" w:hAnsiTheme="minorHAnsi" w:cstheme="minorHAnsi"/>
+                <w:sz w:val="20"/>
+                <w:szCs w:val="20"/>
+              </w:rPr>
+            </w:pPr>
+            <w:r>
+              <w:rPr>
+                <w:rFonts w:asciiTheme="minorHAnsi" w:eastAsia="Helvetica 45" w:hAnsiTheme="minorHAnsi" w:cstheme="minorHAnsi"/>
                 <w:i/>
                 <w:sz w:val="20"/>
                 <w:szCs w:val="20"/>
@@ -7378,7 +7793,7 @@
             </w:pPr>
             <w:r>
               <w:rPr>
-                <w:rFonts w:asciiTheme="minorHAnsi" w:eastAsia="helvetica 45" w:hAnsiTheme="minorHAnsi" w:cstheme="minorHAnsi"/>
+                <w:rFonts w:asciiTheme="minorHAnsi" w:eastAsia="Helvetica 45" w:hAnsiTheme="minorHAnsi" w:cstheme="minorHAnsi"/>
                 <w:i/>
                 <w:sz w:val="20"/>
                 <w:szCs w:val="20"/>
@@ -7402,7 +7817,7 @@
             </w:pPr>
             <w:r>
               <w:rPr>
-                <w:rFonts w:asciiTheme="minorHAnsi" w:eastAsia="helvetica 45" w:hAnsiTheme="minorHAnsi" w:cstheme="minorHAnsi"/>
+                <w:rFonts w:asciiTheme="minorHAnsi" w:eastAsia="Helvetica 45" w:hAnsiTheme="minorHAnsi" w:cstheme="minorHAnsi"/>
                 <w:sz w:val="20"/>
                 <w:szCs w:val="20"/>
               </w:rPr>
@@ -7444,14 +7859,14 @@
             <w:pPr>
               <w:cnfStyle w:val="000000000000" w:firstRow="0" w:lastRow="0" w:firstColumn="0" w:lastColumn="0" w:oddVBand="0" w:evenVBand="0" w:oddHBand="0" w:evenHBand="0" w:firstRowFirstColumn="0" w:firstRowLastColumn="0" w:lastRowFirstColumn="0" w:lastRowLastColumn="0"/>
               <w:rPr>
-                <w:rFonts w:asciiTheme="minorHAnsi" w:eastAsia="helvetica 45" w:hAnsiTheme="minorHAnsi" w:cstheme="minorHAnsi"/>
-                <w:sz w:val="20"/>
-                <w:szCs w:val="20"/>
-              </w:rPr>
-            </w:pPr>
-            <w:r>
-              <w:rPr>
-                <w:rFonts w:asciiTheme="minorHAnsi" w:eastAsia="helvetica 45" w:hAnsiTheme="minorHAnsi" w:cstheme="minorHAnsi"/>
+                <w:rFonts w:asciiTheme="minorHAnsi" w:eastAsia="Helvetica 45" w:hAnsiTheme="minorHAnsi" w:cstheme="minorHAnsi"/>
+                <w:sz w:val="20"/>
+                <w:szCs w:val="20"/>
+              </w:rPr>
+            </w:pPr>
+            <w:r>
+              <w:rPr>
+                <w:rFonts w:asciiTheme="minorHAnsi" w:eastAsia="Helvetica 45" w:hAnsiTheme="minorHAnsi" w:cstheme="minorHAnsi"/>
                 <w:i/>
                 <w:sz w:val="20"/>
                 <w:szCs w:val="20"/>
@@ -7527,7 +7942,7 @@
             </w:pPr>
             <w:r>
               <w:rPr>
-                <w:rFonts w:asciiTheme="minorHAnsi" w:eastAsia="helvetica 45" w:hAnsiTheme="minorHAnsi" w:cstheme="minorHAnsi"/>
+                <w:rFonts w:asciiTheme="minorHAnsi" w:eastAsia="Helvetica 45" w:hAnsiTheme="minorHAnsi" w:cstheme="minorHAnsi"/>
                 <w:i/>
                 <w:sz w:val="20"/>
                 <w:szCs w:val="20"/>
@@ -7551,7 +7966,7 @@
             </w:pPr>
             <w:r>
               <w:rPr>
-                <w:rFonts w:asciiTheme="minorHAnsi" w:eastAsia="helvetica 45" w:hAnsiTheme="minorHAnsi" w:cstheme="minorHAnsi"/>
+                <w:rFonts w:asciiTheme="minorHAnsi" w:eastAsia="Helvetica 45" w:hAnsiTheme="minorHAnsi" w:cstheme="minorHAnsi"/>
                 <w:sz w:val="20"/>
                 <w:szCs w:val="20"/>
               </w:rPr>
@@ -7609,7 +8024,7 @@
             </w:pPr>
             <w:r>
               <w:rPr>
-                <w:rFonts w:asciiTheme="minorHAnsi" w:eastAsia="helvetica 45" w:hAnsiTheme="minorHAnsi" w:cstheme="minorHAnsi"/>
+                <w:rFonts w:asciiTheme="minorHAnsi" w:eastAsia="Helvetica 45" w:hAnsiTheme="minorHAnsi" w:cstheme="minorHAnsi"/>
                 <w:i/>
                 <w:sz w:val="20"/>
                 <w:szCs w:val="20"/>
@@ -7685,7 +8100,7 @@
             </w:pPr>
             <w:r>
               <w:rPr>
-                <w:rFonts w:asciiTheme="minorHAnsi" w:eastAsia="helvetica 45" w:hAnsiTheme="minorHAnsi" w:cstheme="minorHAnsi"/>
+                <w:rFonts w:asciiTheme="minorHAnsi" w:eastAsia="Helvetica 45" w:hAnsiTheme="minorHAnsi" w:cstheme="minorHAnsi"/>
                 <w:i/>
                 <w:sz w:val="20"/>
                 <w:szCs w:val="20"/>
@@ -7709,7 +8124,7 @@
             </w:pPr>
             <w:r>
               <w:rPr>
-                <w:rFonts w:asciiTheme="minorHAnsi" w:eastAsia="helvetica 45" w:hAnsiTheme="minorHAnsi" w:cstheme="minorHAnsi"/>
+                <w:rFonts w:asciiTheme="minorHAnsi" w:eastAsia="Helvetica 45" w:hAnsiTheme="minorHAnsi" w:cstheme="minorHAnsi"/>
                 <w:sz w:val="20"/>
                 <w:szCs w:val="20"/>
               </w:rPr>
@@ -7760,7 +8175,7 @@
             </w:pPr>
             <w:r>
               <w:rPr>
-                <w:rFonts w:asciiTheme="minorHAnsi" w:eastAsia="helvetica 45" w:hAnsiTheme="minorHAnsi" w:cstheme="minorHAnsi"/>
+                <w:rFonts w:asciiTheme="minorHAnsi" w:eastAsia="Helvetica 45" w:hAnsiTheme="minorHAnsi" w:cstheme="minorHAnsi"/>
                 <w:i/>
                 <w:sz w:val="20"/>
                 <w:szCs w:val="20"/>
@@ -7784,7 +8199,7 @@
             </w:pPr>
             <w:r>
               <w:rPr>
-                <w:rFonts w:asciiTheme="minorHAnsi" w:eastAsia="helvetica 45" w:hAnsiTheme="minorHAnsi" w:cstheme="minorHAnsi"/>
+                <w:rFonts w:asciiTheme="minorHAnsi" w:eastAsia="Helvetica 45" w:hAnsiTheme="minorHAnsi" w:cstheme="minorHAnsi"/>
                 <w:sz w:val="20"/>
                 <w:szCs w:val="20"/>
               </w:rPr>
@@ -7836,7 +8251,7 @@
             </w:pPr>
             <w:r>
               <w:rPr>
-                <w:rFonts w:asciiTheme="minorHAnsi" w:eastAsia="helvetica 45" w:hAnsiTheme="minorHAnsi" w:cstheme="minorHAnsi"/>
+                <w:rFonts w:asciiTheme="minorHAnsi" w:eastAsia="Helvetica 45" w:hAnsiTheme="minorHAnsi" w:cstheme="minorHAnsi"/>
                 <w:i/>
                 <w:sz w:val="20"/>
                 <w:szCs w:val="20"/>
@@ -7860,11 +8275,29 @@
             </w:pPr>
             <w:r>
               <w:rPr>
-                <w:rFonts w:asciiTheme="minorHAnsi" w:eastAsia="helvetica 45" w:hAnsiTheme="minorHAnsi" w:cstheme="minorHAnsi"/>
-                <w:sz w:val="20"/>
-                <w:szCs w:val="20"/>
-              </w:rPr>
-              <w:t>Die Qualität eines Videospiels wird oft durch subjektive Meinungen gebildet wie bspw. dem erlebten Spaßfaktor, guter Spielfluss</w:t>
+                <w:rFonts w:asciiTheme="minorHAnsi" w:eastAsia="Helvetica 45" w:hAnsiTheme="minorHAnsi" w:cstheme="minorHAnsi"/>
+                <w:sz w:val="20"/>
+                <w:szCs w:val="20"/>
+              </w:rPr>
+              <w:t xml:space="preserve">Die Qualität eines Videospiels wird oft durch </w:t>
+            </w:r>
+            <w:proofErr w:type="gramStart"/>
+            <w:r>
+              <w:rPr>
+                <w:rFonts w:asciiTheme="minorHAnsi" w:eastAsia="Helvetica 45" w:hAnsiTheme="minorHAnsi" w:cstheme="minorHAnsi"/>
+                <w:sz w:val="20"/>
+                <w:szCs w:val="20"/>
+              </w:rPr>
+              <w:t>subjektive Meinungen</w:t>
+            </w:r>
+            <w:proofErr w:type="gramEnd"/>
+            <w:r>
+              <w:rPr>
+                <w:rFonts w:asciiTheme="minorHAnsi" w:eastAsia="Helvetica 45" w:hAnsiTheme="minorHAnsi" w:cstheme="minorHAnsi"/>
+                <w:sz w:val="20"/>
+                <w:szCs w:val="20"/>
+              </w:rPr>
+              <w:t xml:space="preserve"> gebildet wie bspw. dem erlebten Spaßfaktor, guter Spielfluss</w:t>
             </w:r>
           </w:p>
         </w:tc>
@@ -7985,7 +8418,29 @@
                 <w:sz w:val="20"/>
                 <w:szCs w:val="20"/>
               </w:rPr>
-              <w:t>(deepart.io / deepdreamgenerator)</w:t>
+              <w:t xml:space="preserve">(deepart.io / </w:t>
+            </w:r>
+            <w:proofErr w:type="spellStart"/>
+            <w:r>
+              <w:rPr>
+                <w:rFonts w:asciiTheme="minorHAnsi" w:hAnsiTheme="minorHAnsi" w:cstheme="minorHAnsi"/>
+                <w:b w:val="0"/>
+                <w:bCs w:val="0"/>
+                <w:sz w:val="20"/>
+                <w:szCs w:val="20"/>
+              </w:rPr>
+              <w:t>deepdreamgenerator</w:t>
+            </w:r>
+            <w:proofErr w:type="spellEnd"/>
+            <w:r>
+              <w:rPr>
+                <w:rFonts w:asciiTheme="minorHAnsi" w:hAnsiTheme="minorHAnsi" w:cstheme="minorHAnsi"/>
+                <w:b w:val="0"/>
+                <w:bCs w:val="0"/>
+                <w:sz w:val="20"/>
+                <w:szCs w:val="20"/>
+              </w:rPr>
+              <w:t>)</w:t>
             </w:r>
           </w:p>
           <w:p>
@@ -8036,14 +8491,14 @@
             <w:pPr>
               <w:cnfStyle w:val="000000100000" w:firstRow="0" w:lastRow="0" w:firstColumn="0" w:lastColumn="0" w:oddVBand="0" w:evenVBand="0" w:oddHBand="1" w:evenHBand="0" w:firstRowFirstColumn="0" w:firstRowLastColumn="0" w:lastRowFirstColumn="0" w:lastRowLastColumn="0"/>
               <w:rPr>
-                <w:rFonts w:asciiTheme="minorHAnsi" w:eastAsia="helvetica 45" w:hAnsiTheme="minorHAnsi" w:cstheme="minorHAnsi"/>
-                <w:sz w:val="20"/>
-                <w:szCs w:val="20"/>
-              </w:rPr>
-            </w:pPr>
-            <w:r>
-              <w:rPr>
-                <w:rFonts w:asciiTheme="minorHAnsi" w:eastAsia="helvetica 45" w:hAnsiTheme="minorHAnsi" w:cstheme="minorHAnsi"/>
+                <w:rFonts w:asciiTheme="minorHAnsi" w:eastAsia="Helvetica 45" w:hAnsiTheme="minorHAnsi" w:cstheme="minorHAnsi"/>
+                <w:sz w:val="20"/>
+                <w:szCs w:val="20"/>
+              </w:rPr>
+            </w:pPr>
+            <w:r>
+              <w:rPr>
+                <w:rFonts w:asciiTheme="minorHAnsi" w:eastAsia="Helvetica 45" w:hAnsiTheme="minorHAnsi" w:cstheme="minorHAnsi"/>
                 <w:i/>
                 <w:sz w:val="20"/>
                 <w:szCs w:val="20"/>
@@ -8055,7 +8510,7 @@
             <w:pPr>
               <w:cnfStyle w:val="000000100000" w:firstRow="0" w:lastRow="0" w:firstColumn="0" w:lastColumn="0" w:oddVBand="0" w:evenVBand="0" w:oddHBand="1" w:evenHBand="0" w:firstRowFirstColumn="0" w:firstRowLastColumn="0" w:lastRowFirstColumn="0" w:lastRowLastColumn="0"/>
               <w:rPr>
-                <w:rFonts w:asciiTheme="minorHAnsi" w:eastAsia="helvetica 45" w:hAnsiTheme="minorHAnsi" w:cstheme="minorHAnsi"/>
+                <w:rFonts w:asciiTheme="minorHAnsi" w:eastAsia="Helvetica 45" w:hAnsiTheme="minorHAnsi" w:cstheme="minorHAnsi"/>
                 <w:sz w:val="20"/>
                 <w:szCs w:val="20"/>
               </w:rPr>
@@ -8065,7 +8520,7 @@
             <w:pPr>
               <w:cnfStyle w:val="000000100000" w:firstRow="0" w:lastRow="0" w:firstColumn="0" w:lastColumn="0" w:oddVBand="0" w:evenVBand="0" w:oddHBand="1" w:evenHBand="0" w:firstRowFirstColumn="0" w:firstRowLastColumn="0" w:lastRowFirstColumn="0" w:lastRowLastColumn="0"/>
               <w:rPr>
-                <w:rFonts w:asciiTheme="minorHAnsi" w:eastAsia="helvetica 45" w:hAnsiTheme="minorHAnsi" w:cstheme="minorHAnsi"/>
+                <w:rFonts w:asciiTheme="minorHAnsi" w:eastAsia="Helvetica 45" w:hAnsiTheme="minorHAnsi" w:cstheme="minorHAnsi"/>
                 <w:i/>
                 <w:sz w:val="20"/>
                 <w:szCs w:val="20"/>
@@ -8073,7 +8528,7 @@
             </w:pPr>
             <w:r>
               <w:rPr>
-                <w:rFonts w:asciiTheme="minorHAnsi" w:eastAsia="helvetica 45" w:hAnsiTheme="minorHAnsi" w:cstheme="minorHAnsi"/>
+                <w:rFonts w:asciiTheme="minorHAnsi" w:eastAsia="Helvetica 45" w:hAnsiTheme="minorHAnsi" w:cstheme="minorHAnsi"/>
                 <w:i/>
                 <w:sz w:val="20"/>
                 <w:szCs w:val="20"/>
@@ -8112,7 +8567,7 @@
             </w:pPr>
             <w:r>
               <w:rPr>
-                <w:rFonts w:asciiTheme="minorHAnsi" w:eastAsia="helvetica 45" w:hAnsiTheme="minorHAnsi" w:cstheme="minorHAnsi"/>
+                <w:rFonts w:asciiTheme="minorHAnsi" w:eastAsia="Helvetica 45" w:hAnsiTheme="minorHAnsi" w:cstheme="minorHAnsi"/>
                 <w:i/>
                 <w:sz w:val="20"/>
                 <w:szCs w:val="20"/>
@@ -8140,7 +8595,25 @@
                 <w:sz w:val="20"/>
                 <w:szCs w:val="20"/>
               </w:rPr>
-              <w:t>Diese KI erstellen ein Bild, das ein Bild mit dem Zeichenstil eines anderen Bildes kombiniert. Die benötigten Bilder können entweder hochgeladen oder ausgesucht werden. Mithilfe der KI deepart.io oder deepdreamgenerator kann hierbei echte Kunst erstellt werden.</w:t>
+              <w:t xml:space="preserve">Diese KI erstellen ein Bild, das ein Bild mit dem Zeichenstil eines anderen Bildes kombiniert. Die benötigten Bilder können entweder hochgeladen oder ausgesucht werden. Mithilfe der KI deepart.io oder </w:t>
+            </w:r>
+            <w:proofErr w:type="spellStart"/>
+            <w:r>
+              <w:rPr>
+                <w:rFonts w:asciiTheme="minorHAnsi" w:hAnsiTheme="minorHAnsi" w:cstheme="minorHAnsi"/>
+                <w:sz w:val="20"/>
+                <w:szCs w:val="20"/>
+              </w:rPr>
+              <w:t>deepdreamgenerator</w:t>
+            </w:r>
+            <w:proofErr w:type="spellEnd"/>
+            <w:r>
+              <w:rPr>
+                <w:rFonts w:asciiTheme="minorHAnsi" w:hAnsiTheme="minorHAnsi" w:cstheme="minorHAnsi"/>
+                <w:sz w:val="20"/>
+                <w:szCs w:val="20"/>
+              </w:rPr>
+              <w:t xml:space="preserve"> kann hierbei echte Kunst erstellt werden.</w:t>
             </w:r>
           </w:p>
           <w:p>
@@ -8196,14 +8669,14 @@
             <w:pPr>
               <w:cnfStyle w:val="000000000000" w:firstRow="0" w:lastRow="0" w:firstColumn="0" w:lastColumn="0" w:oddVBand="0" w:evenVBand="0" w:oddHBand="0" w:evenHBand="0" w:firstRowFirstColumn="0" w:firstRowLastColumn="0" w:lastRowFirstColumn="0" w:lastRowLastColumn="0"/>
               <w:rPr>
-                <w:rFonts w:asciiTheme="minorHAnsi" w:eastAsia="helvetica 45" w:hAnsiTheme="minorHAnsi" w:cstheme="minorHAnsi"/>
-                <w:sz w:val="20"/>
-                <w:szCs w:val="20"/>
-              </w:rPr>
-            </w:pPr>
-            <w:r>
-              <w:rPr>
-                <w:rFonts w:asciiTheme="minorHAnsi" w:eastAsia="helvetica 45" w:hAnsiTheme="minorHAnsi" w:cstheme="minorHAnsi"/>
+                <w:rFonts w:asciiTheme="minorHAnsi" w:eastAsia="Helvetica 45" w:hAnsiTheme="minorHAnsi" w:cstheme="minorHAnsi"/>
+                <w:sz w:val="20"/>
+                <w:szCs w:val="20"/>
+              </w:rPr>
+            </w:pPr>
+            <w:r>
+              <w:rPr>
+                <w:rFonts w:asciiTheme="minorHAnsi" w:eastAsia="Helvetica 45" w:hAnsiTheme="minorHAnsi" w:cstheme="minorHAnsi"/>
                 <w:i/>
                 <w:sz w:val="20"/>
                 <w:szCs w:val="20"/>
@@ -8279,7 +8752,7 @@
             </w:pPr>
             <w:r>
               <w:rPr>
-                <w:rFonts w:asciiTheme="minorHAnsi" w:eastAsia="helvetica 45" w:hAnsiTheme="minorHAnsi" w:cstheme="minorHAnsi"/>
+                <w:rFonts w:asciiTheme="minorHAnsi" w:eastAsia="Helvetica 45" w:hAnsiTheme="minorHAnsi" w:cstheme="minorHAnsi"/>
                 <w:i/>
                 <w:sz w:val="20"/>
                 <w:szCs w:val="20"/>
@@ -8353,7 +8826,7 @@
             </w:pPr>
             <w:r>
               <w:rPr>
-                <w:rFonts w:asciiTheme="minorHAnsi" w:eastAsia="helvetica 45" w:hAnsiTheme="minorHAnsi" w:cstheme="minorHAnsi"/>
+                <w:rFonts w:asciiTheme="minorHAnsi" w:eastAsia="Helvetica 45" w:hAnsiTheme="minorHAnsi" w:cstheme="minorHAnsi"/>
                 <w:i/>
                 <w:sz w:val="20"/>
                 <w:szCs w:val="20"/>
@@ -8381,7 +8854,25 @@
                 <w:sz w:val="20"/>
                 <w:szCs w:val="20"/>
               </w:rPr>
-              <w:t>Die Bilddateien wurden typischerweise von Fotosensoren einer Kamera bspw. eines Smartphones aufgenommen. Denkbar sind auch Bilddateien, die digitalisiert wurden bspw. durch das Einscannen einer analogen Aufnahme.</w:t>
+              <w:t xml:space="preserve">Die Bilddateien wurden typischerweise von Fotosensoren einer Kamera bspw. eines Smartphones aufgenommen. Denkbar sind auch Bilddateien, die digitalisiert </w:t>
+            </w:r>
+            <w:proofErr w:type="gramStart"/>
+            <w:r>
+              <w:rPr>
+                <w:rFonts w:asciiTheme="minorHAnsi" w:hAnsiTheme="minorHAnsi" w:cstheme="minorHAnsi"/>
+                <w:sz w:val="20"/>
+                <w:szCs w:val="20"/>
+              </w:rPr>
+              <w:t>wurden</w:t>
+            </w:r>
+            <w:proofErr w:type="gramEnd"/>
+            <w:r>
+              <w:rPr>
+                <w:rFonts w:asciiTheme="minorHAnsi" w:hAnsiTheme="minorHAnsi" w:cstheme="minorHAnsi"/>
+                <w:sz w:val="20"/>
+                <w:szCs w:val="20"/>
+              </w:rPr>
+              <w:t xml:space="preserve"> bspw. durch das Einscannen einer analogen Aufnahme.</w:t>
             </w:r>
           </w:p>
         </w:tc>
@@ -8429,7 +8920,7 @@
             </w:pPr>
             <w:r>
               <w:rPr>
-                <w:rFonts w:asciiTheme="minorHAnsi" w:eastAsia="helvetica 45" w:hAnsiTheme="minorHAnsi" w:cstheme="minorHAnsi"/>
+                <w:rFonts w:asciiTheme="minorHAnsi" w:eastAsia="Helvetica 45" w:hAnsiTheme="minorHAnsi" w:cstheme="minorHAnsi"/>
                 <w:i/>
                 <w:sz w:val="20"/>
                 <w:szCs w:val="20"/>
@@ -8504,7 +8995,7 @@
             </w:pPr>
             <w:r>
               <w:rPr>
-                <w:rFonts w:asciiTheme="minorHAnsi" w:eastAsia="helvetica 45" w:hAnsiTheme="minorHAnsi" w:cstheme="minorHAnsi"/>
+                <w:rFonts w:asciiTheme="minorHAnsi" w:eastAsia="Helvetica 45" w:hAnsiTheme="minorHAnsi" w:cstheme="minorHAnsi"/>
                 <w:i/>
                 <w:sz w:val="20"/>
                 <w:szCs w:val="20"/>
@@ -8580,7 +9071,7 @@
             </w:pPr>
             <w:r>
               <w:rPr>
-                <w:rFonts w:asciiTheme="minorHAnsi" w:eastAsia="helvetica 45" w:hAnsiTheme="minorHAnsi" w:cstheme="minorHAnsi"/>
+                <w:rFonts w:asciiTheme="minorHAnsi" w:eastAsia="Helvetica 45" w:hAnsiTheme="minorHAnsi" w:cstheme="minorHAnsi"/>
                 <w:i/>
                 <w:sz w:val="20"/>
                 <w:szCs w:val="20"/>
@@ -8714,6 +9205,7 @@
                 <w:szCs w:val="20"/>
               </w:rPr>
             </w:pPr>
+            <w:proofErr w:type="spellStart"/>
             <w:r>
               <w:rPr>
                 <w:rFonts w:asciiTheme="minorHAnsi" w:hAnsiTheme="minorHAnsi" w:cstheme="minorHAnsi"/>
@@ -8721,7 +9213,17 @@
                 <w:sz w:val="20"/>
                 <w:szCs w:val="20"/>
               </w:rPr>
-              <w:t>Freddi Meter</w:t>
+              <w:t>Freddi</w:t>
+            </w:r>
+            <w:proofErr w:type="spellEnd"/>
+            <w:r>
+              <w:rPr>
+                <w:rFonts w:asciiTheme="minorHAnsi" w:hAnsiTheme="minorHAnsi" w:cstheme="minorHAnsi"/>
+                <w:bCs w:val="0"/>
+                <w:sz w:val="20"/>
+                <w:szCs w:val="20"/>
+              </w:rPr>
+              <w:t xml:space="preserve"> Meter</w:t>
             </w:r>
           </w:p>
         </w:tc>
@@ -8762,7 +9264,7 @@
             <w:pPr>
               <w:cnfStyle w:val="000000100000" w:firstRow="0" w:lastRow="0" w:firstColumn="0" w:lastColumn="0" w:oddVBand="0" w:evenVBand="0" w:oddHBand="1" w:evenHBand="0" w:firstRowFirstColumn="0" w:firstRowLastColumn="0" w:lastRowFirstColumn="0" w:lastRowLastColumn="0"/>
               <w:rPr>
-                <w:rFonts w:asciiTheme="minorHAnsi" w:eastAsia="helvetica 45" w:hAnsiTheme="minorHAnsi" w:cstheme="minorHAnsi"/>
+                <w:rFonts w:asciiTheme="minorHAnsi" w:eastAsia="Helvetica 45" w:hAnsiTheme="minorHAnsi" w:cstheme="minorHAnsi"/>
                 <w:i/>
                 <w:sz w:val="20"/>
                 <w:szCs w:val="20"/>
@@ -8770,7 +9272,7 @@
             </w:pPr>
             <w:r>
               <w:rPr>
-                <w:rFonts w:asciiTheme="minorHAnsi" w:eastAsia="helvetica 45" w:hAnsiTheme="minorHAnsi" w:cstheme="minorHAnsi"/>
+                <w:rFonts w:asciiTheme="minorHAnsi" w:eastAsia="Helvetica 45" w:hAnsiTheme="minorHAnsi" w:cstheme="minorHAnsi"/>
                 <w:i/>
                 <w:sz w:val="20"/>
                 <w:szCs w:val="20"/>
@@ -8782,7 +9284,7 @@
             <w:pPr>
               <w:cnfStyle w:val="000000100000" w:firstRow="0" w:lastRow="0" w:firstColumn="0" w:lastColumn="0" w:oddVBand="0" w:evenVBand="0" w:oddHBand="1" w:evenHBand="0" w:firstRowFirstColumn="0" w:firstRowLastColumn="0" w:lastRowFirstColumn="0" w:lastRowLastColumn="0"/>
               <w:rPr>
-                <w:rFonts w:asciiTheme="minorHAnsi" w:eastAsia="helvetica 45" w:hAnsiTheme="minorHAnsi" w:cstheme="minorHAnsi"/>
+                <w:rFonts w:asciiTheme="minorHAnsi" w:eastAsia="Helvetica 45" w:hAnsiTheme="minorHAnsi" w:cstheme="minorHAnsi"/>
                 <w:sz w:val="20"/>
                 <w:szCs w:val="20"/>
               </w:rPr>
@@ -8792,7 +9294,7 @@
             <w:pPr>
               <w:cnfStyle w:val="000000100000" w:firstRow="0" w:lastRow="0" w:firstColumn="0" w:lastColumn="0" w:oddVBand="0" w:evenVBand="0" w:oddHBand="1" w:evenHBand="0" w:firstRowFirstColumn="0" w:firstRowLastColumn="0" w:lastRowFirstColumn="0" w:lastRowLastColumn="0"/>
               <w:rPr>
-                <w:rFonts w:asciiTheme="minorHAnsi" w:eastAsia="helvetica 45" w:hAnsiTheme="minorHAnsi" w:cstheme="minorHAnsi"/>
+                <w:rFonts w:asciiTheme="minorHAnsi" w:eastAsia="Helvetica 45" w:hAnsiTheme="minorHAnsi" w:cstheme="minorHAnsi"/>
                 <w:i/>
                 <w:sz w:val="20"/>
                 <w:szCs w:val="20"/>
@@ -8800,7 +9302,7 @@
             </w:pPr>
             <w:r>
               <w:rPr>
-                <w:rFonts w:asciiTheme="minorHAnsi" w:eastAsia="helvetica 45" w:hAnsiTheme="minorHAnsi" w:cstheme="minorHAnsi"/>
+                <w:rFonts w:asciiTheme="minorHAnsi" w:eastAsia="Helvetica 45" w:hAnsiTheme="minorHAnsi" w:cstheme="minorHAnsi"/>
                 <w:i/>
                 <w:sz w:val="20"/>
                 <w:szCs w:val="20"/>
@@ -8812,7 +9314,7 @@
             <w:pPr>
               <w:cnfStyle w:val="000000100000" w:firstRow="0" w:lastRow="0" w:firstColumn="0" w:lastColumn="0" w:oddVBand="0" w:evenVBand="0" w:oddHBand="1" w:evenHBand="0" w:firstRowFirstColumn="0" w:firstRowLastColumn="0" w:lastRowFirstColumn="0" w:lastRowLastColumn="0"/>
               <w:rPr>
-                <w:rFonts w:asciiTheme="minorHAnsi" w:eastAsia="helvetica 45" w:hAnsiTheme="minorHAnsi" w:cstheme="minorHAnsi"/>
+                <w:rFonts w:asciiTheme="minorHAnsi" w:eastAsia="Helvetica 45" w:hAnsiTheme="minorHAnsi" w:cstheme="minorHAnsi"/>
                 <w:i/>
                 <w:sz w:val="20"/>
                 <w:szCs w:val="20"/>
@@ -8830,7 +9332,7 @@
             </w:pPr>
             <w:r>
               <w:rPr>
-                <w:rFonts w:asciiTheme="minorHAnsi" w:eastAsia="helvetica 45" w:hAnsiTheme="minorHAnsi" w:cstheme="minorHAnsi"/>
+                <w:rFonts w:asciiTheme="minorHAnsi" w:eastAsia="Helvetica 45" w:hAnsiTheme="minorHAnsi" w:cstheme="minorHAnsi"/>
                 <w:i/>
                 <w:sz w:val="20"/>
                 <w:szCs w:val="20"/>
@@ -8928,14 +9430,14 @@
             <w:pPr>
               <w:cnfStyle w:val="000000000000" w:firstRow="0" w:lastRow="0" w:firstColumn="0" w:lastColumn="0" w:oddVBand="0" w:evenVBand="0" w:oddHBand="0" w:evenHBand="0" w:firstRowFirstColumn="0" w:firstRowLastColumn="0" w:lastRowFirstColumn="0" w:lastRowLastColumn="0"/>
               <w:rPr>
-                <w:rFonts w:asciiTheme="minorHAnsi" w:eastAsia="helvetica 45" w:hAnsiTheme="minorHAnsi" w:cstheme="minorHAnsi"/>
-                <w:sz w:val="20"/>
-                <w:szCs w:val="20"/>
-              </w:rPr>
-            </w:pPr>
-            <w:r>
-              <w:rPr>
-                <w:rFonts w:asciiTheme="minorHAnsi" w:eastAsia="helvetica 45" w:hAnsiTheme="minorHAnsi" w:cstheme="minorHAnsi"/>
+                <w:rFonts w:asciiTheme="minorHAnsi" w:eastAsia="Helvetica 45" w:hAnsiTheme="minorHAnsi" w:cstheme="minorHAnsi"/>
+                <w:sz w:val="20"/>
+                <w:szCs w:val="20"/>
+              </w:rPr>
+            </w:pPr>
+            <w:r>
+              <w:rPr>
+                <w:rFonts w:asciiTheme="minorHAnsi" w:eastAsia="Helvetica 45" w:hAnsiTheme="minorHAnsi" w:cstheme="minorHAnsi"/>
                 <w:i/>
                 <w:sz w:val="20"/>
                 <w:szCs w:val="20"/>
@@ -9011,7 +9513,7 @@
             </w:pPr>
             <w:r>
               <w:rPr>
-                <w:rFonts w:asciiTheme="minorHAnsi" w:eastAsia="helvetica 45" w:hAnsiTheme="minorHAnsi" w:cstheme="minorHAnsi"/>
+                <w:rFonts w:asciiTheme="minorHAnsi" w:eastAsia="Helvetica 45" w:hAnsiTheme="minorHAnsi" w:cstheme="minorHAnsi"/>
                 <w:i/>
                 <w:sz w:val="20"/>
                 <w:szCs w:val="20"/>
@@ -9120,7 +9622,7 @@
             </w:pPr>
             <w:r>
               <w:rPr>
-                <w:rFonts w:asciiTheme="minorHAnsi" w:eastAsia="helvetica 45" w:hAnsiTheme="minorHAnsi" w:cstheme="minorHAnsi"/>
+                <w:rFonts w:asciiTheme="minorHAnsi" w:eastAsia="Helvetica 45" w:hAnsiTheme="minorHAnsi" w:cstheme="minorHAnsi"/>
                 <w:i/>
                 <w:sz w:val="20"/>
                 <w:szCs w:val="20"/>
@@ -9224,7 +9726,7 @@
             </w:pPr>
             <w:r>
               <w:rPr>
-                <w:rFonts w:asciiTheme="minorHAnsi" w:eastAsia="helvetica 45" w:hAnsiTheme="minorHAnsi" w:cstheme="minorHAnsi"/>
+                <w:rFonts w:asciiTheme="minorHAnsi" w:eastAsia="Helvetica 45" w:hAnsiTheme="minorHAnsi" w:cstheme="minorHAnsi"/>
                 <w:i/>
                 <w:sz w:val="20"/>
                 <w:szCs w:val="20"/>
@@ -9298,7 +9800,7 @@
             </w:pPr>
             <w:r>
               <w:rPr>
-                <w:rFonts w:asciiTheme="minorHAnsi" w:eastAsia="helvetica 45" w:hAnsiTheme="minorHAnsi" w:cstheme="minorHAnsi"/>
+                <w:rFonts w:asciiTheme="minorHAnsi" w:eastAsia="Helvetica 45" w:hAnsiTheme="minorHAnsi" w:cstheme="minorHAnsi"/>
                 <w:i/>
                 <w:sz w:val="20"/>
                 <w:szCs w:val="20"/>
@@ -9374,7 +9876,7 @@
             </w:pPr>
             <w:r>
               <w:rPr>
-                <w:rFonts w:asciiTheme="minorHAnsi" w:eastAsia="helvetica 45" w:hAnsiTheme="minorHAnsi" w:cstheme="minorHAnsi"/>
+                <w:rFonts w:asciiTheme="minorHAnsi" w:eastAsia="Helvetica 45" w:hAnsiTheme="minorHAnsi" w:cstheme="minorHAnsi"/>
                 <w:i/>
                 <w:sz w:val="20"/>
                 <w:szCs w:val="20"/>
@@ -9402,7 +9904,25 @@
                 <w:sz w:val="20"/>
                 <w:szCs w:val="20"/>
               </w:rPr>
-              <w:t>Wünschenswert wäre ein verlässliches Urteil, dass bspw. einem wiedergeborenen Freddie Mercury bei der Benutzung des Freddi Meters eine Übereinstimmung von 100% attestieren würde.</w:t>
+              <w:t xml:space="preserve">Wünschenswert wäre ein verlässliches Urteil, dass bspw. einem wiedergeborenen Freddie Mercury bei der Benutzung des </w:t>
+            </w:r>
+            <w:proofErr w:type="spellStart"/>
+            <w:r>
+              <w:rPr>
+                <w:rFonts w:asciiTheme="minorHAnsi" w:hAnsiTheme="minorHAnsi" w:cstheme="minorHAnsi"/>
+                <w:sz w:val="20"/>
+                <w:szCs w:val="20"/>
+              </w:rPr>
+              <w:t>Freddi</w:t>
+            </w:r>
+            <w:proofErr w:type="spellEnd"/>
+            <w:r>
+              <w:rPr>
+                <w:rFonts w:asciiTheme="minorHAnsi" w:hAnsiTheme="minorHAnsi" w:cstheme="minorHAnsi"/>
+                <w:sz w:val="20"/>
+                <w:szCs w:val="20"/>
+              </w:rPr>
+              <w:t xml:space="preserve"> Meters eine Übereinstimmung von 100% attestieren würde.</w:t>
             </w:r>
           </w:p>
         </w:tc>
@@ -9502,8 +10022,19 @@
                 <w:sz w:val="20"/>
                 <w:szCs w:val="20"/>
               </w:rPr>
-              <w:t>A.I. Duet</w:t>
-            </w:r>
+              <w:t xml:space="preserve">A.I. </w:t>
+            </w:r>
+            <w:proofErr w:type="spellStart"/>
+            <w:r>
+              <w:rPr>
+                <w:rFonts w:asciiTheme="minorHAnsi" w:hAnsiTheme="minorHAnsi" w:cstheme="minorHAnsi"/>
+                <w:bCs w:val="0"/>
+                <w:sz w:val="20"/>
+                <w:szCs w:val="20"/>
+              </w:rPr>
+              <w:t>Duet</w:t>
+            </w:r>
+            <w:proofErr w:type="spellEnd"/>
           </w:p>
         </w:tc>
       </w:tr>
@@ -9543,14 +10074,14 @@
             <w:pPr>
               <w:cnfStyle w:val="000000100000" w:firstRow="0" w:lastRow="0" w:firstColumn="0" w:lastColumn="0" w:oddVBand="0" w:evenVBand="0" w:oddHBand="1" w:evenHBand="0" w:firstRowFirstColumn="0" w:firstRowLastColumn="0" w:lastRowFirstColumn="0" w:lastRowLastColumn="0"/>
               <w:rPr>
-                <w:rFonts w:asciiTheme="minorHAnsi" w:eastAsia="helvetica 45" w:hAnsiTheme="minorHAnsi" w:cstheme="minorHAnsi"/>
-                <w:sz w:val="20"/>
-                <w:szCs w:val="20"/>
-              </w:rPr>
-            </w:pPr>
-            <w:r>
-              <w:rPr>
-                <w:rFonts w:asciiTheme="minorHAnsi" w:eastAsia="helvetica 45" w:hAnsiTheme="minorHAnsi" w:cstheme="minorHAnsi"/>
+                <w:rFonts w:asciiTheme="minorHAnsi" w:eastAsia="Helvetica 45" w:hAnsiTheme="minorHAnsi" w:cstheme="minorHAnsi"/>
+                <w:sz w:val="20"/>
+                <w:szCs w:val="20"/>
+              </w:rPr>
+            </w:pPr>
+            <w:r>
+              <w:rPr>
+                <w:rFonts w:asciiTheme="minorHAnsi" w:eastAsia="Helvetica 45" w:hAnsiTheme="minorHAnsi" w:cstheme="minorHAnsi"/>
                 <w:i/>
                 <w:sz w:val="20"/>
                 <w:szCs w:val="20"/>
@@ -9562,7 +10093,7 @@
             <w:pPr>
               <w:cnfStyle w:val="000000100000" w:firstRow="0" w:lastRow="0" w:firstColumn="0" w:lastColumn="0" w:oddVBand="0" w:evenVBand="0" w:oddHBand="1" w:evenHBand="0" w:firstRowFirstColumn="0" w:firstRowLastColumn="0" w:lastRowFirstColumn="0" w:lastRowLastColumn="0"/>
               <w:rPr>
-                <w:rFonts w:asciiTheme="minorHAnsi" w:eastAsia="helvetica 45" w:hAnsiTheme="minorHAnsi" w:cstheme="minorHAnsi"/>
+                <w:rFonts w:asciiTheme="minorHAnsi" w:eastAsia="Helvetica 45" w:hAnsiTheme="minorHAnsi" w:cstheme="minorHAnsi"/>
                 <w:sz w:val="20"/>
                 <w:szCs w:val="20"/>
               </w:rPr>
@@ -9572,7 +10103,7 @@
             <w:pPr>
               <w:cnfStyle w:val="000000100000" w:firstRow="0" w:lastRow="0" w:firstColumn="0" w:lastColumn="0" w:oddVBand="0" w:evenVBand="0" w:oddHBand="1" w:evenHBand="0" w:firstRowFirstColumn="0" w:firstRowLastColumn="0" w:lastRowFirstColumn="0" w:lastRowLastColumn="0"/>
               <w:rPr>
-                <w:rFonts w:asciiTheme="minorHAnsi" w:eastAsia="helvetica 45" w:hAnsiTheme="minorHAnsi" w:cstheme="minorHAnsi"/>
+                <w:rFonts w:asciiTheme="minorHAnsi" w:eastAsia="Helvetica 45" w:hAnsiTheme="minorHAnsi" w:cstheme="minorHAnsi"/>
                 <w:i/>
                 <w:sz w:val="20"/>
                 <w:szCs w:val="20"/>
@@ -9580,7 +10111,7 @@
             </w:pPr>
             <w:r>
               <w:rPr>
-                <w:rFonts w:asciiTheme="minorHAnsi" w:eastAsia="helvetica 45" w:hAnsiTheme="minorHAnsi" w:cstheme="minorHAnsi"/>
+                <w:rFonts w:asciiTheme="minorHAnsi" w:eastAsia="Helvetica 45" w:hAnsiTheme="minorHAnsi" w:cstheme="minorHAnsi"/>
                 <w:i/>
                 <w:sz w:val="20"/>
                 <w:szCs w:val="20"/>
@@ -9629,7 +10160,7 @@
             </w:pPr>
             <w:r>
               <w:rPr>
-                <w:rFonts w:asciiTheme="minorHAnsi" w:eastAsia="helvetica 45" w:hAnsiTheme="minorHAnsi" w:cstheme="minorHAnsi"/>
+                <w:rFonts w:asciiTheme="minorHAnsi" w:eastAsia="Helvetica 45" w:hAnsiTheme="minorHAnsi" w:cstheme="minorHAnsi"/>
                 <w:i/>
                 <w:sz w:val="20"/>
                 <w:szCs w:val="20"/>
@@ -9713,14 +10244,14 @@
             <w:pPr>
               <w:cnfStyle w:val="000000000000" w:firstRow="0" w:lastRow="0" w:firstColumn="0" w:lastColumn="0" w:oddVBand="0" w:evenVBand="0" w:oddHBand="0" w:evenHBand="0" w:firstRowFirstColumn="0" w:firstRowLastColumn="0" w:lastRowFirstColumn="0" w:lastRowLastColumn="0"/>
               <w:rPr>
-                <w:rFonts w:asciiTheme="minorHAnsi" w:eastAsia="helvetica 45" w:hAnsiTheme="minorHAnsi" w:cstheme="minorHAnsi"/>
-                <w:sz w:val="20"/>
-                <w:szCs w:val="20"/>
-              </w:rPr>
-            </w:pPr>
-            <w:r>
-              <w:rPr>
-                <w:rFonts w:asciiTheme="minorHAnsi" w:eastAsia="helvetica 45" w:hAnsiTheme="minorHAnsi" w:cstheme="minorHAnsi"/>
+                <w:rFonts w:asciiTheme="minorHAnsi" w:eastAsia="Helvetica 45" w:hAnsiTheme="minorHAnsi" w:cstheme="minorHAnsi"/>
+                <w:sz w:val="20"/>
+                <w:szCs w:val="20"/>
+              </w:rPr>
+            </w:pPr>
+            <w:r>
+              <w:rPr>
+                <w:rFonts w:asciiTheme="minorHAnsi" w:eastAsia="Helvetica 45" w:hAnsiTheme="minorHAnsi" w:cstheme="minorHAnsi"/>
                 <w:i/>
                 <w:sz w:val="20"/>
                 <w:szCs w:val="20"/>
@@ -9796,7 +10327,7 @@
             </w:pPr>
             <w:r>
               <w:rPr>
-                <w:rFonts w:asciiTheme="minorHAnsi" w:eastAsia="helvetica 45" w:hAnsiTheme="minorHAnsi" w:cstheme="minorHAnsi"/>
+                <w:rFonts w:asciiTheme="minorHAnsi" w:eastAsia="Helvetica 45" w:hAnsiTheme="minorHAnsi" w:cstheme="minorHAnsi"/>
                 <w:i/>
                 <w:sz w:val="20"/>
                 <w:szCs w:val="20"/>
@@ -9869,7 +10400,7 @@
             </w:pPr>
             <w:r>
               <w:rPr>
-                <w:rFonts w:asciiTheme="minorHAnsi" w:eastAsia="helvetica 45" w:hAnsiTheme="minorHAnsi" w:cstheme="minorHAnsi"/>
+                <w:rFonts w:asciiTheme="minorHAnsi" w:eastAsia="Helvetica 45" w:hAnsiTheme="minorHAnsi" w:cstheme="minorHAnsi"/>
                 <w:i/>
                 <w:sz w:val="20"/>
                 <w:szCs w:val="20"/>
@@ -9945,7 +10476,7 @@
             </w:pPr>
             <w:r>
               <w:rPr>
-                <w:rFonts w:asciiTheme="minorHAnsi" w:eastAsia="helvetica 45" w:hAnsiTheme="minorHAnsi" w:cstheme="minorHAnsi"/>
+                <w:rFonts w:asciiTheme="minorHAnsi" w:eastAsia="Helvetica 45" w:hAnsiTheme="minorHAnsi" w:cstheme="minorHAnsi"/>
                 <w:i/>
                 <w:sz w:val="20"/>
                 <w:szCs w:val="20"/>
@@ -10020,7 +10551,7 @@
             </w:pPr>
             <w:r>
               <w:rPr>
-                <w:rFonts w:asciiTheme="minorHAnsi" w:eastAsia="helvetica 45" w:hAnsiTheme="minorHAnsi" w:cstheme="minorHAnsi"/>
+                <w:rFonts w:asciiTheme="minorHAnsi" w:eastAsia="Helvetica 45" w:hAnsiTheme="minorHAnsi" w:cstheme="minorHAnsi"/>
                 <w:i/>
                 <w:sz w:val="20"/>
                 <w:szCs w:val="20"/>
@@ -10096,7 +10627,7 @@
             </w:pPr>
             <w:r>
               <w:rPr>
-                <w:rFonts w:asciiTheme="minorHAnsi" w:eastAsia="helvetica 45" w:hAnsiTheme="minorHAnsi" w:cstheme="minorHAnsi"/>
+                <w:rFonts w:asciiTheme="minorHAnsi" w:eastAsia="Helvetica 45" w:hAnsiTheme="minorHAnsi" w:cstheme="minorHAnsi"/>
                 <w:i/>
                 <w:sz w:val="20"/>
                 <w:szCs w:val="20"/>
@@ -10237,8 +10768,39 @@
                 <w:sz w:val="20"/>
                 <w:szCs w:val="20"/>
               </w:rPr>
-              <w:t>This Person does not exist</w:t>
-            </w:r>
+              <w:t xml:space="preserve">This Person </w:t>
+            </w:r>
+            <w:proofErr w:type="spellStart"/>
+            <w:r>
+              <w:rPr>
+                <w:rFonts w:asciiTheme="minorHAnsi" w:hAnsiTheme="minorHAnsi" w:cstheme="minorHAnsi"/>
+                <w:bCs w:val="0"/>
+                <w:sz w:val="20"/>
+                <w:szCs w:val="20"/>
+              </w:rPr>
+              <w:t>does</w:t>
+            </w:r>
+            <w:proofErr w:type="spellEnd"/>
+            <w:r>
+              <w:rPr>
+                <w:rFonts w:asciiTheme="minorHAnsi" w:hAnsiTheme="minorHAnsi" w:cstheme="minorHAnsi"/>
+                <w:bCs w:val="0"/>
+                <w:sz w:val="20"/>
+                <w:szCs w:val="20"/>
+              </w:rPr>
+              <w:t xml:space="preserve"> not </w:t>
+            </w:r>
+            <w:proofErr w:type="spellStart"/>
+            <w:r>
+              <w:rPr>
+                <w:rFonts w:asciiTheme="minorHAnsi" w:hAnsiTheme="minorHAnsi" w:cstheme="minorHAnsi"/>
+                <w:bCs w:val="0"/>
+                <w:sz w:val="20"/>
+                <w:szCs w:val="20"/>
+              </w:rPr>
+              <w:t>exist</w:t>
+            </w:r>
+            <w:proofErr w:type="spellEnd"/>
           </w:p>
           <w:p>
             <w:pPr>
@@ -10288,14 +10850,14 @@
             <w:pPr>
               <w:cnfStyle w:val="000000100000" w:firstRow="0" w:lastRow="0" w:firstColumn="0" w:lastColumn="0" w:oddVBand="0" w:evenVBand="0" w:oddHBand="1" w:evenHBand="0" w:firstRowFirstColumn="0" w:firstRowLastColumn="0" w:lastRowFirstColumn="0" w:lastRowLastColumn="0"/>
               <w:rPr>
-                <w:rFonts w:asciiTheme="minorHAnsi" w:eastAsia="helvetica 45" w:hAnsiTheme="minorHAnsi" w:cstheme="minorHAnsi"/>
-                <w:sz w:val="20"/>
-                <w:szCs w:val="20"/>
-              </w:rPr>
-            </w:pPr>
-            <w:r>
-              <w:rPr>
-                <w:rFonts w:asciiTheme="minorHAnsi" w:eastAsia="helvetica 45" w:hAnsiTheme="minorHAnsi" w:cstheme="minorHAnsi"/>
+                <w:rFonts w:asciiTheme="minorHAnsi" w:eastAsia="Helvetica 45" w:hAnsiTheme="minorHAnsi" w:cstheme="minorHAnsi"/>
+                <w:sz w:val="20"/>
+                <w:szCs w:val="20"/>
+              </w:rPr>
+            </w:pPr>
+            <w:r>
+              <w:rPr>
+                <w:rFonts w:asciiTheme="minorHAnsi" w:eastAsia="Helvetica 45" w:hAnsiTheme="minorHAnsi" w:cstheme="minorHAnsi"/>
                 <w:i/>
                 <w:sz w:val="20"/>
                 <w:szCs w:val="20"/>
@@ -10307,7 +10869,7 @@
             <w:pPr>
               <w:cnfStyle w:val="000000100000" w:firstRow="0" w:lastRow="0" w:firstColumn="0" w:lastColumn="0" w:oddVBand="0" w:evenVBand="0" w:oddHBand="1" w:evenHBand="0" w:firstRowFirstColumn="0" w:firstRowLastColumn="0" w:lastRowFirstColumn="0" w:lastRowLastColumn="0"/>
               <w:rPr>
-                <w:rFonts w:asciiTheme="minorHAnsi" w:eastAsia="helvetica 45" w:hAnsiTheme="minorHAnsi" w:cstheme="minorHAnsi"/>
+                <w:rFonts w:asciiTheme="minorHAnsi" w:eastAsia="Helvetica 45" w:hAnsiTheme="minorHAnsi" w:cstheme="minorHAnsi"/>
                 <w:sz w:val="20"/>
                 <w:szCs w:val="20"/>
               </w:rPr>
@@ -10317,7 +10879,7 @@
             <w:pPr>
               <w:cnfStyle w:val="000000100000" w:firstRow="0" w:lastRow="0" w:firstColumn="0" w:lastColumn="0" w:oddVBand="0" w:evenVBand="0" w:oddHBand="1" w:evenHBand="0" w:firstRowFirstColumn="0" w:firstRowLastColumn="0" w:lastRowFirstColumn="0" w:lastRowLastColumn="0"/>
               <w:rPr>
-                <w:rFonts w:asciiTheme="minorHAnsi" w:eastAsia="helvetica 45" w:hAnsiTheme="minorHAnsi" w:cstheme="minorHAnsi"/>
+                <w:rFonts w:asciiTheme="minorHAnsi" w:eastAsia="Helvetica 45" w:hAnsiTheme="minorHAnsi" w:cstheme="minorHAnsi"/>
                 <w:i/>
                 <w:sz w:val="20"/>
                 <w:szCs w:val="20"/>
@@ -10325,7 +10887,7 @@
             </w:pPr>
             <w:r>
               <w:rPr>
-                <w:rFonts w:asciiTheme="minorHAnsi" w:eastAsia="helvetica 45" w:hAnsiTheme="minorHAnsi" w:cstheme="minorHAnsi"/>
+                <w:rFonts w:asciiTheme="minorHAnsi" w:eastAsia="Helvetica 45" w:hAnsiTheme="minorHAnsi" w:cstheme="minorHAnsi"/>
                 <w:i/>
                 <w:sz w:val="20"/>
                 <w:szCs w:val="20"/>
@@ -10355,7 +10917,7 @@
             </w:pPr>
             <w:r>
               <w:rPr>
-                <w:rFonts w:asciiTheme="minorHAnsi" w:eastAsia="helvetica 45" w:hAnsiTheme="minorHAnsi" w:cstheme="minorHAnsi"/>
+                <w:rFonts w:asciiTheme="minorHAnsi" w:eastAsia="Helvetica 45" w:hAnsiTheme="minorHAnsi" w:cstheme="minorHAnsi"/>
                 <w:i/>
                 <w:sz w:val="20"/>
                 <w:szCs w:val="20"/>
@@ -10439,14 +11001,14 @@
             <w:pPr>
               <w:cnfStyle w:val="000000000000" w:firstRow="0" w:lastRow="0" w:firstColumn="0" w:lastColumn="0" w:oddVBand="0" w:evenVBand="0" w:oddHBand="0" w:evenHBand="0" w:firstRowFirstColumn="0" w:firstRowLastColumn="0" w:lastRowFirstColumn="0" w:lastRowLastColumn="0"/>
               <w:rPr>
-                <w:rFonts w:asciiTheme="minorHAnsi" w:eastAsia="helvetica 45" w:hAnsiTheme="minorHAnsi" w:cstheme="minorHAnsi"/>
-                <w:sz w:val="20"/>
-                <w:szCs w:val="20"/>
-              </w:rPr>
-            </w:pPr>
-            <w:r>
-              <w:rPr>
-                <w:rFonts w:asciiTheme="minorHAnsi" w:eastAsia="helvetica 45" w:hAnsiTheme="minorHAnsi" w:cstheme="minorHAnsi"/>
+                <w:rFonts w:asciiTheme="minorHAnsi" w:eastAsia="Helvetica 45" w:hAnsiTheme="minorHAnsi" w:cstheme="minorHAnsi"/>
+                <w:sz w:val="20"/>
+                <w:szCs w:val="20"/>
+              </w:rPr>
+            </w:pPr>
+            <w:r>
+              <w:rPr>
+                <w:rFonts w:asciiTheme="minorHAnsi" w:eastAsia="Helvetica 45" w:hAnsiTheme="minorHAnsi" w:cstheme="minorHAnsi"/>
                 <w:i/>
                 <w:sz w:val="20"/>
                 <w:szCs w:val="20"/>
@@ -10522,7 +11084,7 @@
             </w:pPr>
             <w:r>
               <w:rPr>
-                <w:rFonts w:asciiTheme="minorHAnsi" w:eastAsia="helvetica 45" w:hAnsiTheme="minorHAnsi" w:cstheme="minorHAnsi"/>
+                <w:rFonts w:asciiTheme="minorHAnsi" w:eastAsia="Helvetica 45" w:hAnsiTheme="minorHAnsi" w:cstheme="minorHAnsi"/>
                 <w:i/>
                 <w:sz w:val="20"/>
                 <w:szCs w:val="20"/>
@@ -10621,7 +11183,7 @@
             </w:pPr>
             <w:r>
               <w:rPr>
-                <w:rFonts w:asciiTheme="minorHAnsi" w:eastAsia="helvetica 45" w:hAnsiTheme="minorHAnsi" w:cstheme="minorHAnsi"/>
+                <w:rFonts w:asciiTheme="minorHAnsi" w:eastAsia="Helvetica 45" w:hAnsiTheme="minorHAnsi" w:cstheme="minorHAnsi"/>
                 <w:i/>
                 <w:sz w:val="20"/>
                 <w:szCs w:val="20"/>
@@ -10649,7 +11211,25 @@
                 <w:sz w:val="20"/>
                 <w:szCs w:val="20"/>
               </w:rPr>
-              <w:t>Die Bilddateien wurden typischerweise von Fotosensoren einer Kamera bspw. eines Smartphones aufgenommen. Denkbar sind auch Bilddateien, die digitalisiert wurden bspw. durch das Einscannen einer analogen Aufnahme.</w:t>
+              <w:t xml:space="preserve">Die Bilddateien wurden typischerweise von Fotosensoren einer Kamera bspw. eines Smartphones aufgenommen. Denkbar sind auch Bilddateien, die digitalisiert </w:t>
+            </w:r>
+            <w:proofErr w:type="gramStart"/>
+            <w:r>
+              <w:rPr>
+                <w:rFonts w:asciiTheme="minorHAnsi" w:hAnsiTheme="minorHAnsi" w:cstheme="minorHAnsi"/>
+                <w:sz w:val="20"/>
+                <w:szCs w:val="20"/>
+              </w:rPr>
+              <w:t>wurden</w:t>
+            </w:r>
+            <w:proofErr w:type="gramEnd"/>
+            <w:r>
+              <w:rPr>
+                <w:rFonts w:asciiTheme="minorHAnsi" w:hAnsiTheme="minorHAnsi" w:cstheme="minorHAnsi"/>
+                <w:sz w:val="20"/>
+                <w:szCs w:val="20"/>
+              </w:rPr>
+              <w:t xml:space="preserve"> bspw. durch das Einscannen einer analogen Aufnahme.</w:t>
             </w:r>
           </w:p>
         </w:tc>
@@ -10697,7 +11277,7 @@
             </w:pPr>
             <w:r>
               <w:rPr>
-                <w:rFonts w:asciiTheme="minorHAnsi" w:eastAsia="helvetica 45" w:hAnsiTheme="minorHAnsi" w:cstheme="minorHAnsi"/>
+                <w:rFonts w:asciiTheme="minorHAnsi" w:eastAsia="Helvetica 45" w:hAnsiTheme="minorHAnsi" w:cstheme="minorHAnsi"/>
                 <w:i/>
                 <w:sz w:val="20"/>
                 <w:szCs w:val="20"/>
@@ -10771,7 +11351,7 @@
             </w:pPr>
             <w:r>
               <w:rPr>
-                <w:rFonts w:asciiTheme="minorHAnsi" w:eastAsia="helvetica 45" w:hAnsiTheme="minorHAnsi" w:cstheme="minorHAnsi"/>
+                <w:rFonts w:asciiTheme="minorHAnsi" w:eastAsia="Helvetica 45" w:hAnsiTheme="minorHAnsi" w:cstheme="minorHAnsi"/>
                 <w:i/>
                 <w:sz w:val="20"/>
                 <w:szCs w:val="20"/>
@@ -10847,7 +11427,7 @@
             </w:pPr>
             <w:r>
               <w:rPr>
-                <w:rFonts w:asciiTheme="minorHAnsi" w:eastAsia="helvetica 45" w:hAnsiTheme="minorHAnsi" w:cstheme="minorHAnsi"/>
+                <w:rFonts w:asciiTheme="minorHAnsi" w:eastAsia="Helvetica 45" w:hAnsiTheme="minorHAnsi" w:cstheme="minorHAnsi"/>
                 <w:i/>
                 <w:sz w:val="20"/>
                 <w:szCs w:val="20"/>
@@ -10967,6 +11547,7 @@
                 <w:szCs w:val="20"/>
               </w:rPr>
             </w:pPr>
+            <w:proofErr w:type="spellStart"/>
             <w:r>
               <w:rPr>
                 <w:rFonts w:asciiTheme="minorHAnsi" w:hAnsiTheme="minorHAnsi" w:cstheme="minorHAnsi"/>
@@ -10974,7 +11555,17 @@
                 <w:sz w:val="20"/>
                 <w:szCs w:val="20"/>
               </w:rPr>
-              <w:t>How normal am I</w:t>
+              <w:t>How</w:t>
+            </w:r>
+            <w:proofErr w:type="spellEnd"/>
+            <w:r>
+              <w:rPr>
+                <w:rFonts w:asciiTheme="minorHAnsi" w:hAnsiTheme="minorHAnsi" w:cstheme="minorHAnsi"/>
+                <w:bCs w:val="0"/>
+                <w:sz w:val="20"/>
+                <w:szCs w:val="20"/>
+              </w:rPr>
+              <w:t xml:space="preserve"> normal am I</w:t>
             </w:r>
           </w:p>
         </w:tc>
@@ -11015,14 +11606,14 @@
             <w:pPr>
               <w:cnfStyle w:val="000000100000" w:firstRow="0" w:lastRow="0" w:firstColumn="0" w:lastColumn="0" w:oddVBand="0" w:evenVBand="0" w:oddHBand="1" w:evenHBand="0" w:firstRowFirstColumn="0" w:firstRowLastColumn="0" w:lastRowFirstColumn="0" w:lastRowLastColumn="0"/>
               <w:rPr>
-                <w:rFonts w:asciiTheme="minorHAnsi" w:eastAsia="helvetica 45" w:hAnsiTheme="minorHAnsi" w:cstheme="minorHAnsi"/>
-                <w:sz w:val="20"/>
-                <w:szCs w:val="20"/>
-              </w:rPr>
-            </w:pPr>
-            <w:r>
-              <w:rPr>
-                <w:rFonts w:asciiTheme="minorHAnsi" w:eastAsia="helvetica 45" w:hAnsiTheme="minorHAnsi" w:cstheme="minorHAnsi"/>
+                <w:rFonts w:asciiTheme="minorHAnsi" w:eastAsia="Helvetica 45" w:hAnsiTheme="minorHAnsi" w:cstheme="minorHAnsi"/>
+                <w:sz w:val="20"/>
+                <w:szCs w:val="20"/>
+              </w:rPr>
+            </w:pPr>
+            <w:r>
+              <w:rPr>
+                <w:rFonts w:asciiTheme="minorHAnsi" w:eastAsia="Helvetica 45" w:hAnsiTheme="minorHAnsi" w:cstheme="minorHAnsi"/>
                 <w:i/>
                 <w:sz w:val="20"/>
                 <w:szCs w:val="20"/>
@@ -11034,7 +11625,7 @@
             <w:pPr>
               <w:cnfStyle w:val="000000100000" w:firstRow="0" w:lastRow="0" w:firstColumn="0" w:lastColumn="0" w:oddVBand="0" w:evenVBand="0" w:oddHBand="1" w:evenHBand="0" w:firstRowFirstColumn="0" w:firstRowLastColumn="0" w:lastRowFirstColumn="0" w:lastRowLastColumn="0"/>
               <w:rPr>
-                <w:rFonts w:asciiTheme="minorHAnsi" w:eastAsia="helvetica 45" w:hAnsiTheme="minorHAnsi" w:cstheme="minorHAnsi"/>
+                <w:rFonts w:asciiTheme="minorHAnsi" w:eastAsia="Helvetica 45" w:hAnsiTheme="minorHAnsi" w:cstheme="minorHAnsi"/>
                 <w:sz w:val="20"/>
                 <w:szCs w:val="20"/>
               </w:rPr>
@@ -11044,7 +11635,7 @@
             <w:pPr>
               <w:cnfStyle w:val="000000100000" w:firstRow="0" w:lastRow="0" w:firstColumn="0" w:lastColumn="0" w:oddVBand="0" w:evenVBand="0" w:oddHBand="1" w:evenHBand="0" w:firstRowFirstColumn="0" w:firstRowLastColumn="0" w:lastRowFirstColumn="0" w:lastRowLastColumn="0"/>
               <w:rPr>
-                <w:rFonts w:asciiTheme="minorHAnsi" w:eastAsia="helvetica 45" w:hAnsiTheme="minorHAnsi" w:cstheme="minorHAnsi"/>
+                <w:rFonts w:asciiTheme="minorHAnsi" w:eastAsia="Helvetica 45" w:hAnsiTheme="minorHAnsi" w:cstheme="minorHAnsi"/>
                 <w:i/>
                 <w:sz w:val="20"/>
                 <w:szCs w:val="20"/>
@@ -11052,7 +11643,7 @@
             </w:pPr>
             <w:r>
               <w:rPr>
-                <w:rFonts w:asciiTheme="minorHAnsi" w:eastAsia="helvetica 45" w:hAnsiTheme="minorHAnsi" w:cstheme="minorHAnsi"/>
+                <w:rFonts w:asciiTheme="minorHAnsi" w:eastAsia="Helvetica 45" w:hAnsiTheme="minorHAnsi" w:cstheme="minorHAnsi"/>
                 <w:i/>
                 <w:sz w:val="20"/>
                 <w:szCs w:val="20"/>
@@ -11111,7 +11702,7 @@
             </w:pPr>
             <w:r>
               <w:rPr>
-                <w:rFonts w:asciiTheme="minorHAnsi" w:eastAsia="helvetica 45" w:hAnsiTheme="minorHAnsi" w:cstheme="minorHAnsi"/>
+                <w:rFonts w:asciiTheme="minorHAnsi" w:eastAsia="Helvetica 45" w:hAnsiTheme="minorHAnsi" w:cstheme="minorHAnsi"/>
                 <w:i/>
                 <w:sz w:val="20"/>
                 <w:szCs w:val="20"/>
@@ -11205,14 +11796,14 @@
             <w:pPr>
               <w:cnfStyle w:val="000000000000" w:firstRow="0" w:lastRow="0" w:firstColumn="0" w:lastColumn="0" w:oddVBand="0" w:evenVBand="0" w:oddHBand="0" w:evenHBand="0" w:firstRowFirstColumn="0" w:firstRowLastColumn="0" w:lastRowFirstColumn="0" w:lastRowLastColumn="0"/>
               <w:rPr>
-                <w:rFonts w:asciiTheme="minorHAnsi" w:eastAsia="helvetica 45" w:hAnsiTheme="minorHAnsi" w:cstheme="minorHAnsi"/>
-                <w:sz w:val="20"/>
-                <w:szCs w:val="20"/>
-              </w:rPr>
-            </w:pPr>
-            <w:r>
-              <w:rPr>
-                <w:rFonts w:asciiTheme="minorHAnsi" w:eastAsia="helvetica 45" w:hAnsiTheme="minorHAnsi" w:cstheme="minorHAnsi"/>
+                <w:rFonts w:asciiTheme="minorHAnsi" w:eastAsia="Helvetica 45" w:hAnsiTheme="minorHAnsi" w:cstheme="minorHAnsi"/>
+                <w:sz w:val="20"/>
+                <w:szCs w:val="20"/>
+              </w:rPr>
+            </w:pPr>
+            <w:r>
+              <w:rPr>
+                <w:rFonts w:asciiTheme="minorHAnsi" w:eastAsia="Helvetica 45" w:hAnsiTheme="minorHAnsi" w:cstheme="minorHAnsi"/>
                 <w:i/>
                 <w:sz w:val="20"/>
                 <w:szCs w:val="20"/>
@@ -11288,7 +11879,7 @@
             </w:pPr>
             <w:r>
               <w:rPr>
-                <w:rFonts w:asciiTheme="minorHAnsi" w:eastAsia="helvetica 45" w:hAnsiTheme="minorHAnsi" w:cstheme="minorHAnsi"/>
+                <w:rFonts w:asciiTheme="minorHAnsi" w:eastAsia="Helvetica 45" w:hAnsiTheme="minorHAnsi" w:cstheme="minorHAnsi"/>
                 <w:i/>
                 <w:sz w:val="20"/>
                 <w:szCs w:val="20"/>
@@ -11389,7 +11980,7 @@
             </w:pPr>
             <w:r>
               <w:rPr>
-                <w:rFonts w:asciiTheme="minorHAnsi" w:eastAsia="helvetica 45" w:hAnsiTheme="minorHAnsi" w:cstheme="minorHAnsi"/>
+                <w:rFonts w:asciiTheme="minorHAnsi" w:eastAsia="Helvetica 45" w:hAnsiTheme="minorHAnsi" w:cstheme="minorHAnsi"/>
                 <w:i/>
                 <w:sz w:val="20"/>
                 <w:szCs w:val="20"/>
@@ -11493,7 +12084,7 @@
             </w:pPr>
             <w:r>
               <w:rPr>
-                <w:rFonts w:asciiTheme="minorHAnsi" w:eastAsia="helvetica 45" w:hAnsiTheme="minorHAnsi" w:cstheme="minorHAnsi"/>
+                <w:rFonts w:asciiTheme="minorHAnsi" w:eastAsia="Helvetica 45" w:hAnsiTheme="minorHAnsi" w:cstheme="minorHAnsi"/>
                 <w:i/>
                 <w:sz w:val="20"/>
                 <w:szCs w:val="20"/>
@@ -11567,7 +12158,7 @@
             </w:pPr>
             <w:r>
               <w:rPr>
-                <w:rFonts w:asciiTheme="minorHAnsi" w:eastAsia="helvetica 45" w:hAnsiTheme="minorHAnsi" w:cstheme="minorHAnsi"/>
+                <w:rFonts w:asciiTheme="minorHAnsi" w:eastAsia="Helvetica 45" w:hAnsiTheme="minorHAnsi" w:cstheme="minorHAnsi"/>
                 <w:i/>
                 <w:sz w:val="20"/>
                 <w:szCs w:val="20"/>
@@ -11643,7 +12234,7 @@
             </w:pPr>
             <w:r>
               <w:rPr>
-                <w:rFonts w:asciiTheme="minorHAnsi" w:eastAsia="helvetica 45" w:hAnsiTheme="minorHAnsi" w:cstheme="minorHAnsi"/>
+                <w:rFonts w:asciiTheme="minorHAnsi" w:eastAsia="Helvetica 45" w:hAnsiTheme="minorHAnsi" w:cstheme="minorHAnsi"/>
                 <w:i/>
                 <w:sz w:val="20"/>
                 <w:szCs w:val="20"/>
@@ -11786,6 +12377,7 @@
                 <w:szCs w:val="20"/>
               </w:rPr>
             </w:pPr>
+            <w:proofErr w:type="spellStart"/>
             <w:r>
               <w:rPr>
                 <w:rFonts w:asciiTheme="minorHAnsi" w:hAnsiTheme="minorHAnsi" w:cstheme="minorHAnsi"/>
@@ -11793,7 +12385,37 @@
                 <w:sz w:val="20"/>
                 <w:szCs w:val="20"/>
               </w:rPr>
-              <w:t>Erase Your Face</w:t>
+              <w:t>Erase</w:t>
+            </w:r>
+            <w:proofErr w:type="spellEnd"/>
+            <w:r>
+              <w:rPr>
+                <w:rFonts w:asciiTheme="minorHAnsi" w:hAnsiTheme="minorHAnsi" w:cstheme="minorHAnsi"/>
+                <w:bCs w:val="0"/>
+                <w:sz w:val="20"/>
+                <w:szCs w:val="20"/>
+              </w:rPr>
+              <w:t xml:space="preserve"> </w:t>
+            </w:r>
+            <w:proofErr w:type="spellStart"/>
+            <w:r>
+              <w:rPr>
+                <w:rFonts w:asciiTheme="minorHAnsi" w:hAnsiTheme="minorHAnsi" w:cstheme="minorHAnsi"/>
+                <w:bCs w:val="0"/>
+                <w:sz w:val="20"/>
+                <w:szCs w:val="20"/>
+              </w:rPr>
+              <w:t>Your</w:t>
+            </w:r>
+            <w:proofErr w:type="spellEnd"/>
+            <w:r>
+              <w:rPr>
+                <w:rFonts w:asciiTheme="minorHAnsi" w:hAnsiTheme="minorHAnsi" w:cstheme="minorHAnsi"/>
+                <w:bCs w:val="0"/>
+                <w:sz w:val="20"/>
+                <w:szCs w:val="20"/>
+              </w:rPr>
+              <w:t xml:space="preserve"> Face</w:t>
             </w:r>
           </w:p>
         </w:tc>
@@ -11834,14 +12456,14 @@
             <w:pPr>
               <w:cnfStyle w:val="000000100000" w:firstRow="0" w:lastRow="0" w:firstColumn="0" w:lastColumn="0" w:oddVBand="0" w:evenVBand="0" w:oddHBand="1" w:evenHBand="0" w:firstRowFirstColumn="0" w:firstRowLastColumn="0" w:lastRowFirstColumn="0" w:lastRowLastColumn="0"/>
               <w:rPr>
-                <w:rFonts w:asciiTheme="minorHAnsi" w:eastAsia="helvetica 45" w:hAnsiTheme="minorHAnsi" w:cstheme="minorHAnsi"/>
-                <w:sz w:val="20"/>
-                <w:szCs w:val="20"/>
-              </w:rPr>
-            </w:pPr>
-            <w:r>
-              <w:rPr>
-                <w:rFonts w:asciiTheme="minorHAnsi" w:eastAsia="helvetica 45" w:hAnsiTheme="minorHAnsi" w:cstheme="minorHAnsi"/>
+                <w:rFonts w:asciiTheme="minorHAnsi" w:eastAsia="Helvetica 45" w:hAnsiTheme="minorHAnsi" w:cstheme="minorHAnsi"/>
+                <w:sz w:val="20"/>
+                <w:szCs w:val="20"/>
+              </w:rPr>
+            </w:pPr>
+            <w:r>
+              <w:rPr>
+                <w:rFonts w:asciiTheme="minorHAnsi" w:eastAsia="Helvetica 45" w:hAnsiTheme="minorHAnsi" w:cstheme="minorHAnsi"/>
                 <w:i/>
                 <w:sz w:val="20"/>
                 <w:szCs w:val="20"/>
@@ -11853,7 +12475,7 @@
             <w:pPr>
               <w:cnfStyle w:val="000000100000" w:firstRow="0" w:lastRow="0" w:firstColumn="0" w:lastColumn="0" w:oddVBand="0" w:evenVBand="0" w:oddHBand="1" w:evenHBand="0" w:firstRowFirstColumn="0" w:firstRowLastColumn="0" w:lastRowFirstColumn="0" w:lastRowLastColumn="0"/>
               <w:rPr>
-                <w:rFonts w:asciiTheme="minorHAnsi" w:eastAsia="helvetica 45" w:hAnsiTheme="minorHAnsi" w:cstheme="minorHAnsi"/>
+                <w:rFonts w:asciiTheme="minorHAnsi" w:eastAsia="Helvetica 45" w:hAnsiTheme="minorHAnsi" w:cstheme="minorHAnsi"/>
                 <w:i/>
                 <w:sz w:val="20"/>
                 <w:szCs w:val="20"/>
@@ -11861,7 +12483,7 @@
             </w:pPr>
             <w:r>
               <w:rPr>
-                <w:rFonts w:asciiTheme="minorHAnsi" w:eastAsia="helvetica 45" w:hAnsiTheme="minorHAnsi" w:cstheme="minorHAnsi"/>
+                <w:rFonts w:asciiTheme="minorHAnsi" w:eastAsia="Helvetica 45" w:hAnsiTheme="minorHAnsi" w:cstheme="minorHAnsi"/>
                 <w:i/>
                 <w:sz w:val="20"/>
                 <w:szCs w:val="20"/>
@@ -11880,7 +12502,7 @@
             </w:pPr>
             <w:r>
               <w:rPr>
-                <w:rFonts w:asciiTheme="minorHAnsi" w:eastAsia="helvetica 45" w:hAnsiTheme="minorHAnsi" w:cstheme="minorHAnsi"/>
+                <w:rFonts w:asciiTheme="minorHAnsi" w:eastAsia="Helvetica 45" w:hAnsiTheme="minorHAnsi" w:cstheme="minorHAnsi"/>
                 <w:i/>
                 <w:sz w:val="20"/>
                 <w:szCs w:val="20"/>
@@ -11974,14 +12596,14 @@
             <w:pPr>
               <w:cnfStyle w:val="000000000000" w:firstRow="0" w:lastRow="0" w:firstColumn="0" w:lastColumn="0" w:oddVBand="0" w:evenVBand="0" w:oddHBand="0" w:evenHBand="0" w:firstRowFirstColumn="0" w:firstRowLastColumn="0" w:lastRowFirstColumn="0" w:lastRowLastColumn="0"/>
               <w:rPr>
-                <w:rFonts w:asciiTheme="minorHAnsi" w:eastAsia="helvetica 45" w:hAnsiTheme="minorHAnsi" w:cstheme="minorHAnsi"/>
-                <w:sz w:val="20"/>
-                <w:szCs w:val="20"/>
-              </w:rPr>
-            </w:pPr>
-            <w:r>
-              <w:rPr>
-                <w:rFonts w:asciiTheme="minorHAnsi" w:eastAsia="helvetica 45" w:hAnsiTheme="minorHAnsi" w:cstheme="minorHAnsi"/>
+                <w:rFonts w:asciiTheme="minorHAnsi" w:eastAsia="Helvetica 45" w:hAnsiTheme="minorHAnsi" w:cstheme="minorHAnsi"/>
+                <w:sz w:val="20"/>
+                <w:szCs w:val="20"/>
+              </w:rPr>
+            </w:pPr>
+            <w:r>
+              <w:rPr>
+                <w:rFonts w:asciiTheme="minorHAnsi" w:eastAsia="Helvetica 45" w:hAnsiTheme="minorHAnsi" w:cstheme="minorHAnsi"/>
                 <w:i/>
                 <w:sz w:val="20"/>
                 <w:szCs w:val="20"/>
@@ -12057,7 +12679,7 @@
             </w:pPr>
             <w:r>
               <w:rPr>
-                <w:rFonts w:asciiTheme="minorHAnsi" w:eastAsia="helvetica 45" w:hAnsiTheme="minorHAnsi" w:cstheme="minorHAnsi"/>
+                <w:rFonts w:asciiTheme="minorHAnsi" w:eastAsia="Helvetica 45" w:hAnsiTheme="minorHAnsi" w:cstheme="minorHAnsi"/>
                 <w:i/>
                 <w:sz w:val="20"/>
                 <w:szCs w:val="20"/>
@@ -12158,7 +12780,7 @@
             </w:pPr>
             <w:r>
               <w:rPr>
-                <w:rFonts w:asciiTheme="minorHAnsi" w:eastAsia="helvetica 45" w:hAnsiTheme="minorHAnsi" w:cstheme="minorHAnsi"/>
+                <w:rFonts w:asciiTheme="minorHAnsi" w:eastAsia="Helvetica 45" w:hAnsiTheme="minorHAnsi" w:cstheme="minorHAnsi"/>
                 <w:i/>
                 <w:sz w:val="20"/>
                 <w:szCs w:val="20"/>
@@ -12262,7 +12884,7 @@
             </w:pPr>
             <w:r>
               <w:rPr>
-                <w:rFonts w:asciiTheme="minorHAnsi" w:eastAsia="helvetica 45" w:hAnsiTheme="minorHAnsi" w:cstheme="minorHAnsi"/>
+                <w:rFonts w:asciiTheme="minorHAnsi" w:eastAsia="Helvetica 45" w:hAnsiTheme="minorHAnsi" w:cstheme="minorHAnsi"/>
                 <w:i/>
                 <w:sz w:val="20"/>
                 <w:szCs w:val="20"/>
@@ -12336,7 +12958,7 @@
             </w:pPr>
             <w:r>
               <w:rPr>
-                <w:rFonts w:asciiTheme="minorHAnsi" w:eastAsia="helvetica 45" w:hAnsiTheme="minorHAnsi" w:cstheme="minorHAnsi"/>
+                <w:rFonts w:asciiTheme="minorHAnsi" w:eastAsia="Helvetica 45" w:hAnsiTheme="minorHAnsi" w:cstheme="minorHAnsi"/>
                 <w:i/>
                 <w:sz w:val="20"/>
                 <w:szCs w:val="20"/>
@@ -12412,7 +13034,7 @@
             </w:pPr>
             <w:r>
               <w:rPr>
-                <w:rFonts w:asciiTheme="minorHAnsi" w:eastAsia="helvetica 45" w:hAnsiTheme="minorHAnsi" w:cstheme="minorHAnsi"/>
+                <w:rFonts w:asciiTheme="minorHAnsi" w:eastAsia="Helvetica 45" w:hAnsiTheme="minorHAnsi" w:cstheme="minorHAnsi"/>
                 <w:i/>
                 <w:sz w:val="20"/>
                 <w:szCs w:val="20"/>
@@ -12552,8 +13174,19 @@
                 <w:sz w:val="20"/>
                 <w:szCs w:val="20"/>
               </w:rPr>
-              <w:t>Wildlife Insights</w:t>
-            </w:r>
+              <w:t xml:space="preserve">Wildlife </w:t>
+            </w:r>
+            <w:proofErr w:type="spellStart"/>
+            <w:r>
+              <w:rPr>
+                <w:rFonts w:asciiTheme="minorHAnsi" w:hAnsiTheme="minorHAnsi" w:cstheme="minorHAnsi"/>
+                <w:bCs w:val="0"/>
+                <w:sz w:val="20"/>
+                <w:szCs w:val="20"/>
+              </w:rPr>
+              <w:t>Insights</w:t>
+            </w:r>
+            <w:proofErr w:type="spellEnd"/>
           </w:p>
         </w:tc>
       </w:tr>
@@ -12593,14 +13226,14 @@
             <w:pPr>
               <w:cnfStyle w:val="000000100000" w:firstRow="0" w:lastRow="0" w:firstColumn="0" w:lastColumn="0" w:oddVBand="0" w:evenVBand="0" w:oddHBand="1" w:evenHBand="0" w:firstRowFirstColumn="0" w:firstRowLastColumn="0" w:lastRowFirstColumn="0" w:lastRowLastColumn="0"/>
               <w:rPr>
-                <w:rFonts w:asciiTheme="minorHAnsi" w:eastAsia="helvetica 45" w:hAnsiTheme="minorHAnsi" w:cstheme="minorHAnsi"/>
-                <w:sz w:val="20"/>
-                <w:szCs w:val="20"/>
-              </w:rPr>
-            </w:pPr>
-            <w:r>
-              <w:rPr>
-                <w:rFonts w:asciiTheme="minorHAnsi" w:eastAsia="helvetica 45" w:hAnsiTheme="minorHAnsi" w:cstheme="minorHAnsi"/>
+                <w:rFonts w:asciiTheme="minorHAnsi" w:eastAsia="Helvetica 45" w:hAnsiTheme="minorHAnsi" w:cstheme="minorHAnsi"/>
+                <w:sz w:val="20"/>
+                <w:szCs w:val="20"/>
+              </w:rPr>
+            </w:pPr>
+            <w:r>
+              <w:rPr>
+                <w:rFonts w:asciiTheme="minorHAnsi" w:eastAsia="Helvetica 45" w:hAnsiTheme="minorHAnsi" w:cstheme="minorHAnsi"/>
                 <w:i/>
                 <w:sz w:val="20"/>
                 <w:szCs w:val="20"/>
@@ -12612,7 +13245,7 @@
             <w:pPr>
               <w:cnfStyle w:val="000000100000" w:firstRow="0" w:lastRow="0" w:firstColumn="0" w:lastColumn="0" w:oddVBand="0" w:evenVBand="0" w:oddHBand="1" w:evenHBand="0" w:firstRowFirstColumn="0" w:firstRowLastColumn="0" w:lastRowFirstColumn="0" w:lastRowLastColumn="0"/>
               <w:rPr>
-                <w:rFonts w:asciiTheme="minorHAnsi" w:eastAsia="helvetica 45" w:hAnsiTheme="minorHAnsi" w:cstheme="minorHAnsi"/>
+                <w:rFonts w:asciiTheme="minorHAnsi" w:eastAsia="Helvetica 45" w:hAnsiTheme="minorHAnsi" w:cstheme="minorHAnsi"/>
                 <w:sz w:val="20"/>
                 <w:szCs w:val="20"/>
               </w:rPr>
@@ -12622,7 +13255,7 @@
             <w:pPr>
               <w:cnfStyle w:val="000000100000" w:firstRow="0" w:lastRow="0" w:firstColumn="0" w:lastColumn="0" w:oddVBand="0" w:evenVBand="0" w:oddHBand="1" w:evenHBand="0" w:firstRowFirstColumn="0" w:firstRowLastColumn="0" w:lastRowFirstColumn="0" w:lastRowLastColumn="0"/>
               <w:rPr>
-                <w:rFonts w:asciiTheme="minorHAnsi" w:eastAsia="helvetica 45" w:hAnsiTheme="minorHAnsi" w:cstheme="minorHAnsi"/>
+                <w:rFonts w:asciiTheme="minorHAnsi" w:eastAsia="Helvetica 45" w:hAnsiTheme="minorHAnsi" w:cstheme="minorHAnsi"/>
                 <w:i/>
                 <w:sz w:val="20"/>
                 <w:szCs w:val="20"/>
@@ -12630,7 +13263,7 @@
             </w:pPr>
             <w:r>
               <w:rPr>
-                <w:rFonts w:asciiTheme="minorHAnsi" w:eastAsia="helvetica 45" w:hAnsiTheme="minorHAnsi" w:cstheme="minorHAnsi"/>
+                <w:rFonts w:asciiTheme="minorHAnsi" w:eastAsia="Helvetica 45" w:hAnsiTheme="minorHAnsi" w:cstheme="minorHAnsi"/>
                 <w:i/>
                 <w:sz w:val="20"/>
                 <w:szCs w:val="20"/>
@@ -12719,7 +13352,7 @@
             </w:pPr>
             <w:r>
               <w:rPr>
-                <w:rFonts w:asciiTheme="minorHAnsi" w:eastAsia="helvetica 45" w:hAnsiTheme="minorHAnsi" w:cstheme="minorHAnsi"/>
+                <w:rFonts w:asciiTheme="minorHAnsi" w:eastAsia="Helvetica 45" w:hAnsiTheme="minorHAnsi" w:cstheme="minorHAnsi"/>
                 <w:i/>
                 <w:sz w:val="20"/>
                 <w:szCs w:val="20"/>
@@ -12796,14 +13429,14 @@
             <w:pPr>
               <w:cnfStyle w:val="000000000000" w:firstRow="0" w:lastRow="0" w:firstColumn="0" w:lastColumn="0" w:oddVBand="0" w:evenVBand="0" w:oddHBand="0" w:evenHBand="0" w:firstRowFirstColumn="0" w:firstRowLastColumn="0" w:lastRowFirstColumn="0" w:lastRowLastColumn="0"/>
               <w:rPr>
-                <w:rFonts w:asciiTheme="minorHAnsi" w:eastAsia="helvetica 45" w:hAnsiTheme="minorHAnsi" w:cstheme="minorHAnsi"/>
-                <w:sz w:val="20"/>
-                <w:szCs w:val="20"/>
-              </w:rPr>
-            </w:pPr>
-            <w:r>
-              <w:rPr>
-                <w:rFonts w:asciiTheme="minorHAnsi" w:eastAsia="helvetica 45" w:hAnsiTheme="minorHAnsi" w:cstheme="minorHAnsi"/>
+                <w:rFonts w:asciiTheme="minorHAnsi" w:eastAsia="Helvetica 45" w:hAnsiTheme="minorHAnsi" w:cstheme="minorHAnsi"/>
+                <w:sz w:val="20"/>
+                <w:szCs w:val="20"/>
+              </w:rPr>
+            </w:pPr>
+            <w:r>
+              <w:rPr>
+                <w:rFonts w:asciiTheme="minorHAnsi" w:eastAsia="Helvetica 45" w:hAnsiTheme="minorHAnsi" w:cstheme="minorHAnsi"/>
                 <w:i/>
                 <w:sz w:val="20"/>
                 <w:szCs w:val="20"/>
@@ -12879,7 +13512,7 @@
             </w:pPr>
             <w:r>
               <w:rPr>
-                <w:rFonts w:asciiTheme="minorHAnsi" w:eastAsia="helvetica 45" w:hAnsiTheme="minorHAnsi" w:cstheme="minorHAnsi"/>
+                <w:rFonts w:asciiTheme="minorHAnsi" w:eastAsia="Helvetica 45" w:hAnsiTheme="minorHAnsi" w:cstheme="minorHAnsi"/>
                 <w:i/>
                 <w:sz w:val="20"/>
                 <w:szCs w:val="20"/>
@@ -12944,7 +13577,27 @@
                 <w:sz w:val="20"/>
                 <w:szCs w:val="20"/>
               </w:rPr>
-              <w:t>Wildlife Insights“ stellen unidentifizierte Bilddateien zur Verfügung.</w:t>
+              <w:t xml:space="preserve">Wildlife </w:t>
+            </w:r>
+            <w:proofErr w:type="spellStart"/>
+            <w:r>
+              <w:rPr>
+                <w:rFonts w:asciiTheme="minorHAnsi" w:hAnsiTheme="minorHAnsi" w:cstheme="minorHAnsi"/>
+                <w:bCs w:val="0"/>
+                <w:sz w:val="20"/>
+                <w:szCs w:val="20"/>
+              </w:rPr>
+              <w:t>Insights</w:t>
+            </w:r>
+            <w:proofErr w:type="spellEnd"/>
+            <w:r>
+              <w:rPr>
+                <w:rFonts w:asciiTheme="minorHAnsi" w:hAnsiTheme="minorHAnsi" w:cstheme="minorHAnsi"/>
+                <w:bCs w:val="0"/>
+                <w:sz w:val="20"/>
+                <w:szCs w:val="20"/>
+              </w:rPr>
+              <w:t>“ stellen unidentifizierte Bilddateien zur Verfügung.</w:t>
             </w:r>
           </w:p>
         </w:tc>
@@ -12989,7 +13642,7 @@
             </w:pPr>
             <w:r>
               <w:rPr>
-                <w:rFonts w:asciiTheme="minorHAnsi" w:eastAsia="helvetica 45" w:hAnsiTheme="minorHAnsi" w:cstheme="minorHAnsi"/>
+                <w:rFonts w:asciiTheme="minorHAnsi" w:eastAsia="Helvetica 45" w:hAnsiTheme="minorHAnsi" w:cstheme="minorHAnsi"/>
                 <w:i/>
                 <w:sz w:val="20"/>
                 <w:szCs w:val="20"/>
@@ -13065,7 +13718,7 @@
             </w:pPr>
             <w:r>
               <w:rPr>
-                <w:rFonts w:asciiTheme="minorHAnsi" w:eastAsia="helvetica 45" w:hAnsiTheme="minorHAnsi" w:cstheme="minorHAnsi"/>
+                <w:rFonts w:asciiTheme="minorHAnsi" w:eastAsia="Helvetica 45" w:hAnsiTheme="minorHAnsi" w:cstheme="minorHAnsi"/>
                 <w:i/>
                 <w:sz w:val="20"/>
                 <w:szCs w:val="20"/>
@@ -13139,7 +13792,7 @@
             </w:pPr>
             <w:r>
               <w:rPr>
-                <w:rFonts w:asciiTheme="minorHAnsi" w:eastAsia="helvetica 45" w:hAnsiTheme="minorHAnsi" w:cstheme="minorHAnsi"/>
+                <w:rFonts w:asciiTheme="minorHAnsi" w:eastAsia="Helvetica 45" w:hAnsiTheme="minorHAnsi" w:cstheme="minorHAnsi"/>
                 <w:i/>
                 <w:sz w:val="20"/>
                 <w:szCs w:val="20"/>
@@ -13215,7 +13868,7 @@
             </w:pPr>
             <w:r>
               <w:rPr>
-                <w:rFonts w:asciiTheme="minorHAnsi" w:eastAsia="helvetica 45" w:hAnsiTheme="minorHAnsi" w:cstheme="minorHAnsi"/>
+                <w:rFonts w:asciiTheme="minorHAnsi" w:eastAsia="Helvetica 45" w:hAnsiTheme="minorHAnsi" w:cstheme="minorHAnsi"/>
                 <w:i/>
                 <w:sz w:val="20"/>
                 <w:szCs w:val="20"/>
@@ -13335,6 +13988,7 @@
                 <w:szCs w:val="20"/>
               </w:rPr>
             </w:pPr>
+            <w:proofErr w:type="spellStart"/>
             <w:r>
               <w:rPr>
                 <w:rFonts w:asciiTheme="minorHAnsi" w:hAnsiTheme="minorHAnsi" w:cstheme="minorHAnsi"/>
@@ -13342,7 +13996,37 @@
                 <w:sz w:val="20"/>
                 <w:szCs w:val="20"/>
               </w:rPr>
-              <w:t>Protect Our Planet</w:t>
+              <w:t>Protect</w:t>
+            </w:r>
+            <w:proofErr w:type="spellEnd"/>
+            <w:r>
+              <w:rPr>
+                <w:rFonts w:asciiTheme="minorHAnsi" w:hAnsiTheme="minorHAnsi" w:cstheme="minorHAnsi"/>
+                <w:bCs w:val="0"/>
+                <w:sz w:val="20"/>
+                <w:szCs w:val="20"/>
+              </w:rPr>
+              <w:t xml:space="preserve"> </w:t>
+            </w:r>
+            <w:proofErr w:type="spellStart"/>
+            <w:r>
+              <w:rPr>
+                <w:rFonts w:asciiTheme="minorHAnsi" w:hAnsiTheme="minorHAnsi" w:cstheme="minorHAnsi"/>
+                <w:bCs w:val="0"/>
+                <w:sz w:val="20"/>
+                <w:szCs w:val="20"/>
+              </w:rPr>
+              <w:t>Our</w:t>
+            </w:r>
+            <w:proofErr w:type="spellEnd"/>
+            <w:r>
+              <w:rPr>
+                <w:rFonts w:asciiTheme="minorHAnsi" w:hAnsiTheme="minorHAnsi" w:cstheme="minorHAnsi"/>
+                <w:bCs w:val="0"/>
+                <w:sz w:val="20"/>
+                <w:szCs w:val="20"/>
+              </w:rPr>
+              <w:t xml:space="preserve"> Planet</w:t>
             </w:r>
           </w:p>
         </w:tc>
@@ -13383,14 +14067,14 @@
             <w:pPr>
               <w:cnfStyle w:val="000000100000" w:firstRow="0" w:lastRow="0" w:firstColumn="0" w:lastColumn="0" w:oddVBand="0" w:evenVBand="0" w:oddHBand="1" w:evenHBand="0" w:firstRowFirstColumn="0" w:firstRowLastColumn="0" w:lastRowFirstColumn="0" w:lastRowLastColumn="0"/>
               <w:rPr>
-                <w:rFonts w:asciiTheme="minorHAnsi" w:eastAsia="helvetica 45" w:hAnsiTheme="minorHAnsi" w:cstheme="minorHAnsi"/>
-                <w:sz w:val="20"/>
-                <w:szCs w:val="20"/>
-              </w:rPr>
-            </w:pPr>
-            <w:r>
-              <w:rPr>
-                <w:rFonts w:asciiTheme="minorHAnsi" w:eastAsia="helvetica 45" w:hAnsiTheme="minorHAnsi" w:cstheme="minorHAnsi"/>
+                <w:rFonts w:asciiTheme="minorHAnsi" w:eastAsia="Helvetica 45" w:hAnsiTheme="minorHAnsi" w:cstheme="minorHAnsi"/>
+                <w:sz w:val="20"/>
+                <w:szCs w:val="20"/>
+              </w:rPr>
+            </w:pPr>
+            <w:r>
+              <w:rPr>
+                <w:rFonts w:asciiTheme="minorHAnsi" w:eastAsia="Helvetica 45" w:hAnsiTheme="minorHAnsi" w:cstheme="minorHAnsi"/>
                 <w:i/>
                 <w:sz w:val="20"/>
                 <w:szCs w:val="20"/>
@@ -13402,7 +14086,7 @@
             <w:pPr>
               <w:cnfStyle w:val="000000100000" w:firstRow="0" w:lastRow="0" w:firstColumn="0" w:lastColumn="0" w:oddVBand="0" w:evenVBand="0" w:oddHBand="1" w:evenHBand="0" w:firstRowFirstColumn="0" w:firstRowLastColumn="0" w:lastRowFirstColumn="0" w:lastRowLastColumn="0"/>
               <w:rPr>
-                <w:rFonts w:asciiTheme="minorHAnsi" w:eastAsia="helvetica 45" w:hAnsiTheme="minorHAnsi" w:cstheme="minorHAnsi"/>
+                <w:rFonts w:asciiTheme="minorHAnsi" w:eastAsia="Helvetica 45" w:hAnsiTheme="minorHAnsi" w:cstheme="minorHAnsi"/>
                 <w:sz w:val="20"/>
                 <w:szCs w:val="20"/>
               </w:rPr>
@@ -13412,7 +14096,7 @@
             <w:pPr>
               <w:cnfStyle w:val="000000100000" w:firstRow="0" w:lastRow="0" w:firstColumn="0" w:lastColumn="0" w:oddVBand="0" w:evenVBand="0" w:oddHBand="1" w:evenHBand="0" w:firstRowFirstColumn="0" w:firstRowLastColumn="0" w:lastRowFirstColumn="0" w:lastRowLastColumn="0"/>
               <w:rPr>
-                <w:rFonts w:asciiTheme="minorHAnsi" w:eastAsia="helvetica 45" w:hAnsiTheme="minorHAnsi" w:cstheme="minorHAnsi"/>
+                <w:rFonts w:asciiTheme="minorHAnsi" w:eastAsia="Helvetica 45" w:hAnsiTheme="minorHAnsi" w:cstheme="minorHAnsi"/>
                 <w:i/>
                 <w:sz w:val="20"/>
                 <w:szCs w:val="20"/>
@@ -13420,7 +14104,7 @@
             </w:pPr>
             <w:r>
               <w:rPr>
-                <w:rFonts w:asciiTheme="minorHAnsi" w:eastAsia="helvetica 45" w:hAnsiTheme="minorHAnsi" w:cstheme="minorHAnsi"/>
+                <w:rFonts w:asciiTheme="minorHAnsi" w:eastAsia="Helvetica 45" w:hAnsiTheme="minorHAnsi" w:cstheme="minorHAnsi"/>
                 <w:i/>
                 <w:sz w:val="20"/>
                 <w:szCs w:val="20"/>
@@ -13479,7 +14163,7 @@
             </w:pPr>
             <w:r>
               <w:rPr>
-                <w:rFonts w:asciiTheme="minorHAnsi" w:eastAsia="helvetica 45" w:hAnsiTheme="minorHAnsi" w:cstheme="minorHAnsi"/>
+                <w:rFonts w:asciiTheme="minorHAnsi" w:eastAsia="Helvetica 45" w:hAnsiTheme="minorHAnsi" w:cstheme="minorHAnsi"/>
                 <w:i/>
                 <w:sz w:val="20"/>
                 <w:szCs w:val="20"/>
@@ -13563,14 +14247,14 @@
             <w:pPr>
               <w:cnfStyle w:val="000000000000" w:firstRow="0" w:lastRow="0" w:firstColumn="0" w:lastColumn="0" w:oddVBand="0" w:evenVBand="0" w:oddHBand="0" w:evenHBand="0" w:firstRowFirstColumn="0" w:firstRowLastColumn="0" w:lastRowFirstColumn="0" w:lastRowLastColumn="0"/>
               <w:rPr>
-                <w:rFonts w:asciiTheme="minorHAnsi" w:eastAsia="helvetica 45" w:hAnsiTheme="minorHAnsi" w:cstheme="minorHAnsi"/>
-                <w:sz w:val="20"/>
-                <w:szCs w:val="20"/>
-              </w:rPr>
-            </w:pPr>
-            <w:r>
-              <w:rPr>
-                <w:rFonts w:asciiTheme="minorHAnsi" w:eastAsia="helvetica 45" w:hAnsiTheme="minorHAnsi" w:cstheme="minorHAnsi"/>
+                <w:rFonts w:asciiTheme="minorHAnsi" w:eastAsia="Helvetica 45" w:hAnsiTheme="minorHAnsi" w:cstheme="minorHAnsi"/>
+                <w:sz w:val="20"/>
+                <w:szCs w:val="20"/>
+              </w:rPr>
+            </w:pPr>
+            <w:r>
+              <w:rPr>
+                <w:rFonts w:asciiTheme="minorHAnsi" w:eastAsia="Helvetica 45" w:hAnsiTheme="minorHAnsi" w:cstheme="minorHAnsi"/>
                 <w:i/>
                 <w:sz w:val="20"/>
                 <w:szCs w:val="20"/>
@@ -13646,7 +14330,7 @@
             </w:pPr>
             <w:r>
               <w:rPr>
-                <w:rFonts w:asciiTheme="minorHAnsi" w:eastAsia="helvetica 45" w:hAnsiTheme="minorHAnsi" w:cstheme="minorHAnsi"/>
+                <w:rFonts w:asciiTheme="minorHAnsi" w:eastAsia="Helvetica 45" w:hAnsiTheme="minorHAnsi" w:cstheme="minorHAnsi"/>
                 <w:i/>
                 <w:sz w:val="20"/>
                 <w:szCs w:val="20"/>
@@ -13719,7 +14403,7 @@
             </w:pPr>
             <w:r>
               <w:rPr>
-                <w:rFonts w:asciiTheme="minorHAnsi" w:eastAsia="helvetica 45" w:hAnsiTheme="minorHAnsi" w:cstheme="minorHAnsi"/>
+                <w:rFonts w:asciiTheme="minorHAnsi" w:eastAsia="Helvetica 45" w:hAnsiTheme="minorHAnsi" w:cstheme="minorHAnsi"/>
                 <w:i/>
                 <w:sz w:val="20"/>
                 <w:szCs w:val="20"/>
@@ -13815,7 +14499,7 @@
             </w:pPr>
             <w:r>
               <w:rPr>
-                <w:rFonts w:asciiTheme="minorHAnsi" w:eastAsia="helvetica 45" w:hAnsiTheme="minorHAnsi" w:cstheme="minorHAnsi"/>
+                <w:rFonts w:asciiTheme="minorHAnsi" w:eastAsia="Helvetica 45" w:hAnsiTheme="minorHAnsi" w:cstheme="minorHAnsi"/>
                 <w:i/>
                 <w:sz w:val="20"/>
                 <w:szCs w:val="20"/>
@@ -13889,7 +14573,7 @@
             </w:pPr>
             <w:r>
               <w:rPr>
-                <w:rFonts w:asciiTheme="minorHAnsi" w:eastAsia="helvetica 45" w:hAnsiTheme="minorHAnsi" w:cstheme="minorHAnsi"/>
+                <w:rFonts w:asciiTheme="minorHAnsi" w:eastAsia="Helvetica 45" w:hAnsiTheme="minorHAnsi" w:cstheme="minorHAnsi"/>
                 <w:i/>
                 <w:sz w:val="20"/>
                 <w:szCs w:val="20"/>
@@ -13965,7 +14649,7 @@
             </w:pPr>
             <w:r>
               <w:rPr>
-                <w:rFonts w:asciiTheme="minorHAnsi" w:eastAsia="helvetica 45" w:hAnsiTheme="minorHAnsi" w:cstheme="minorHAnsi"/>
+                <w:rFonts w:asciiTheme="minorHAnsi" w:eastAsia="Helvetica 45" w:hAnsiTheme="minorHAnsi" w:cstheme="minorHAnsi"/>
                 <w:i/>
                 <w:sz w:val="20"/>
                 <w:szCs w:val="20"/>
@@ -14098,6 +14782,7 @@
                 <w:szCs w:val="20"/>
               </w:rPr>
             </w:pPr>
+            <w:proofErr w:type="spellStart"/>
             <w:r>
               <w:rPr>
                 <w:rFonts w:asciiTheme="minorHAnsi" w:hAnsiTheme="minorHAnsi" w:cstheme="minorHAnsi"/>
@@ -14107,6 +14792,7 @@
               </w:rPr>
               <w:t>Akinator</w:t>
             </w:r>
+            <w:proofErr w:type="spellEnd"/>
           </w:p>
         </w:tc>
       </w:tr>
@@ -14146,14 +14832,14 @@
             <w:pPr>
               <w:cnfStyle w:val="000000100000" w:firstRow="0" w:lastRow="0" w:firstColumn="0" w:lastColumn="0" w:oddVBand="0" w:evenVBand="0" w:oddHBand="1" w:evenHBand="0" w:firstRowFirstColumn="0" w:firstRowLastColumn="0" w:lastRowFirstColumn="0" w:lastRowLastColumn="0"/>
               <w:rPr>
-                <w:rFonts w:asciiTheme="minorHAnsi" w:eastAsia="helvetica 45" w:hAnsiTheme="minorHAnsi" w:cstheme="minorHAnsi"/>
-                <w:sz w:val="20"/>
-                <w:szCs w:val="20"/>
-              </w:rPr>
-            </w:pPr>
-            <w:r>
-              <w:rPr>
-                <w:rFonts w:asciiTheme="minorHAnsi" w:eastAsia="helvetica 45" w:hAnsiTheme="minorHAnsi" w:cstheme="minorHAnsi"/>
+                <w:rFonts w:asciiTheme="minorHAnsi" w:eastAsia="Helvetica 45" w:hAnsiTheme="minorHAnsi" w:cstheme="minorHAnsi"/>
+                <w:sz w:val="20"/>
+                <w:szCs w:val="20"/>
+              </w:rPr>
+            </w:pPr>
+            <w:r>
+              <w:rPr>
+                <w:rFonts w:asciiTheme="minorHAnsi" w:eastAsia="Helvetica 45" w:hAnsiTheme="minorHAnsi" w:cstheme="minorHAnsi"/>
                 <w:i/>
                 <w:sz w:val="20"/>
                 <w:szCs w:val="20"/>
@@ -14165,7 +14851,7 @@
             <w:pPr>
               <w:cnfStyle w:val="000000100000" w:firstRow="0" w:lastRow="0" w:firstColumn="0" w:lastColumn="0" w:oddVBand="0" w:evenVBand="0" w:oddHBand="1" w:evenHBand="0" w:firstRowFirstColumn="0" w:firstRowLastColumn="0" w:lastRowFirstColumn="0" w:lastRowLastColumn="0"/>
               <w:rPr>
-                <w:rFonts w:asciiTheme="minorHAnsi" w:eastAsia="helvetica 45" w:hAnsiTheme="minorHAnsi" w:cstheme="minorHAnsi"/>
+                <w:rFonts w:asciiTheme="minorHAnsi" w:eastAsia="Helvetica 45" w:hAnsiTheme="minorHAnsi" w:cstheme="minorHAnsi"/>
                 <w:sz w:val="20"/>
                 <w:szCs w:val="20"/>
               </w:rPr>
@@ -14175,7 +14861,7 @@
             <w:pPr>
               <w:cnfStyle w:val="000000100000" w:firstRow="0" w:lastRow="0" w:firstColumn="0" w:lastColumn="0" w:oddVBand="0" w:evenVBand="0" w:oddHBand="1" w:evenHBand="0" w:firstRowFirstColumn="0" w:firstRowLastColumn="0" w:lastRowFirstColumn="0" w:lastRowLastColumn="0"/>
               <w:rPr>
-                <w:rFonts w:asciiTheme="minorHAnsi" w:eastAsia="helvetica 45" w:hAnsiTheme="minorHAnsi" w:cstheme="minorHAnsi"/>
+                <w:rFonts w:asciiTheme="minorHAnsi" w:eastAsia="Helvetica 45" w:hAnsiTheme="minorHAnsi" w:cstheme="minorHAnsi"/>
                 <w:i/>
                 <w:sz w:val="20"/>
                 <w:szCs w:val="20"/>
@@ -14183,7 +14869,7 @@
             </w:pPr>
             <w:r>
               <w:rPr>
-                <w:rFonts w:asciiTheme="minorHAnsi" w:eastAsia="helvetica 45" w:hAnsiTheme="minorHAnsi" w:cstheme="minorHAnsi"/>
+                <w:rFonts w:asciiTheme="minorHAnsi" w:eastAsia="Helvetica 45" w:hAnsiTheme="minorHAnsi" w:cstheme="minorHAnsi"/>
                 <w:i/>
                 <w:sz w:val="20"/>
                 <w:szCs w:val="20"/>
@@ -14212,7 +14898,7 @@
             </w:pPr>
             <w:r>
               <w:rPr>
-                <w:rFonts w:asciiTheme="minorHAnsi" w:eastAsia="helvetica 45" w:hAnsiTheme="minorHAnsi" w:cstheme="minorHAnsi"/>
+                <w:rFonts w:asciiTheme="minorHAnsi" w:eastAsia="Helvetica 45" w:hAnsiTheme="minorHAnsi" w:cstheme="minorHAnsi"/>
                 <w:i/>
                 <w:sz w:val="20"/>
                 <w:szCs w:val="20"/>
@@ -14278,14 +14964,14 @@
             <w:pPr>
               <w:cnfStyle w:val="000000000000" w:firstRow="0" w:lastRow="0" w:firstColumn="0" w:lastColumn="0" w:oddVBand="0" w:evenVBand="0" w:oddHBand="0" w:evenHBand="0" w:firstRowFirstColumn="0" w:firstRowLastColumn="0" w:lastRowFirstColumn="0" w:lastRowLastColumn="0"/>
               <w:rPr>
-                <w:rFonts w:asciiTheme="minorHAnsi" w:eastAsia="helvetica 45" w:hAnsiTheme="minorHAnsi" w:cstheme="minorHAnsi"/>
-                <w:sz w:val="20"/>
-                <w:szCs w:val="20"/>
-              </w:rPr>
-            </w:pPr>
-            <w:r>
-              <w:rPr>
-                <w:rFonts w:asciiTheme="minorHAnsi" w:eastAsia="helvetica 45" w:hAnsiTheme="minorHAnsi" w:cstheme="minorHAnsi"/>
+                <w:rFonts w:asciiTheme="minorHAnsi" w:eastAsia="Helvetica 45" w:hAnsiTheme="minorHAnsi" w:cstheme="minorHAnsi"/>
+                <w:sz w:val="20"/>
+                <w:szCs w:val="20"/>
+              </w:rPr>
+            </w:pPr>
+            <w:r>
+              <w:rPr>
+                <w:rFonts w:asciiTheme="minorHAnsi" w:eastAsia="Helvetica 45" w:hAnsiTheme="minorHAnsi" w:cstheme="minorHAnsi"/>
                 <w:i/>
                 <w:sz w:val="20"/>
                 <w:szCs w:val="20"/>
@@ -14313,8 +14999,18 @@
                 <w:sz w:val="20"/>
                 <w:szCs w:val="20"/>
               </w:rPr>
-              <w:t>Internetplattform, AppStore</w:t>
-            </w:r>
+              <w:t xml:space="preserve">Internetplattform, </w:t>
+            </w:r>
+            <w:proofErr w:type="spellStart"/>
+            <w:r>
+              <w:rPr>
+                <w:rFonts w:asciiTheme="minorHAnsi" w:hAnsiTheme="minorHAnsi" w:cstheme="minorHAnsi"/>
+                <w:sz w:val="20"/>
+                <w:szCs w:val="20"/>
+              </w:rPr>
+              <w:t>AppStore</w:t>
+            </w:r>
+            <w:proofErr w:type="spellEnd"/>
           </w:p>
         </w:tc>
       </w:tr>
@@ -14361,7 +15057,7 @@
             </w:pPr>
             <w:r>
               <w:rPr>
-                <w:rFonts w:asciiTheme="minorHAnsi" w:eastAsia="helvetica 45" w:hAnsiTheme="minorHAnsi" w:cstheme="minorHAnsi"/>
+                <w:rFonts w:asciiTheme="minorHAnsi" w:eastAsia="Helvetica 45" w:hAnsiTheme="minorHAnsi" w:cstheme="minorHAnsi"/>
                 <w:i/>
                 <w:sz w:val="20"/>
                 <w:szCs w:val="20"/>
@@ -14389,7 +15085,25 @@
                 <w:sz w:val="20"/>
                 <w:szCs w:val="20"/>
               </w:rPr>
-              <w:t>Für das Erkennen der zur Rede stehenden Figur oder Person benötigt die KI Daten der bereits erfolgreichen Spielpartien, denn diese KI lernt mit jedem Spiel und dem Feedback durch die Nutzenden weiter.</w:t>
+              <w:t xml:space="preserve">Für das Erkennen der zur Rede stehenden Figur oder Person benötigt die </w:t>
+            </w:r>
+            <w:proofErr w:type="gramStart"/>
+            <w:r>
+              <w:rPr>
+                <w:rFonts w:asciiTheme="minorHAnsi" w:hAnsiTheme="minorHAnsi" w:cstheme="minorHAnsi"/>
+                <w:sz w:val="20"/>
+                <w:szCs w:val="20"/>
+              </w:rPr>
+              <w:t>KI Daten</w:t>
+            </w:r>
+            <w:proofErr w:type="gramEnd"/>
+            <w:r>
+              <w:rPr>
+                <w:rFonts w:asciiTheme="minorHAnsi" w:hAnsiTheme="minorHAnsi" w:cstheme="minorHAnsi"/>
+                <w:sz w:val="20"/>
+                <w:szCs w:val="20"/>
+              </w:rPr>
+              <w:t xml:space="preserve"> der bereits erfolgreichen Spielpartien, denn diese KI lernt mit jedem Spiel und dem Feedback durch die Nutzenden weiter.</w:t>
             </w:r>
           </w:p>
           <w:p>
@@ -14462,7 +15176,7 @@
             </w:pPr>
             <w:r>
               <w:rPr>
-                <w:rFonts w:asciiTheme="minorHAnsi" w:eastAsia="helvetica 45" w:hAnsiTheme="minorHAnsi" w:cstheme="minorHAnsi"/>
+                <w:rFonts w:asciiTheme="minorHAnsi" w:eastAsia="Helvetica 45" w:hAnsiTheme="minorHAnsi" w:cstheme="minorHAnsi"/>
                 <w:i/>
                 <w:sz w:val="20"/>
                 <w:szCs w:val="20"/>
@@ -14538,7 +15252,7 @@
             </w:pPr>
             <w:r>
               <w:rPr>
-                <w:rFonts w:asciiTheme="minorHAnsi" w:eastAsia="helvetica 45" w:hAnsiTheme="minorHAnsi" w:cstheme="minorHAnsi"/>
+                <w:rFonts w:asciiTheme="minorHAnsi" w:eastAsia="Helvetica 45" w:hAnsiTheme="minorHAnsi" w:cstheme="minorHAnsi"/>
                 <w:i/>
                 <w:sz w:val="20"/>
                 <w:szCs w:val="20"/>
@@ -14612,7 +15326,7 @@
             </w:pPr>
             <w:r>
               <w:rPr>
-                <w:rFonts w:asciiTheme="minorHAnsi" w:eastAsia="helvetica 45" w:hAnsiTheme="minorHAnsi" w:cstheme="minorHAnsi"/>
+                <w:rFonts w:asciiTheme="minorHAnsi" w:eastAsia="Helvetica 45" w:hAnsiTheme="minorHAnsi" w:cstheme="minorHAnsi"/>
                 <w:i/>
                 <w:sz w:val="20"/>
                 <w:szCs w:val="20"/>
@@ -14688,7 +15402,7 @@
             </w:pPr>
             <w:r>
               <w:rPr>
-                <w:rFonts w:asciiTheme="minorHAnsi" w:eastAsia="helvetica 45" w:hAnsiTheme="minorHAnsi" w:cstheme="minorHAnsi"/>
+                <w:rFonts w:asciiTheme="minorHAnsi" w:eastAsia="Helvetica 45" w:hAnsiTheme="minorHAnsi" w:cstheme="minorHAnsi"/>
                 <w:i/>
                 <w:sz w:val="20"/>
                 <w:szCs w:val="20"/>
@@ -14856,14 +15570,14 @@
             <w:pPr>
               <w:cnfStyle w:val="000000100000" w:firstRow="0" w:lastRow="0" w:firstColumn="0" w:lastColumn="0" w:oddVBand="0" w:evenVBand="0" w:oddHBand="1" w:evenHBand="0" w:firstRowFirstColumn="0" w:firstRowLastColumn="0" w:lastRowFirstColumn="0" w:lastRowLastColumn="0"/>
               <w:rPr>
-                <w:rFonts w:asciiTheme="minorHAnsi" w:eastAsia="helvetica 45" w:hAnsiTheme="minorHAnsi" w:cstheme="minorHAnsi"/>
-                <w:sz w:val="20"/>
-                <w:szCs w:val="20"/>
-              </w:rPr>
-            </w:pPr>
-            <w:r>
-              <w:rPr>
-                <w:rFonts w:asciiTheme="minorHAnsi" w:eastAsia="helvetica 45" w:hAnsiTheme="minorHAnsi" w:cstheme="minorHAnsi"/>
+                <w:rFonts w:asciiTheme="minorHAnsi" w:eastAsia="Helvetica 45" w:hAnsiTheme="minorHAnsi" w:cstheme="minorHAnsi"/>
+                <w:sz w:val="20"/>
+                <w:szCs w:val="20"/>
+              </w:rPr>
+            </w:pPr>
+            <w:r>
+              <w:rPr>
+                <w:rFonts w:asciiTheme="minorHAnsi" w:eastAsia="Helvetica 45" w:hAnsiTheme="minorHAnsi" w:cstheme="minorHAnsi"/>
                 <w:i/>
                 <w:sz w:val="20"/>
                 <w:szCs w:val="20"/>
@@ -14875,7 +15589,7 @@
             <w:pPr>
               <w:cnfStyle w:val="000000100000" w:firstRow="0" w:lastRow="0" w:firstColumn="0" w:lastColumn="0" w:oddVBand="0" w:evenVBand="0" w:oddHBand="1" w:evenHBand="0" w:firstRowFirstColumn="0" w:firstRowLastColumn="0" w:lastRowFirstColumn="0" w:lastRowLastColumn="0"/>
               <w:rPr>
-                <w:rFonts w:asciiTheme="minorHAnsi" w:eastAsia="helvetica 45" w:hAnsiTheme="minorHAnsi" w:cstheme="minorHAnsi"/>
+                <w:rFonts w:asciiTheme="minorHAnsi" w:eastAsia="Helvetica 45" w:hAnsiTheme="minorHAnsi" w:cstheme="minorHAnsi"/>
                 <w:sz w:val="20"/>
                 <w:szCs w:val="20"/>
               </w:rPr>
@@ -14885,7 +15599,7 @@
             <w:pPr>
               <w:cnfStyle w:val="000000100000" w:firstRow="0" w:lastRow="0" w:firstColumn="0" w:lastColumn="0" w:oddVBand="0" w:evenVBand="0" w:oddHBand="1" w:evenHBand="0" w:firstRowFirstColumn="0" w:firstRowLastColumn="0" w:lastRowFirstColumn="0" w:lastRowLastColumn="0"/>
               <w:rPr>
-                <w:rFonts w:asciiTheme="minorHAnsi" w:eastAsia="helvetica 45" w:hAnsiTheme="minorHAnsi" w:cstheme="minorHAnsi"/>
+                <w:rFonts w:asciiTheme="minorHAnsi" w:eastAsia="Helvetica 45" w:hAnsiTheme="minorHAnsi" w:cstheme="minorHAnsi"/>
                 <w:i/>
                 <w:sz w:val="20"/>
                 <w:szCs w:val="20"/>
@@ -14893,7 +15607,7 @@
             </w:pPr>
             <w:r>
               <w:rPr>
-                <w:rFonts w:asciiTheme="minorHAnsi" w:eastAsia="helvetica 45" w:hAnsiTheme="minorHAnsi" w:cstheme="minorHAnsi"/>
+                <w:rFonts w:asciiTheme="minorHAnsi" w:eastAsia="Helvetica 45" w:hAnsiTheme="minorHAnsi" w:cstheme="minorHAnsi"/>
                 <w:i/>
                 <w:sz w:val="20"/>
                 <w:szCs w:val="20"/>
@@ -14922,7 +15636,7 @@
             </w:pPr>
             <w:r>
               <w:rPr>
-                <w:rFonts w:asciiTheme="minorHAnsi" w:eastAsia="helvetica 45" w:hAnsiTheme="minorHAnsi" w:cstheme="minorHAnsi"/>
+                <w:rFonts w:asciiTheme="minorHAnsi" w:eastAsia="Helvetica 45" w:hAnsiTheme="minorHAnsi" w:cstheme="minorHAnsi"/>
                 <w:i/>
                 <w:sz w:val="20"/>
                 <w:szCs w:val="20"/>
@@ -14978,8 +15692,18 @@
                 <w:sz w:val="20"/>
                 <w:szCs w:val="20"/>
               </w:rPr>
-              <w:t>Diese KI übernimmt die Aufgabe einer Psychotherapeutin bzw. eines Psychotherapeuts</w:t>
-            </w:r>
+              <w:t xml:space="preserve">Diese KI übernimmt die Aufgabe einer Psychotherapeutin bzw. eines </w:t>
+            </w:r>
+            <w:proofErr w:type="spellStart"/>
+            <w:r>
+              <w:rPr>
+                <w:rFonts w:asciiTheme="minorHAnsi" w:hAnsiTheme="minorHAnsi" w:cstheme="minorHAnsi"/>
+                <w:sz w:val="20"/>
+                <w:szCs w:val="20"/>
+              </w:rPr>
+              <w:t>Psychotherapeuts</w:t>
+            </w:r>
+            <w:proofErr w:type="spellEnd"/>
           </w:p>
         </w:tc>
       </w:tr>
@@ -15016,14 +15740,14 @@
             <w:pPr>
               <w:cnfStyle w:val="000000000000" w:firstRow="0" w:lastRow="0" w:firstColumn="0" w:lastColumn="0" w:oddVBand="0" w:evenVBand="0" w:oddHBand="0" w:evenHBand="0" w:firstRowFirstColumn="0" w:firstRowLastColumn="0" w:lastRowFirstColumn="0" w:lastRowLastColumn="0"/>
               <w:rPr>
-                <w:rFonts w:asciiTheme="minorHAnsi" w:eastAsia="helvetica 45" w:hAnsiTheme="minorHAnsi" w:cstheme="minorHAnsi"/>
-                <w:sz w:val="20"/>
-                <w:szCs w:val="20"/>
-              </w:rPr>
-            </w:pPr>
-            <w:r>
-              <w:rPr>
-                <w:rFonts w:asciiTheme="minorHAnsi" w:eastAsia="helvetica 45" w:hAnsiTheme="minorHAnsi" w:cstheme="minorHAnsi"/>
+                <w:rFonts w:asciiTheme="minorHAnsi" w:eastAsia="Helvetica 45" w:hAnsiTheme="minorHAnsi" w:cstheme="minorHAnsi"/>
+                <w:sz w:val="20"/>
+                <w:szCs w:val="20"/>
+              </w:rPr>
+            </w:pPr>
+            <w:r>
+              <w:rPr>
+                <w:rFonts w:asciiTheme="minorHAnsi" w:eastAsia="Helvetica 45" w:hAnsiTheme="minorHAnsi" w:cstheme="minorHAnsi"/>
                 <w:i/>
                 <w:sz w:val="20"/>
                 <w:szCs w:val="20"/>
@@ -15099,7 +15823,7 @@
             </w:pPr>
             <w:r>
               <w:rPr>
-                <w:rFonts w:asciiTheme="minorHAnsi" w:eastAsia="helvetica 45" w:hAnsiTheme="minorHAnsi" w:cstheme="minorHAnsi"/>
+                <w:rFonts w:asciiTheme="minorHAnsi" w:eastAsia="Helvetica 45" w:hAnsiTheme="minorHAnsi" w:cstheme="minorHAnsi"/>
                 <w:i/>
                 <w:sz w:val="20"/>
                 <w:szCs w:val="20"/>
@@ -15200,7 +15924,7 @@
             </w:pPr>
             <w:r>
               <w:rPr>
-                <w:rFonts w:asciiTheme="minorHAnsi" w:eastAsia="helvetica 45" w:hAnsiTheme="minorHAnsi" w:cstheme="minorHAnsi"/>
+                <w:rFonts w:asciiTheme="minorHAnsi" w:eastAsia="Helvetica 45" w:hAnsiTheme="minorHAnsi" w:cstheme="minorHAnsi"/>
                 <w:i/>
                 <w:sz w:val="20"/>
                 <w:szCs w:val="20"/>
@@ -15276,7 +16000,7 @@
             </w:pPr>
             <w:r>
               <w:rPr>
-                <w:rFonts w:asciiTheme="minorHAnsi" w:eastAsia="helvetica 45" w:hAnsiTheme="minorHAnsi" w:cstheme="minorHAnsi"/>
+                <w:rFonts w:asciiTheme="minorHAnsi" w:eastAsia="Helvetica 45" w:hAnsiTheme="minorHAnsi" w:cstheme="minorHAnsi"/>
                 <w:i/>
                 <w:sz w:val="20"/>
                 <w:szCs w:val="20"/>
@@ -15350,7 +16074,7 @@
             </w:pPr>
             <w:r>
               <w:rPr>
-                <w:rFonts w:asciiTheme="minorHAnsi" w:eastAsia="helvetica 45" w:hAnsiTheme="minorHAnsi" w:cstheme="minorHAnsi"/>
+                <w:rFonts w:asciiTheme="minorHAnsi" w:eastAsia="Helvetica 45" w:hAnsiTheme="minorHAnsi" w:cstheme="minorHAnsi"/>
                 <w:i/>
                 <w:sz w:val="20"/>
                 <w:szCs w:val="20"/>
@@ -15426,7 +16150,7 @@
             </w:pPr>
             <w:r>
               <w:rPr>
-                <w:rFonts w:asciiTheme="minorHAnsi" w:eastAsia="helvetica 45" w:hAnsiTheme="minorHAnsi" w:cstheme="minorHAnsi"/>
+                <w:rFonts w:asciiTheme="minorHAnsi" w:eastAsia="Helvetica 45" w:hAnsiTheme="minorHAnsi" w:cstheme="minorHAnsi"/>
                 <w:i/>
                 <w:sz w:val="20"/>
                 <w:szCs w:val="20"/>
@@ -15546,6 +16270,7 @@
                 <w:szCs w:val="20"/>
               </w:rPr>
             </w:pPr>
+            <w:proofErr w:type="spellStart"/>
             <w:r>
               <w:rPr>
                 <w:rFonts w:asciiTheme="minorHAnsi" w:hAnsiTheme="minorHAnsi" w:cstheme="minorHAnsi"/>
@@ -15555,6 +16280,7 @@
               </w:rPr>
               <w:t>DeepL</w:t>
             </w:r>
+            <w:proofErr w:type="spellEnd"/>
           </w:p>
         </w:tc>
       </w:tr>
@@ -15594,14 +16320,14 @@
             <w:pPr>
               <w:cnfStyle w:val="000000100000" w:firstRow="0" w:lastRow="0" w:firstColumn="0" w:lastColumn="0" w:oddVBand="0" w:evenVBand="0" w:oddHBand="1" w:evenHBand="0" w:firstRowFirstColumn="0" w:firstRowLastColumn="0" w:lastRowFirstColumn="0" w:lastRowLastColumn="0"/>
               <w:rPr>
-                <w:rFonts w:asciiTheme="minorHAnsi" w:eastAsia="helvetica 45" w:hAnsiTheme="minorHAnsi" w:cstheme="minorHAnsi"/>
-                <w:sz w:val="20"/>
-                <w:szCs w:val="20"/>
-              </w:rPr>
-            </w:pPr>
-            <w:r>
-              <w:rPr>
-                <w:rFonts w:asciiTheme="minorHAnsi" w:eastAsia="helvetica 45" w:hAnsiTheme="minorHAnsi" w:cstheme="minorHAnsi"/>
+                <w:rFonts w:asciiTheme="minorHAnsi" w:eastAsia="Helvetica 45" w:hAnsiTheme="minorHAnsi" w:cstheme="minorHAnsi"/>
+                <w:sz w:val="20"/>
+                <w:szCs w:val="20"/>
+              </w:rPr>
+            </w:pPr>
+            <w:r>
+              <w:rPr>
+                <w:rFonts w:asciiTheme="minorHAnsi" w:eastAsia="Helvetica 45" w:hAnsiTheme="minorHAnsi" w:cstheme="minorHAnsi"/>
                 <w:i/>
                 <w:sz w:val="20"/>
                 <w:szCs w:val="20"/>
@@ -15613,7 +16339,7 @@
             <w:pPr>
               <w:cnfStyle w:val="000000100000" w:firstRow="0" w:lastRow="0" w:firstColumn="0" w:lastColumn="0" w:oddVBand="0" w:evenVBand="0" w:oddHBand="1" w:evenHBand="0" w:firstRowFirstColumn="0" w:firstRowLastColumn="0" w:lastRowFirstColumn="0" w:lastRowLastColumn="0"/>
               <w:rPr>
-                <w:rFonts w:asciiTheme="minorHAnsi" w:eastAsia="helvetica 45" w:hAnsiTheme="minorHAnsi" w:cstheme="minorHAnsi"/>
+                <w:rFonts w:asciiTheme="minorHAnsi" w:eastAsia="Helvetica 45" w:hAnsiTheme="minorHAnsi" w:cstheme="minorHAnsi"/>
                 <w:sz w:val="20"/>
                 <w:szCs w:val="20"/>
               </w:rPr>
@@ -15623,7 +16349,7 @@
             <w:pPr>
               <w:cnfStyle w:val="000000100000" w:firstRow="0" w:lastRow="0" w:firstColumn="0" w:lastColumn="0" w:oddVBand="0" w:evenVBand="0" w:oddHBand="1" w:evenHBand="0" w:firstRowFirstColumn="0" w:firstRowLastColumn="0" w:lastRowFirstColumn="0" w:lastRowLastColumn="0"/>
               <w:rPr>
-                <w:rFonts w:asciiTheme="minorHAnsi" w:eastAsia="helvetica 45" w:hAnsiTheme="minorHAnsi" w:cstheme="minorHAnsi"/>
+                <w:rFonts w:asciiTheme="minorHAnsi" w:eastAsia="Helvetica 45" w:hAnsiTheme="minorHAnsi" w:cstheme="minorHAnsi"/>
                 <w:i/>
                 <w:sz w:val="20"/>
                 <w:szCs w:val="20"/>
@@ -15631,7 +16357,7 @@
             </w:pPr>
             <w:r>
               <w:rPr>
-                <w:rFonts w:asciiTheme="minorHAnsi" w:eastAsia="helvetica 45" w:hAnsiTheme="minorHAnsi" w:cstheme="minorHAnsi"/>
+                <w:rFonts w:asciiTheme="minorHAnsi" w:eastAsia="Helvetica 45" w:hAnsiTheme="minorHAnsi" w:cstheme="minorHAnsi"/>
                 <w:i/>
                 <w:sz w:val="20"/>
                 <w:szCs w:val="20"/>
@@ -15660,7 +16386,7 @@
             </w:pPr>
             <w:r>
               <w:rPr>
-                <w:rFonts w:asciiTheme="minorHAnsi" w:eastAsia="helvetica 45" w:hAnsiTheme="minorHAnsi" w:cstheme="minorHAnsi"/>
+                <w:rFonts w:asciiTheme="minorHAnsi" w:eastAsia="Helvetica 45" w:hAnsiTheme="minorHAnsi" w:cstheme="minorHAnsi"/>
                 <w:i/>
                 <w:sz w:val="20"/>
                 <w:szCs w:val="20"/>
@@ -15754,14 +16480,14 @@
             <w:pPr>
               <w:cnfStyle w:val="000000000000" w:firstRow="0" w:lastRow="0" w:firstColumn="0" w:lastColumn="0" w:oddVBand="0" w:evenVBand="0" w:oddHBand="0" w:evenHBand="0" w:firstRowFirstColumn="0" w:firstRowLastColumn="0" w:lastRowFirstColumn="0" w:lastRowLastColumn="0"/>
               <w:rPr>
-                <w:rFonts w:asciiTheme="minorHAnsi" w:eastAsia="helvetica 45" w:hAnsiTheme="minorHAnsi" w:cstheme="minorHAnsi"/>
-                <w:sz w:val="20"/>
-                <w:szCs w:val="20"/>
-              </w:rPr>
-            </w:pPr>
-            <w:r>
-              <w:rPr>
-                <w:rFonts w:asciiTheme="minorHAnsi" w:eastAsia="helvetica 45" w:hAnsiTheme="minorHAnsi" w:cstheme="minorHAnsi"/>
+                <w:rFonts w:asciiTheme="minorHAnsi" w:eastAsia="Helvetica 45" w:hAnsiTheme="minorHAnsi" w:cstheme="minorHAnsi"/>
+                <w:sz w:val="20"/>
+                <w:szCs w:val="20"/>
+              </w:rPr>
+            </w:pPr>
+            <w:r>
+              <w:rPr>
+                <w:rFonts w:asciiTheme="minorHAnsi" w:eastAsia="Helvetica 45" w:hAnsiTheme="minorHAnsi" w:cstheme="minorHAnsi"/>
                 <w:i/>
                 <w:sz w:val="20"/>
                 <w:szCs w:val="20"/>
@@ -15838,7 +16564,7 @@
             </w:pPr>
             <w:r>
               <w:rPr>
-                <w:rFonts w:asciiTheme="minorHAnsi" w:eastAsia="helvetica 45" w:hAnsiTheme="minorHAnsi" w:cstheme="minorHAnsi"/>
+                <w:rFonts w:asciiTheme="minorHAnsi" w:eastAsia="Helvetica 45" w:hAnsiTheme="minorHAnsi" w:cstheme="minorHAnsi"/>
                 <w:i/>
                 <w:sz w:val="20"/>
                 <w:szCs w:val="20"/>
@@ -15911,7 +16637,7 @@
             </w:pPr>
             <w:r>
               <w:rPr>
-                <w:rFonts w:asciiTheme="minorHAnsi" w:eastAsia="helvetica 45" w:hAnsiTheme="minorHAnsi" w:cstheme="minorHAnsi"/>
+                <w:rFonts w:asciiTheme="minorHAnsi" w:eastAsia="Helvetica 45" w:hAnsiTheme="minorHAnsi" w:cstheme="minorHAnsi"/>
                 <w:i/>
                 <w:sz w:val="20"/>
                 <w:szCs w:val="20"/>
@@ -15987,7 +16713,7 @@
             </w:pPr>
             <w:r>
               <w:rPr>
-                <w:rFonts w:asciiTheme="minorHAnsi" w:eastAsia="helvetica 45" w:hAnsiTheme="minorHAnsi" w:cstheme="minorHAnsi"/>
+                <w:rFonts w:asciiTheme="minorHAnsi" w:eastAsia="Helvetica 45" w:hAnsiTheme="minorHAnsi" w:cstheme="minorHAnsi"/>
                 <w:i/>
                 <w:sz w:val="20"/>
                 <w:szCs w:val="20"/>
@@ -16061,7 +16787,7 @@
             </w:pPr>
             <w:r>
               <w:rPr>
-                <w:rFonts w:asciiTheme="minorHAnsi" w:eastAsia="helvetica 45" w:hAnsiTheme="minorHAnsi" w:cstheme="minorHAnsi"/>
+                <w:rFonts w:asciiTheme="minorHAnsi" w:eastAsia="Helvetica 45" w:hAnsiTheme="minorHAnsi" w:cstheme="minorHAnsi"/>
                 <w:i/>
                 <w:sz w:val="20"/>
                 <w:szCs w:val="20"/>
@@ -16137,7 +16863,7 @@
             </w:pPr>
             <w:r>
               <w:rPr>
-                <w:rFonts w:asciiTheme="minorHAnsi" w:eastAsia="helvetica 45" w:hAnsiTheme="minorHAnsi" w:cstheme="minorHAnsi"/>
+                <w:rFonts w:asciiTheme="minorHAnsi" w:eastAsia="Helvetica 45" w:hAnsiTheme="minorHAnsi" w:cstheme="minorHAnsi"/>
                 <w:i/>
                 <w:sz w:val="20"/>
                 <w:szCs w:val="20"/>
@@ -16180,12 +16906,12 @@
       </w:pPr>
     </w:p>
     <w:sectPr>
-      <w:headerReference w:type="even" r:id="rId38"/>
-      <w:headerReference w:type="default" r:id="rId39"/>
-      <w:footerReference w:type="even" r:id="rId40"/>
-      <w:footerReference w:type="default" r:id="rId41"/>
-      <w:headerReference w:type="first" r:id="rId42"/>
-      <w:footerReference w:type="first" r:id="rId43"/>
+      <w:headerReference w:type="even" r:id="rId42"/>
+      <w:headerReference w:type="default" r:id="rId43"/>
+      <w:footerReference w:type="even" r:id="rId44"/>
+      <w:footerReference w:type="default" r:id="rId45"/>
+      <w:headerReference w:type="first" r:id="rId46"/>
+      <w:footerReference w:type="first" r:id="rId47"/>
       <w:pgSz w:w="11906" w:h="16838"/>
       <w:pgMar w:top="1134" w:right="1531" w:bottom="1276" w:left="1531" w:header="284" w:footer="284" w:gutter="0"/>
       <w:cols w:space="708"/>
@@ -16195,8 +16921,66 @@
 </w:document>
 </file>
 
+<file path=word/comments.xml><?xml version="1.0" encoding="utf-8"?>
+<w:comments xmlns:wpc="http://schemas.microsoft.com/office/word/2010/wordprocessingCanvas" xmlns:cx="http://schemas.microsoft.com/office/drawing/2014/chartex" xmlns:cx1="http://schemas.microsoft.com/office/drawing/2015/9/8/chartex" xmlns:cx2="http://schemas.microsoft.com/office/drawing/2015/10/21/chartex" xmlns:cx3="http://schemas.microsoft.com/office/drawing/2016/5/9/chartex" xmlns:cx4="http://schemas.microsoft.com/office/drawing/2016/5/10/chartex" xmlns:cx5="http://schemas.microsoft.com/office/drawing/2016/5/11/chartex" xmlns:cx6="http://schemas.microsoft.com/office/drawing/2016/5/12/chartex" xmlns:cx7="http://schemas.microsoft.com/office/drawing/2016/5/13/chartex" xmlns:cx8="http://schemas.microsoft.com/office/drawing/2016/5/14/chartex" xmlns:mc="http://schemas.openxmlformats.org/markup-compatibility/2006" xmlns:aink="http://schemas.microsoft.com/office/drawing/2016/ink" xmlns:am3d="http://schemas.microsoft.com/office/drawing/2017/model3d" xmlns:o="urn:schemas-microsoft-com:office:office" xmlns:oel="http://schemas.microsoft.com/office/2019/extlst" xmlns:r="http://schemas.openxmlformats.org/officeDocument/2006/relationships" xmlns:m="http://schemas.openxmlformats.org/officeDocument/2006/math" xmlns:v="urn:schemas-microsoft-com:vml" xmlns:wp14="http://schemas.microsoft.com/office/word/2010/wordprocessingDrawing" xmlns:wp="http://schemas.openxmlformats.org/drawingml/2006/wordprocessingDrawing" xmlns:w10="urn:schemas-microsoft-com:office:word" xmlns:w="http://schemas.openxmlformats.org/wordprocessingml/2006/main" xmlns:w14="http://schemas.microsoft.com/office/word/2010/wordml" xmlns:w15="http://schemas.microsoft.com/office/word/2012/wordml" xmlns:w16cex="http://schemas.microsoft.com/office/word/2018/wordml/cex" xmlns:w16cid="http://schemas.microsoft.com/office/word/2016/wordml/cid" xmlns:w16="http://schemas.microsoft.com/office/word/2018/wordml" xmlns:w16du="http://schemas.microsoft.com/office/word/2023/wordml/word16du" xmlns:w16sdtdh="http://schemas.microsoft.com/office/word/2020/wordml/sdtdatahash" xmlns:w16se="http://schemas.microsoft.com/office/word/2015/wordml/symex" xmlns:wpg="http://schemas.microsoft.com/office/word/2010/wordprocessingGroup" xmlns:wpi="http://schemas.microsoft.com/office/word/2010/wordprocessingInk" xmlns:wne="http://schemas.microsoft.com/office/word/2006/wordml" xmlns:wps="http://schemas.microsoft.com/office/word/2010/wordprocessingShape" mc:Ignorable="w14 w15 w16se w16cid w16 w16cex w16sdtdh wp14">
+  <w:comment w:id="0" w:author="Ira Diethelm" w:date="2023-06-12T08:48:00Z" w:initials="ID">
+    <w:p>
+      <w:pPr>
+        <w:pStyle w:val="Kommentartext"/>
+      </w:pPr>
+      <w:r>
+        <w:rPr>
+          <w:rStyle w:val="Kommentarzeichen"/>
+        </w:rPr>
+        <w:annotationRef/>
+      </w:r>
+      <w:r>
+        <w:t>Todo Abgleich mit den neuen Aufgaben/Änderungen</w:t>
+      </w:r>
+    </w:p>
+  </w:comment>
+  <w:comment w:id="1" w:author="Ira Diethelm" w:date="2023-06-12T08:48:00Z" w:initials="ID">
+    <w:p>
+      <w:pPr>
+        <w:pStyle w:val="Kommentartext"/>
+      </w:pPr>
+      <w:r>
+        <w:rPr>
+          <w:rStyle w:val="Kommentarzeichen"/>
+        </w:rPr>
+        <w:annotationRef/>
+      </w:r>
+      <w:r>
+        <w:t>Links checken</w:t>
+      </w:r>
+    </w:p>
+  </w:comment>
+</w:comments>
+</file>
+
+<file path=word/commentsExtended.xml><?xml version="1.0" encoding="utf-8"?>
+<w15:commentsEx xmlns:wpc="http://schemas.microsoft.com/office/word/2010/wordprocessingCanvas" xmlns:cx="http://schemas.microsoft.com/office/drawing/2014/chartex" xmlns:cx1="http://schemas.microsoft.com/office/drawing/2015/9/8/chartex" xmlns:cx2="http://schemas.microsoft.com/office/drawing/2015/10/21/chartex" xmlns:cx3="http://schemas.microsoft.com/office/drawing/2016/5/9/chartex" xmlns:cx4="http://schemas.microsoft.com/office/drawing/2016/5/10/chartex" xmlns:cx5="http://schemas.microsoft.com/office/drawing/2016/5/11/chartex" xmlns:cx6="http://schemas.microsoft.com/office/drawing/2016/5/12/chartex" xmlns:cx7="http://schemas.microsoft.com/office/drawing/2016/5/13/chartex" xmlns:cx8="http://schemas.microsoft.com/office/drawing/2016/5/14/chartex" xmlns:mc="http://schemas.openxmlformats.org/markup-compatibility/2006" xmlns:aink="http://schemas.microsoft.com/office/drawing/2016/ink" xmlns:am3d="http://schemas.microsoft.com/office/drawing/2017/model3d" xmlns:o="urn:schemas-microsoft-com:office:office" xmlns:oel="http://schemas.microsoft.com/office/2019/extlst" xmlns:r="http://schemas.openxmlformats.org/officeDocument/2006/relationships" xmlns:m="http://schemas.openxmlformats.org/officeDocument/2006/math" xmlns:v="urn:schemas-microsoft-com:vml" xmlns:wp14="http://schemas.microsoft.com/office/word/2010/wordprocessingDrawing" xmlns:wp="http://schemas.openxmlformats.org/drawingml/2006/wordprocessingDrawing" xmlns:w10="urn:schemas-microsoft-com:office:word" xmlns:w="http://schemas.openxmlformats.org/wordprocessingml/2006/main" xmlns:w14="http://schemas.microsoft.com/office/word/2010/wordml" xmlns:w15="http://schemas.microsoft.com/office/word/2012/wordml" xmlns:w16cex="http://schemas.microsoft.com/office/word/2018/wordml/cex" xmlns:w16cid="http://schemas.microsoft.com/office/word/2016/wordml/cid" xmlns:w16="http://schemas.microsoft.com/office/word/2018/wordml" xmlns:w16du="http://schemas.microsoft.com/office/word/2023/wordml/word16du" xmlns:w16sdtdh="http://schemas.microsoft.com/office/word/2020/wordml/sdtdatahash" xmlns:w16se="http://schemas.microsoft.com/office/word/2015/wordml/symex" xmlns:wpg="http://schemas.microsoft.com/office/word/2010/wordprocessingGroup" xmlns:wpi="http://schemas.microsoft.com/office/word/2010/wordprocessingInk" xmlns:wne="http://schemas.microsoft.com/office/word/2006/wordml" xmlns:wps="http://schemas.microsoft.com/office/word/2010/wordprocessingShape" mc:Ignorable="w14 w15 w16se w16cid w16 w16cex w16sdtdh wp14">
+  <w15:commentEx w15:paraId="79733263" w15:done="0"/>
+  <w15:commentEx w15:paraId="69BF00AF" w15:paraIdParent="79733263" w15:done="0"/>
+</w15:commentsEx>
+</file>
+
+<file path=word/commentsExtensible.xml><?xml version="1.0" encoding="utf-8"?>
+<w16cex:commentsExtensible xmlns:wpc="http://schemas.microsoft.com/office/word/2010/wordprocessingCanvas" xmlns:cx="http://schemas.microsoft.com/office/drawing/2014/chartex" xmlns:cx1="http://schemas.microsoft.com/office/drawing/2015/9/8/chartex" xmlns:cx2="http://schemas.microsoft.com/office/drawing/2015/10/21/chartex" xmlns:cx3="http://schemas.microsoft.com/office/drawing/2016/5/9/chartex" xmlns:cx4="http://schemas.microsoft.com/office/drawing/2016/5/10/chartex" xmlns:cx5="http://schemas.microsoft.com/office/drawing/2016/5/11/chartex" xmlns:cx6="http://schemas.microsoft.com/office/drawing/2016/5/12/chartex" xmlns:cx7="http://schemas.microsoft.com/office/drawing/2016/5/13/chartex" xmlns:cx8="http://schemas.microsoft.com/office/drawing/2016/5/14/chartex" xmlns:mc="http://schemas.openxmlformats.org/markup-compatibility/2006" xmlns:aink="http://schemas.microsoft.com/office/drawing/2016/ink" xmlns:am3d="http://schemas.microsoft.com/office/drawing/2017/model3d" xmlns:o="urn:schemas-microsoft-com:office:office" xmlns:oel="http://schemas.microsoft.com/office/2019/extlst" xmlns:r="http://schemas.openxmlformats.org/officeDocument/2006/relationships" xmlns:m="http://schemas.openxmlformats.org/officeDocument/2006/math" xmlns:v="urn:schemas-microsoft-com:vml" xmlns:wp14="http://schemas.microsoft.com/office/word/2010/wordprocessingDrawing" xmlns:wp="http://schemas.openxmlformats.org/drawingml/2006/wordprocessingDrawing" xmlns:w10="urn:schemas-microsoft-com:office:word" xmlns:w="http://schemas.openxmlformats.org/wordprocessingml/2006/main" xmlns:w14="http://schemas.microsoft.com/office/word/2010/wordml" xmlns:w15="http://schemas.microsoft.com/office/word/2012/wordml" xmlns:w16cex="http://schemas.microsoft.com/office/word/2018/wordml/cex" xmlns:w16cid="http://schemas.microsoft.com/office/word/2016/wordml/cid" xmlns:w16="http://schemas.microsoft.com/office/word/2018/wordml" xmlns:w16du="http://schemas.microsoft.com/office/word/2023/wordml/word16du" xmlns:w16sdtdh="http://schemas.microsoft.com/office/word/2020/wordml/sdtdatahash" xmlns:w16se="http://schemas.microsoft.com/office/word/2015/wordml/symex" xmlns:wpg="http://schemas.microsoft.com/office/word/2010/wordprocessingGroup" xmlns:wpi="http://schemas.microsoft.com/office/word/2010/wordprocessingInk" xmlns:wne="http://schemas.microsoft.com/office/word/2006/wordml" xmlns:wps="http://schemas.microsoft.com/office/word/2010/wordprocessingShape" mc:Ignorable="w14 w15 w16se w16cid w16 w16cex w16sdtdh wp14">
+  <w16cex:commentExtensible w16cex:durableId="28315A6C" w16cex:dateUtc="2023-06-12T06:48:00Z"/>
+  <w16cex:commentExtensible w16cex:durableId="28315A75" w16cex:dateUtc="2023-06-12T06:48:00Z"/>
+</w16cex:commentsExtensible>
+</file>
+
+<file path=word/commentsIds.xml><?xml version="1.0" encoding="utf-8"?>
+<w16cid:commentsIds xmlns:wpc="http://schemas.microsoft.com/office/word/2010/wordprocessingCanvas" xmlns:cx="http://schemas.microsoft.com/office/drawing/2014/chartex" xmlns:cx1="http://schemas.microsoft.com/office/drawing/2015/9/8/chartex" xmlns:cx2="http://schemas.microsoft.com/office/drawing/2015/10/21/chartex" xmlns:cx3="http://schemas.microsoft.com/office/drawing/2016/5/9/chartex" xmlns:cx4="http://schemas.microsoft.com/office/drawing/2016/5/10/chartex" xmlns:cx5="http://schemas.microsoft.com/office/drawing/2016/5/11/chartex" xmlns:cx6="http://schemas.microsoft.com/office/drawing/2016/5/12/chartex" xmlns:cx7="http://schemas.microsoft.com/office/drawing/2016/5/13/chartex" xmlns:cx8="http://schemas.microsoft.com/office/drawing/2016/5/14/chartex" xmlns:mc="http://schemas.openxmlformats.org/markup-compatibility/2006" xmlns:aink="http://schemas.microsoft.com/office/drawing/2016/ink" xmlns:am3d="http://schemas.microsoft.com/office/drawing/2017/model3d" xmlns:o="urn:schemas-microsoft-com:office:office" xmlns:oel="http://schemas.microsoft.com/office/2019/extlst" xmlns:r="http://schemas.openxmlformats.org/officeDocument/2006/relationships" xmlns:m="http://schemas.openxmlformats.org/officeDocument/2006/math" xmlns:v="urn:schemas-microsoft-com:vml" xmlns:wp14="http://schemas.microsoft.com/office/word/2010/wordprocessingDrawing" xmlns:wp="http://schemas.openxmlformats.org/drawingml/2006/wordprocessingDrawing" xmlns:w10="urn:schemas-microsoft-com:office:word" xmlns:w="http://schemas.openxmlformats.org/wordprocessingml/2006/main" xmlns:w14="http://schemas.microsoft.com/office/word/2010/wordml" xmlns:w15="http://schemas.microsoft.com/office/word/2012/wordml" xmlns:w16cex="http://schemas.microsoft.com/office/word/2018/wordml/cex" xmlns:w16cid="http://schemas.microsoft.com/office/word/2016/wordml/cid" xmlns:w16="http://schemas.microsoft.com/office/word/2018/wordml" xmlns:w16du="http://schemas.microsoft.com/office/word/2023/wordml/word16du" xmlns:w16sdtdh="http://schemas.microsoft.com/office/word/2020/wordml/sdtdatahash" xmlns:w16se="http://schemas.microsoft.com/office/word/2015/wordml/symex" xmlns:wpg="http://schemas.microsoft.com/office/word/2010/wordprocessingGroup" xmlns:wpi="http://schemas.microsoft.com/office/word/2010/wordprocessingInk" xmlns:wne="http://schemas.microsoft.com/office/word/2006/wordml" xmlns:wps="http://schemas.microsoft.com/office/word/2010/wordprocessingShape" mc:Ignorable="w14 w15 w16se w16cid w16 w16cex w16sdtdh wp14">
+  <w16cid:commentId w16cid:paraId="79733263" w16cid:durableId="28315A6C"/>
+  <w16cid:commentId w16cid:paraId="69BF00AF" w16cid:durableId="28315A75"/>
+</w16cid:commentsIds>
+</file>
+
 <file path=word/endnotes.xml><?xml version="1.0" encoding="utf-8"?>
-<w:endnotes xmlns:wpc="http://schemas.microsoft.com/office/word/2010/wordprocessingCanvas" xmlns:cx="http://schemas.microsoft.com/office/drawing/2014/chartex" xmlns:cx1="http://schemas.microsoft.com/office/drawing/2015/9/8/chartex" xmlns:cx2="http://schemas.microsoft.com/office/drawing/2015/10/21/chartex" xmlns:cx3="http://schemas.microsoft.com/office/drawing/2016/5/9/chartex" xmlns:cx4="http://schemas.microsoft.com/office/drawing/2016/5/10/chartex" xmlns:cx5="http://schemas.microsoft.com/office/drawing/2016/5/11/chartex" xmlns:cx6="http://schemas.microsoft.com/office/drawing/2016/5/12/chartex" xmlns:cx7="http://schemas.microsoft.com/office/drawing/2016/5/13/chartex" xmlns:cx8="http://schemas.microsoft.com/office/drawing/2016/5/14/chartex" xmlns:mc="http://schemas.openxmlformats.org/markup-compatibility/2006" xmlns:aink="http://schemas.microsoft.com/office/drawing/2016/ink" xmlns:am3d="http://schemas.microsoft.com/office/drawing/2017/model3d" xmlns:o="urn:schemas-microsoft-com:office:office" xmlns:oel="http://schemas.microsoft.com/office/2019/extlst" xmlns:r="http://schemas.openxmlformats.org/officeDocument/2006/relationships" xmlns:m="http://schemas.openxmlformats.org/officeDocument/2006/math" xmlns:v="urn:schemas-microsoft-com:vml" xmlns:wp14="http://schemas.microsoft.com/office/word/2010/wordprocessingDrawing" xmlns:wp="http://schemas.openxmlformats.org/drawingml/2006/wordprocessingDrawing" xmlns:w10="urn:schemas-microsoft-com:office:word" xmlns:w="http://schemas.openxmlformats.org/wordprocessingml/2006/main" xmlns:w14="http://schemas.microsoft.com/office/word/2010/wordml" xmlns:w15="http://schemas.microsoft.com/office/word/2012/wordml" xmlns:w16cex="http://schemas.microsoft.com/office/word/2018/wordml/cex" xmlns:w16cid="http://schemas.microsoft.com/office/word/2016/wordml/cid" xmlns:w16="http://schemas.microsoft.com/office/word/2018/wordml" xmlns:w16sdtdh="http://schemas.microsoft.com/office/word/2020/wordml/sdtdatahash" xmlns:w16se="http://schemas.microsoft.com/office/word/2015/wordml/symex" xmlns:wpg="http://schemas.microsoft.com/office/word/2010/wordprocessingGroup" xmlns:wpi="http://schemas.microsoft.com/office/word/2010/wordprocessingInk" xmlns:wne="http://schemas.microsoft.com/office/word/2006/wordml" xmlns:wps="http://schemas.microsoft.com/office/word/2010/wordprocessingShape" mc:Ignorable="w14 w15 w16se w16cid w16 w16cex w16sdtdh wp14">
+<w:endnotes xmlns:wpc="http://schemas.microsoft.com/office/word/2010/wordprocessingCanvas" xmlns:cx="http://schemas.microsoft.com/office/drawing/2014/chartex" xmlns:cx1="http://schemas.microsoft.com/office/drawing/2015/9/8/chartex" xmlns:cx2="http://schemas.microsoft.com/office/drawing/2015/10/21/chartex" xmlns:cx3="http://schemas.microsoft.com/office/drawing/2016/5/9/chartex" xmlns:cx4="http://schemas.microsoft.com/office/drawing/2016/5/10/chartex" xmlns:cx5="http://schemas.microsoft.com/office/drawing/2016/5/11/chartex" xmlns:cx6="http://schemas.microsoft.com/office/drawing/2016/5/12/chartex" xmlns:cx7="http://schemas.microsoft.com/office/drawing/2016/5/13/chartex" xmlns:cx8="http://schemas.microsoft.com/office/drawing/2016/5/14/chartex" xmlns:mc="http://schemas.openxmlformats.org/markup-compatibility/2006" xmlns:aink="http://schemas.microsoft.com/office/drawing/2016/ink" xmlns:am3d="http://schemas.microsoft.com/office/drawing/2017/model3d" xmlns:o="urn:schemas-microsoft-com:office:office" xmlns:oel="http://schemas.microsoft.com/office/2019/extlst" xmlns:r="http://schemas.openxmlformats.org/officeDocument/2006/relationships" xmlns:m="http://schemas.openxmlformats.org/officeDocument/2006/math" xmlns:v="urn:schemas-microsoft-com:vml" xmlns:wp14="http://schemas.microsoft.com/office/word/2010/wordprocessingDrawing" xmlns:wp="http://schemas.openxmlformats.org/drawingml/2006/wordprocessingDrawing" xmlns:w10="urn:schemas-microsoft-com:office:word" xmlns:w="http://schemas.openxmlformats.org/wordprocessingml/2006/main" xmlns:w14="http://schemas.microsoft.com/office/word/2010/wordml" xmlns:w15="http://schemas.microsoft.com/office/word/2012/wordml" xmlns:w16cex="http://schemas.microsoft.com/office/word/2018/wordml/cex" xmlns:w16cid="http://schemas.microsoft.com/office/word/2016/wordml/cid" xmlns:w16="http://schemas.microsoft.com/office/word/2018/wordml" xmlns:w16du="http://schemas.microsoft.com/office/word/2023/wordml/word16du" xmlns:w16sdtdh="http://schemas.microsoft.com/office/word/2020/wordml/sdtdatahash" xmlns:w16se="http://schemas.microsoft.com/office/word/2015/wordml/symex" xmlns:wpg="http://schemas.microsoft.com/office/word/2010/wordprocessingGroup" xmlns:wpi="http://schemas.microsoft.com/office/word/2010/wordprocessingInk" xmlns:wne="http://schemas.microsoft.com/office/word/2006/wordml" xmlns:wps="http://schemas.microsoft.com/office/word/2010/wordprocessingShape" mc:Ignorable="w14 w15 w16se w16cid w16 w16cex w16sdtdh wp14">
   <w:endnote w:type="separator" w:id="-1">
     <w:p>
       <w:r>
@@ -16217,7 +17001,7 @@
 </file>
 
 <file path=word/footer1.xml><?xml version="1.0" encoding="utf-8"?>
-<w:ftr xmlns:wpc="http://schemas.microsoft.com/office/word/2010/wordprocessingCanvas" xmlns:cx="http://schemas.microsoft.com/office/drawing/2014/chartex" xmlns:cx1="http://schemas.microsoft.com/office/drawing/2015/9/8/chartex" xmlns:cx2="http://schemas.microsoft.com/office/drawing/2015/10/21/chartex" xmlns:cx3="http://schemas.microsoft.com/office/drawing/2016/5/9/chartex" xmlns:cx4="http://schemas.microsoft.com/office/drawing/2016/5/10/chartex" xmlns:cx5="http://schemas.microsoft.com/office/drawing/2016/5/11/chartex" xmlns:cx6="http://schemas.microsoft.com/office/drawing/2016/5/12/chartex" xmlns:cx7="http://schemas.microsoft.com/office/drawing/2016/5/13/chartex" xmlns:cx8="http://schemas.microsoft.com/office/drawing/2016/5/14/chartex" xmlns:mc="http://schemas.openxmlformats.org/markup-compatibility/2006" xmlns:aink="http://schemas.microsoft.com/office/drawing/2016/ink" xmlns:am3d="http://schemas.microsoft.com/office/drawing/2017/model3d" xmlns:o="urn:schemas-microsoft-com:office:office" xmlns:oel="http://schemas.microsoft.com/office/2019/extlst" xmlns:r="http://schemas.openxmlformats.org/officeDocument/2006/relationships" xmlns:m="http://schemas.openxmlformats.org/officeDocument/2006/math" xmlns:v="urn:schemas-microsoft-com:vml" xmlns:wp14="http://schemas.microsoft.com/office/word/2010/wordprocessingDrawing" xmlns:wp="http://schemas.openxmlformats.org/drawingml/2006/wordprocessingDrawing" xmlns:w10="urn:schemas-microsoft-com:office:word" xmlns:w="http://schemas.openxmlformats.org/wordprocessingml/2006/main" xmlns:w14="http://schemas.microsoft.com/office/word/2010/wordml" xmlns:w15="http://schemas.microsoft.com/office/word/2012/wordml" xmlns:w16cex="http://schemas.microsoft.com/office/word/2018/wordml/cex" xmlns:w16cid="http://schemas.microsoft.com/office/word/2016/wordml/cid" xmlns:w16="http://schemas.microsoft.com/office/word/2018/wordml" xmlns:w16sdtdh="http://schemas.microsoft.com/office/word/2020/wordml/sdtdatahash" xmlns:w16se="http://schemas.microsoft.com/office/word/2015/wordml/symex" xmlns:wpg="http://schemas.microsoft.com/office/word/2010/wordprocessingGroup" xmlns:wpi="http://schemas.microsoft.com/office/word/2010/wordprocessingInk" xmlns:wne="http://schemas.microsoft.com/office/word/2006/wordml" xmlns:wps="http://schemas.microsoft.com/office/word/2010/wordprocessingShape" mc:Ignorable="w14 w15 w16se w16cid w16 w16cex w16sdtdh wp14">
+<w:ftr xmlns:wpc="http://schemas.microsoft.com/office/word/2010/wordprocessingCanvas" xmlns:cx="http://schemas.microsoft.com/office/drawing/2014/chartex" xmlns:cx1="http://schemas.microsoft.com/office/drawing/2015/9/8/chartex" xmlns:cx2="http://schemas.microsoft.com/office/drawing/2015/10/21/chartex" xmlns:cx3="http://schemas.microsoft.com/office/drawing/2016/5/9/chartex" xmlns:cx4="http://schemas.microsoft.com/office/drawing/2016/5/10/chartex" xmlns:cx5="http://schemas.microsoft.com/office/drawing/2016/5/11/chartex" xmlns:cx6="http://schemas.microsoft.com/office/drawing/2016/5/12/chartex" xmlns:cx7="http://schemas.microsoft.com/office/drawing/2016/5/13/chartex" xmlns:cx8="http://schemas.microsoft.com/office/drawing/2016/5/14/chartex" xmlns:mc="http://schemas.openxmlformats.org/markup-compatibility/2006" xmlns:aink="http://schemas.microsoft.com/office/drawing/2016/ink" xmlns:am3d="http://schemas.microsoft.com/office/drawing/2017/model3d" xmlns:o="urn:schemas-microsoft-com:office:office" xmlns:oel="http://schemas.microsoft.com/office/2019/extlst" xmlns:r="http://schemas.openxmlformats.org/officeDocument/2006/relationships" xmlns:m="http://schemas.openxmlformats.org/officeDocument/2006/math" xmlns:v="urn:schemas-microsoft-com:vml" xmlns:wp14="http://schemas.microsoft.com/office/word/2010/wordprocessingDrawing" xmlns:wp="http://schemas.openxmlformats.org/drawingml/2006/wordprocessingDrawing" xmlns:w10="urn:schemas-microsoft-com:office:word" xmlns:w="http://schemas.openxmlformats.org/wordprocessingml/2006/main" xmlns:w14="http://schemas.microsoft.com/office/word/2010/wordml" xmlns:w15="http://schemas.microsoft.com/office/word/2012/wordml" xmlns:w16cex="http://schemas.microsoft.com/office/word/2018/wordml/cex" xmlns:w16cid="http://schemas.microsoft.com/office/word/2016/wordml/cid" xmlns:w16="http://schemas.microsoft.com/office/word/2018/wordml" xmlns:w16du="http://schemas.microsoft.com/office/word/2023/wordml/word16du" xmlns:w16sdtdh="http://schemas.microsoft.com/office/word/2020/wordml/sdtdatahash" xmlns:w16se="http://schemas.microsoft.com/office/word/2015/wordml/symex" xmlns:wpg="http://schemas.microsoft.com/office/word/2010/wordprocessingGroup" xmlns:wpi="http://schemas.microsoft.com/office/word/2010/wordprocessingInk" xmlns:wne="http://schemas.microsoft.com/office/word/2006/wordml" xmlns:wps="http://schemas.microsoft.com/office/word/2010/wordprocessingShape" mc:Ignorable="w14 w15 w16se w16cid w16 w16cex w16sdtdh wp14">
   <w:p>
     <w:pPr>
       <w:pStyle w:val="Fuzeile"/>
@@ -16227,7 +17011,7 @@
 </file>
 
 <file path=word/footer2.xml><?xml version="1.0" encoding="utf-8"?>
-<w:ftr xmlns:wpc="http://schemas.microsoft.com/office/word/2010/wordprocessingCanvas" xmlns:cx="http://schemas.microsoft.com/office/drawing/2014/chartex" xmlns:cx1="http://schemas.microsoft.com/office/drawing/2015/9/8/chartex" xmlns:cx2="http://schemas.microsoft.com/office/drawing/2015/10/21/chartex" xmlns:cx3="http://schemas.microsoft.com/office/drawing/2016/5/9/chartex" xmlns:cx4="http://schemas.microsoft.com/office/drawing/2016/5/10/chartex" xmlns:cx5="http://schemas.microsoft.com/office/drawing/2016/5/11/chartex" xmlns:cx6="http://schemas.microsoft.com/office/drawing/2016/5/12/chartex" xmlns:cx7="http://schemas.microsoft.com/office/drawing/2016/5/13/chartex" xmlns:cx8="http://schemas.microsoft.com/office/drawing/2016/5/14/chartex" xmlns:mc="http://schemas.openxmlformats.org/markup-compatibility/2006" xmlns:aink="http://schemas.microsoft.com/office/drawing/2016/ink" xmlns:am3d="http://schemas.microsoft.com/office/drawing/2017/model3d" xmlns:o="urn:schemas-microsoft-com:office:office" xmlns:oel="http://schemas.microsoft.com/office/2019/extlst" xmlns:r="http://schemas.openxmlformats.org/officeDocument/2006/relationships" xmlns:m="http://schemas.openxmlformats.org/officeDocument/2006/math" xmlns:v="urn:schemas-microsoft-com:vml" xmlns:wp14="http://schemas.microsoft.com/office/word/2010/wordprocessingDrawing" xmlns:wp="http://schemas.openxmlformats.org/drawingml/2006/wordprocessingDrawing" xmlns:w10="urn:schemas-microsoft-com:office:word" xmlns:w="http://schemas.openxmlformats.org/wordprocessingml/2006/main" xmlns:w14="http://schemas.microsoft.com/office/word/2010/wordml" xmlns:w15="http://schemas.microsoft.com/office/word/2012/wordml" xmlns:w16cex="http://schemas.microsoft.com/office/word/2018/wordml/cex" xmlns:w16cid="http://schemas.microsoft.com/office/word/2016/wordml/cid" xmlns:w16="http://schemas.microsoft.com/office/word/2018/wordml" xmlns:w16sdtdh="http://schemas.microsoft.com/office/word/2020/wordml/sdtdatahash" xmlns:w16se="http://schemas.microsoft.com/office/word/2015/wordml/symex" xmlns:wpg="http://schemas.microsoft.com/office/word/2010/wordprocessingGroup" xmlns:wpi="http://schemas.microsoft.com/office/word/2010/wordprocessingInk" xmlns:wne="http://schemas.microsoft.com/office/word/2006/wordml" xmlns:wps="http://schemas.microsoft.com/office/word/2010/wordprocessingShape" mc:Ignorable="w14 w15 w16se w16cid w16 w16cex w16sdtdh wp14">
+<w:ftr xmlns:wpc="http://schemas.microsoft.com/office/word/2010/wordprocessingCanvas" xmlns:cx="http://schemas.microsoft.com/office/drawing/2014/chartex" xmlns:cx1="http://schemas.microsoft.com/office/drawing/2015/9/8/chartex" xmlns:cx2="http://schemas.microsoft.com/office/drawing/2015/10/21/chartex" xmlns:cx3="http://schemas.microsoft.com/office/drawing/2016/5/9/chartex" xmlns:cx4="http://schemas.microsoft.com/office/drawing/2016/5/10/chartex" xmlns:cx5="http://schemas.microsoft.com/office/drawing/2016/5/11/chartex" xmlns:cx6="http://schemas.microsoft.com/office/drawing/2016/5/12/chartex" xmlns:cx7="http://schemas.microsoft.com/office/drawing/2016/5/13/chartex" xmlns:cx8="http://schemas.microsoft.com/office/drawing/2016/5/14/chartex" xmlns:mc="http://schemas.openxmlformats.org/markup-compatibility/2006" xmlns:aink="http://schemas.microsoft.com/office/drawing/2016/ink" xmlns:am3d="http://schemas.microsoft.com/office/drawing/2017/model3d" xmlns:o="urn:schemas-microsoft-com:office:office" xmlns:oel="http://schemas.microsoft.com/office/2019/extlst" xmlns:r="http://schemas.openxmlformats.org/officeDocument/2006/relationships" xmlns:m="http://schemas.openxmlformats.org/officeDocument/2006/math" xmlns:v="urn:schemas-microsoft-com:vml" xmlns:wp14="http://schemas.microsoft.com/office/word/2010/wordprocessingDrawing" xmlns:wp="http://schemas.openxmlformats.org/drawingml/2006/wordprocessingDrawing" xmlns:w10="urn:schemas-microsoft-com:office:word" xmlns:w="http://schemas.openxmlformats.org/wordprocessingml/2006/main" xmlns:w14="http://schemas.microsoft.com/office/word/2010/wordml" xmlns:w15="http://schemas.microsoft.com/office/word/2012/wordml" xmlns:w16cex="http://schemas.microsoft.com/office/word/2018/wordml/cex" xmlns:w16cid="http://schemas.microsoft.com/office/word/2016/wordml/cid" xmlns:w16="http://schemas.microsoft.com/office/word/2018/wordml" xmlns:w16du="http://schemas.microsoft.com/office/word/2023/wordml/word16du" xmlns:w16sdtdh="http://schemas.microsoft.com/office/word/2020/wordml/sdtdatahash" xmlns:w16se="http://schemas.microsoft.com/office/word/2015/wordml/symex" xmlns:wpg="http://schemas.microsoft.com/office/word/2010/wordprocessingGroup" xmlns:wpi="http://schemas.microsoft.com/office/word/2010/wordprocessingInk" xmlns:wne="http://schemas.microsoft.com/office/word/2006/wordml" xmlns:wps="http://schemas.microsoft.com/office/word/2010/wordprocessingShape" mc:Ignorable="w14 w15 w16se w16cid w16 w16cex w16sdtdh wp14">
   <w:p>
     <w:pPr>
       <w:pStyle w:val="Kopfzeile"/>
@@ -16310,7 +17094,7 @@
                             </w:pPr>
                             <w:r>
                               <w:rPr>
-                                <w:rFonts w:ascii="helvetica 55" w:hAnsi="helvetica 55"/>
+                                <w:rFonts w:ascii="Helvetica 55" w:hAnsi="Helvetica 55"/>
                                 <w:color w:val="A6A6A6" w:themeColor="background1" w:themeShade="A6"/>
                                 <w:sz w:val="14"/>
                                 <w:szCs w:val="14"/>
@@ -16663,7 +17447,7 @@
 </file>
 
 <file path=word/footer3.xml><?xml version="1.0" encoding="utf-8"?>
-<w:ftr xmlns:wpc="http://schemas.microsoft.com/office/word/2010/wordprocessingCanvas" xmlns:cx="http://schemas.microsoft.com/office/drawing/2014/chartex" xmlns:cx1="http://schemas.microsoft.com/office/drawing/2015/9/8/chartex" xmlns:cx2="http://schemas.microsoft.com/office/drawing/2015/10/21/chartex" xmlns:cx3="http://schemas.microsoft.com/office/drawing/2016/5/9/chartex" xmlns:cx4="http://schemas.microsoft.com/office/drawing/2016/5/10/chartex" xmlns:cx5="http://schemas.microsoft.com/office/drawing/2016/5/11/chartex" xmlns:cx6="http://schemas.microsoft.com/office/drawing/2016/5/12/chartex" xmlns:cx7="http://schemas.microsoft.com/office/drawing/2016/5/13/chartex" xmlns:cx8="http://schemas.microsoft.com/office/drawing/2016/5/14/chartex" xmlns:mc="http://schemas.openxmlformats.org/markup-compatibility/2006" xmlns:aink="http://schemas.microsoft.com/office/drawing/2016/ink" xmlns:am3d="http://schemas.microsoft.com/office/drawing/2017/model3d" xmlns:o="urn:schemas-microsoft-com:office:office" xmlns:oel="http://schemas.microsoft.com/office/2019/extlst" xmlns:r="http://schemas.openxmlformats.org/officeDocument/2006/relationships" xmlns:m="http://schemas.openxmlformats.org/officeDocument/2006/math" xmlns:v="urn:schemas-microsoft-com:vml" xmlns:wp14="http://schemas.microsoft.com/office/word/2010/wordprocessingDrawing" xmlns:wp="http://schemas.openxmlformats.org/drawingml/2006/wordprocessingDrawing" xmlns:w10="urn:schemas-microsoft-com:office:word" xmlns:w="http://schemas.openxmlformats.org/wordprocessingml/2006/main" xmlns:w14="http://schemas.microsoft.com/office/word/2010/wordml" xmlns:w15="http://schemas.microsoft.com/office/word/2012/wordml" xmlns:w16cex="http://schemas.microsoft.com/office/word/2018/wordml/cex" xmlns:w16cid="http://schemas.microsoft.com/office/word/2016/wordml/cid" xmlns:w16="http://schemas.microsoft.com/office/word/2018/wordml" xmlns:w16sdtdh="http://schemas.microsoft.com/office/word/2020/wordml/sdtdatahash" xmlns:w16se="http://schemas.microsoft.com/office/word/2015/wordml/symex" xmlns:wpg="http://schemas.microsoft.com/office/word/2010/wordprocessingGroup" xmlns:wpi="http://schemas.microsoft.com/office/word/2010/wordprocessingInk" xmlns:wne="http://schemas.microsoft.com/office/word/2006/wordml" xmlns:wps="http://schemas.microsoft.com/office/word/2010/wordprocessingShape" mc:Ignorable="w14 w15 w16se w16cid w16 w16cex w16sdtdh wp14">
+<w:ftr xmlns:wpc="http://schemas.microsoft.com/office/word/2010/wordprocessingCanvas" xmlns:cx="http://schemas.microsoft.com/office/drawing/2014/chartex" xmlns:cx1="http://schemas.microsoft.com/office/drawing/2015/9/8/chartex" xmlns:cx2="http://schemas.microsoft.com/office/drawing/2015/10/21/chartex" xmlns:cx3="http://schemas.microsoft.com/office/drawing/2016/5/9/chartex" xmlns:cx4="http://schemas.microsoft.com/office/drawing/2016/5/10/chartex" xmlns:cx5="http://schemas.microsoft.com/office/drawing/2016/5/11/chartex" xmlns:cx6="http://schemas.microsoft.com/office/drawing/2016/5/12/chartex" xmlns:cx7="http://schemas.microsoft.com/office/drawing/2016/5/13/chartex" xmlns:cx8="http://schemas.microsoft.com/office/drawing/2016/5/14/chartex" xmlns:mc="http://schemas.openxmlformats.org/markup-compatibility/2006" xmlns:aink="http://schemas.microsoft.com/office/drawing/2016/ink" xmlns:am3d="http://schemas.microsoft.com/office/drawing/2017/model3d" xmlns:o="urn:schemas-microsoft-com:office:office" xmlns:oel="http://schemas.microsoft.com/office/2019/extlst" xmlns:r="http://schemas.openxmlformats.org/officeDocument/2006/relationships" xmlns:m="http://schemas.openxmlformats.org/officeDocument/2006/math" xmlns:v="urn:schemas-microsoft-com:vml" xmlns:wp14="http://schemas.microsoft.com/office/word/2010/wordprocessingDrawing" xmlns:wp="http://schemas.openxmlformats.org/drawingml/2006/wordprocessingDrawing" xmlns:w10="urn:schemas-microsoft-com:office:word" xmlns:w="http://schemas.openxmlformats.org/wordprocessingml/2006/main" xmlns:w14="http://schemas.microsoft.com/office/word/2010/wordml" xmlns:w15="http://schemas.microsoft.com/office/word/2012/wordml" xmlns:w16cex="http://schemas.microsoft.com/office/word/2018/wordml/cex" xmlns:w16cid="http://schemas.microsoft.com/office/word/2016/wordml/cid" xmlns:w16="http://schemas.microsoft.com/office/word/2018/wordml" xmlns:w16du="http://schemas.microsoft.com/office/word/2023/wordml/word16du" xmlns:w16sdtdh="http://schemas.microsoft.com/office/word/2020/wordml/sdtdatahash" xmlns:w16se="http://schemas.microsoft.com/office/word/2015/wordml/symex" xmlns:wpg="http://schemas.microsoft.com/office/word/2010/wordprocessingGroup" xmlns:wpi="http://schemas.microsoft.com/office/word/2010/wordprocessingInk" xmlns:wne="http://schemas.microsoft.com/office/word/2006/wordml" xmlns:wps="http://schemas.microsoft.com/office/word/2010/wordprocessingShape" mc:Ignorable="w14 w15 w16se w16cid w16 w16cex w16sdtdh wp14">
   <w:p>
     <w:pPr>
       <w:pStyle w:val="Fuzeile"/>
@@ -16673,7 +17457,7 @@
 </file>
 
 <file path=word/footnotes.xml><?xml version="1.0" encoding="utf-8"?>
-<w:footnotes xmlns:wpc="http://schemas.microsoft.com/office/word/2010/wordprocessingCanvas" xmlns:cx="http://schemas.microsoft.com/office/drawing/2014/chartex" xmlns:cx1="http://schemas.microsoft.com/office/drawing/2015/9/8/chartex" xmlns:cx2="http://schemas.microsoft.com/office/drawing/2015/10/21/chartex" xmlns:cx3="http://schemas.microsoft.com/office/drawing/2016/5/9/chartex" xmlns:cx4="http://schemas.microsoft.com/office/drawing/2016/5/10/chartex" xmlns:cx5="http://schemas.microsoft.com/office/drawing/2016/5/11/chartex" xmlns:cx6="http://schemas.microsoft.com/office/drawing/2016/5/12/chartex" xmlns:cx7="http://schemas.microsoft.com/office/drawing/2016/5/13/chartex" xmlns:cx8="http://schemas.microsoft.com/office/drawing/2016/5/14/chartex" xmlns:mc="http://schemas.openxmlformats.org/markup-compatibility/2006" xmlns:aink="http://schemas.microsoft.com/office/drawing/2016/ink" xmlns:am3d="http://schemas.microsoft.com/office/drawing/2017/model3d" xmlns:o="urn:schemas-microsoft-com:office:office" xmlns:oel="http://schemas.microsoft.com/office/2019/extlst" xmlns:r="http://schemas.openxmlformats.org/officeDocument/2006/relationships" xmlns:m="http://schemas.openxmlformats.org/officeDocument/2006/math" xmlns:v="urn:schemas-microsoft-com:vml" xmlns:wp14="http://schemas.microsoft.com/office/word/2010/wordprocessingDrawing" xmlns:wp="http://schemas.openxmlformats.org/drawingml/2006/wordprocessingDrawing" xmlns:w10="urn:schemas-microsoft-com:office:word" xmlns:w="http://schemas.openxmlformats.org/wordprocessingml/2006/main" xmlns:w14="http://schemas.microsoft.com/office/word/2010/wordml" xmlns:w15="http://schemas.microsoft.com/office/word/2012/wordml" xmlns:w16cex="http://schemas.microsoft.com/office/word/2018/wordml/cex" xmlns:w16cid="http://schemas.microsoft.com/office/word/2016/wordml/cid" xmlns:w16="http://schemas.microsoft.com/office/word/2018/wordml" xmlns:w16sdtdh="http://schemas.microsoft.com/office/word/2020/wordml/sdtdatahash" xmlns:w16se="http://schemas.microsoft.com/office/word/2015/wordml/symex" xmlns:wpg="http://schemas.microsoft.com/office/word/2010/wordprocessingGroup" xmlns:wpi="http://schemas.microsoft.com/office/word/2010/wordprocessingInk" xmlns:wne="http://schemas.microsoft.com/office/word/2006/wordml" xmlns:wps="http://schemas.microsoft.com/office/word/2010/wordprocessingShape" mc:Ignorable="w14 w15 w16se w16cid w16 w16cex w16sdtdh wp14">
+<w:footnotes xmlns:wpc="http://schemas.microsoft.com/office/word/2010/wordprocessingCanvas" xmlns:cx="http://schemas.microsoft.com/office/drawing/2014/chartex" xmlns:cx1="http://schemas.microsoft.com/office/drawing/2015/9/8/chartex" xmlns:cx2="http://schemas.microsoft.com/office/drawing/2015/10/21/chartex" xmlns:cx3="http://schemas.microsoft.com/office/drawing/2016/5/9/chartex" xmlns:cx4="http://schemas.microsoft.com/office/drawing/2016/5/10/chartex" xmlns:cx5="http://schemas.microsoft.com/office/drawing/2016/5/11/chartex" xmlns:cx6="http://schemas.microsoft.com/office/drawing/2016/5/12/chartex" xmlns:cx7="http://schemas.microsoft.com/office/drawing/2016/5/13/chartex" xmlns:cx8="http://schemas.microsoft.com/office/drawing/2016/5/14/chartex" xmlns:mc="http://schemas.openxmlformats.org/markup-compatibility/2006" xmlns:aink="http://schemas.microsoft.com/office/drawing/2016/ink" xmlns:am3d="http://schemas.microsoft.com/office/drawing/2017/model3d" xmlns:o="urn:schemas-microsoft-com:office:office" xmlns:oel="http://schemas.microsoft.com/office/2019/extlst" xmlns:r="http://schemas.openxmlformats.org/officeDocument/2006/relationships" xmlns:m="http://schemas.openxmlformats.org/officeDocument/2006/math" xmlns:v="urn:schemas-microsoft-com:vml" xmlns:wp14="http://schemas.microsoft.com/office/word/2010/wordprocessingDrawing" xmlns:wp="http://schemas.openxmlformats.org/drawingml/2006/wordprocessingDrawing" xmlns:w10="urn:schemas-microsoft-com:office:word" xmlns:w="http://schemas.openxmlformats.org/wordprocessingml/2006/main" xmlns:w14="http://schemas.microsoft.com/office/word/2010/wordml" xmlns:w15="http://schemas.microsoft.com/office/word/2012/wordml" xmlns:w16cex="http://schemas.microsoft.com/office/word/2018/wordml/cex" xmlns:w16cid="http://schemas.microsoft.com/office/word/2016/wordml/cid" xmlns:w16="http://schemas.microsoft.com/office/word/2018/wordml" xmlns:w16du="http://schemas.microsoft.com/office/word/2023/wordml/word16du" xmlns:w16sdtdh="http://schemas.microsoft.com/office/word/2020/wordml/sdtdatahash" xmlns:w16se="http://schemas.microsoft.com/office/word/2015/wordml/symex" xmlns:wpg="http://schemas.microsoft.com/office/word/2010/wordprocessingGroup" xmlns:wpi="http://schemas.microsoft.com/office/word/2010/wordprocessingInk" xmlns:wne="http://schemas.microsoft.com/office/word/2006/wordml" xmlns:wps="http://schemas.microsoft.com/office/word/2010/wordprocessingShape" mc:Ignorable="w14 w15 w16se w16cid w16 w16cex w16sdtdh wp14">
   <w:footnote w:type="separator" w:id="-1">
     <w:p>
       <w:r>
@@ -16694,7 +17478,7 @@
 </file>
 
 <file path=word/header1.xml><?xml version="1.0" encoding="utf-8"?>
-<w:hdr xmlns:wpc="http://schemas.microsoft.com/office/word/2010/wordprocessingCanvas" xmlns:cx="http://schemas.microsoft.com/office/drawing/2014/chartex" xmlns:cx1="http://schemas.microsoft.com/office/drawing/2015/9/8/chartex" xmlns:cx2="http://schemas.microsoft.com/office/drawing/2015/10/21/chartex" xmlns:cx3="http://schemas.microsoft.com/office/drawing/2016/5/9/chartex" xmlns:cx4="http://schemas.microsoft.com/office/drawing/2016/5/10/chartex" xmlns:cx5="http://schemas.microsoft.com/office/drawing/2016/5/11/chartex" xmlns:cx6="http://schemas.microsoft.com/office/drawing/2016/5/12/chartex" xmlns:cx7="http://schemas.microsoft.com/office/drawing/2016/5/13/chartex" xmlns:cx8="http://schemas.microsoft.com/office/drawing/2016/5/14/chartex" xmlns:mc="http://schemas.openxmlformats.org/markup-compatibility/2006" xmlns:aink="http://schemas.microsoft.com/office/drawing/2016/ink" xmlns:am3d="http://schemas.microsoft.com/office/drawing/2017/model3d" xmlns:o="urn:schemas-microsoft-com:office:office" xmlns:oel="http://schemas.microsoft.com/office/2019/extlst" xmlns:r="http://schemas.openxmlformats.org/officeDocument/2006/relationships" xmlns:m="http://schemas.openxmlformats.org/officeDocument/2006/math" xmlns:v="urn:schemas-microsoft-com:vml" xmlns:wp14="http://schemas.microsoft.com/office/word/2010/wordprocessingDrawing" xmlns:wp="http://schemas.openxmlformats.org/drawingml/2006/wordprocessingDrawing" xmlns:w10="urn:schemas-microsoft-com:office:word" xmlns:w="http://schemas.openxmlformats.org/wordprocessingml/2006/main" xmlns:w14="http://schemas.microsoft.com/office/word/2010/wordml" xmlns:w15="http://schemas.microsoft.com/office/word/2012/wordml" xmlns:w16cex="http://schemas.microsoft.com/office/word/2018/wordml/cex" xmlns:w16cid="http://schemas.microsoft.com/office/word/2016/wordml/cid" xmlns:w16="http://schemas.microsoft.com/office/word/2018/wordml" xmlns:w16sdtdh="http://schemas.microsoft.com/office/word/2020/wordml/sdtdatahash" xmlns:w16se="http://schemas.microsoft.com/office/word/2015/wordml/symex" xmlns:wpg="http://schemas.microsoft.com/office/word/2010/wordprocessingGroup" xmlns:wpi="http://schemas.microsoft.com/office/word/2010/wordprocessingInk" xmlns:wne="http://schemas.microsoft.com/office/word/2006/wordml" xmlns:wps="http://schemas.microsoft.com/office/word/2010/wordprocessingShape" mc:Ignorable="w14 w15 w16se w16cid w16 w16cex w16sdtdh wp14">
+<w:hdr xmlns:wpc="http://schemas.microsoft.com/office/word/2010/wordprocessingCanvas" xmlns:cx="http://schemas.microsoft.com/office/drawing/2014/chartex" xmlns:cx1="http://schemas.microsoft.com/office/drawing/2015/9/8/chartex" xmlns:cx2="http://schemas.microsoft.com/office/drawing/2015/10/21/chartex" xmlns:cx3="http://schemas.microsoft.com/office/drawing/2016/5/9/chartex" xmlns:cx4="http://schemas.microsoft.com/office/drawing/2016/5/10/chartex" xmlns:cx5="http://schemas.microsoft.com/office/drawing/2016/5/11/chartex" xmlns:cx6="http://schemas.microsoft.com/office/drawing/2016/5/12/chartex" xmlns:cx7="http://schemas.microsoft.com/office/drawing/2016/5/13/chartex" xmlns:cx8="http://schemas.microsoft.com/office/drawing/2016/5/14/chartex" xmlns:mc="http://schemas.openxmlformats.org/markup-compatibility/2006" xmlns:aink="http://schemas.microsoft.com/office/drawing/2016/ink" xmlns:am3d="http://schemas.microsoft.com/office/drawing/2017/model3d" xmlns:o="urn:schemas-microsoft-com:office:office" xmlns:oel="http://schemas.microsoft.com/office/2019/extlst" xmlns:r="http://schemas.openxmlformats.org/officeDocument/2006/relationships" xmlns:m="http://schemas.openxmlformats.org/officeDocument/2006/math" xmlns:v="urn:schemas-microsoft-com:vml" xmlns:wp14="http://schemas.microsoft.com/office/word/2010/wordprocessingDrawing" xmlns:wp="http://schemas.openxmlformats.org/drawingml/2006/wordprocessingDrawing" xmlns:w10="urn:schemas-microsoft-com:office:word" xmlns:w="http://schemas.openxmlformats.org/wordprocessingml/2006/main" xmlns:w14="http://schemas.microsoft.com/office/word/2010/wordml" xmlns:w15="http://schemas.microsoft.com/office/word/2012/wordml" xmlns:w16cex="http://schemas.microsoft.com/office/word/2018/wordml/cex" xmlns:w16cid="http://schemas.microsoft.com/office/word/2016/wordml/cid" xmlns:w16="http://schemas.microsoft.com/office/word/2018/wordml" xmlns:w16du="http://schemas.microsoft.com/office/word/2023/wordml/word16du" xmlns:w16sdtdh="http://schemas.microsoft.com/office/word/2020/wordml/sdtdatahash" xmlns:w16se="http://schemas.microsoft.com/office/word/2015/wordml/symex" xmlns:wpg="http://schemas.microsoft.com/office/word/2010/wordprocessingGroup" xmlns:wpi="http://schemas.microsoft.com/office/word/2010/wordprocessingInk" xmlns:wne="http://schemas.microsoft.com/office/word/2006/wordml" xmlns:wps="http://schemas.microsoft.com/office/word/2010/wordprocessingShape" mc:Ignorable="w14 w15 w16se w16cid w16 w16cex w16sdtdh wp14">
   <w:p>
     <w:pPr>
       <w:pStyle w:val="Kopfzeile"/>
@@ -16704,7 +17488,7 @@
 </file>
 
 <file path=word/header2.xml><?xml version="1.0" encoding="utf-8"?>
-<w:hdr xmlns:wpc="http://schemas.microsoft.com/office/word/2010/wordprocessingCanvas" xmlns:cx="http://schemas.microsoft.com/office/drawing/2014/chartex" xmlns:cx1="http://schemas.microsoft.com/office/drawing/2015/9/8/chartex" xmlns:cx2="http://schemas.microsoft.com/office/drawing/2015/10/21/chartex" xmlns:cx3="http://schemas.microsoft.com/office/drawing/2016/5/9/chartex" xmlns:cx4="http://schemas.microsoft.com/office/drawing/2016/5/10/chartex" xmlns:cx5="http://schemas.microsoft.com/office/drawing/2016/5/11/chartex" xmlns:cx6="http://schemas.microsoft.com/office/drawing/2016/5/12/chartex" xmlns:cx7="http://schemas.microsoft.com/office/drawing/2016/5/13/chartex" xmlns:cx8="http://schemas.microsoft.com/office/drawing/2016/5/14/chartex" xmlns:mc="http://schemas.openxmlformats.org/markup-compatibility/2006" xmlns:aink="http://schemas.microsoft.com/office/drawing/2016/ink" xmlns:am3d="http://schemas.microsoft.com/office/drawing/2017/model3d" xmlns:o="urn:schemas-microsoft-com:office:office" xmlns:oel="http://schemas.microsoft.com/office/2019/extlst" xmlns:r="http://schemas.openxmlformats.org/officeDocument/2006/relationships" xmlns:m="http://schemas.openxmlformats.org/officeDocument/2006/math" xmlns:v="urn:schemas-microsoft-com:vml" xmlns:wp14="http://schemas.microsoft.com/office/word/2010/wordprocessingDrawing" xmlns:wp="http://schemas.openxmlformats.org/drawingml/2006/wordprocessingDrawing" xmlns:w10="urn:schemas-microsoft-com:office:word" xmlns:w="http://schemas.openxmlformats.org/wordprocessingml/2006/main" xmlns:w14="http://schemas.microsoft.com/office/word/2010/wordml" xmlns:w15="http://schemas.microsoft.com/office/word/2012/wordml" xmlns:w16cex="http://schemas.microsoft.com/office/word/2018/wordml/cex" xmlns:w16cid="http://schemas.microsoft.com/office/word/2016/wordml/cid" xmlns:w16="http://schemas.microsoft.com/office/word/2018/wordml" xmlns:w16sdtdh="http://schemas.microsoft.com/office/word/2020/wordml/sdtdatahash" xmlns:w16se="http://schemas.microsoft.com/office/word/2015/wordml/symex" xmlns:wpg="http://schemas.microsoft.com/office/word/2010/wordprocessingGroup" xmlns:wpi="http://schemas.microsoft.com/office/word/2010/wordprocessingInk" xmlns:wne="http://schemas.microsoft.com/office/word/2006/wordml" xmlns:wps="http://schemas.microsoft.com/office/word/2010/wordprocessingShape" mc:Ignorable="w14 w15 w16se w16cid w16 w16cex w16sdtdh wp14">
+<w:hdr xmlns:wpc="http://schemas.microsoft.com/office/word/2010/wordprocessingCanvas" xmlns:cx="http://schemas.microsoft.com/office/drawing/2014/chartex" xmlns:cx1="http://schemas.microsoft.com/office/drawing/2015/9/8/chartex" xmlns:cx2="http://schemas.microsoft.com/office/drawing/2015/10/21/chartex" xmlns:cx3="http://schemas.microsoft.com/office/drawing/2016/5/9/chartex" xmlns:cx4="http://schemas.microsoft.com/office/drawing/2016/5/10/chartex" xmlns:cx5="http://schemas.microsoft.com/office/drawing/2016/5/11/chartex" xmlns:cx6="http://schemas.microsoft.com/office/drawing/2016/5/12/chartex" xmlns:cx7="http://schemas.microsoft.com/office/drawing/2016/5/13/chartex" xmlns:cx8="http://schemas.microsoft.com/office/drawing/2016/5/14/chartex" xmlns:mc="http://schemas.openxmlformats.org/markup-compatibility/2006" xmlns:aink="http://schemas.microsoft.com/office/drawing/2016/ink" xmlns:am3d="http://schemas.microsoft.com/office/drawing/2017/model3d" xmlns:o="urn:schemas-microsoft-com:office:office" xmlns:oel="http://schemas.microsoft.com/office/2019/extlst" xmlns:r="http://schemas.openxmlformats.org/officeDocument/2006/relationships" xmlns:m="http://schemas.openxmlformats.org/officeDocument/2006/math" xmlns:v="urn:schemas-microsoft-com:vml" xmlns:wp14="http://schemas.microsoft.com/office/word/2010/wordprocessingDrawing" xmlns:wp="http://schemas.openxmlformats.org/drawingml/2006/wordprocessingDrawing" xmlns:w10="urn:schemas-microsoft-com:office:word" xmlns:w="http://schemas.openxmlformats.org/wordprocessingml/2006/main" xmlns:w14="http://schemas.microsoft.com/office/word/2010/wordml" xmlns:w15="http://schemas.microsoft.com/office/word/2012/wordml" xmlns:w16cex="http://schemas.microsoft.com/office/word/2018/wordml/cex" xmlns:w16cid="http://schemas.microsoft.com/office/word/2016/wordml/cid" xmlns:w16="http://schemas.microsoft.com/office/word/2018/wordml" xmlns:w16du="http://schemas.microsoft.com/office/word/2023/wordml/word16du" xmlns:w16sdtdh="http://schemas.microsoft.com/office/word/2020/wordml/sdtdatahash" xmlns:w16se="http://schemas.microsoft.com/office/word/2015/wordml/symex" xmlns:wpg="http://schemas.microsoft.com/office/word/2010/wordprocessingGroup" xmlns:wpi="http://schemas.microsoft.com/office/word/2010/wordprocessingInk" xmlns:wne="http://schemas.microsoft.com/office/word/2006/wordml" xmlns:wps="http://schemas.microsoft.com/office/word/2010/wordprocessingShape" mc:Ignorable="w14 w15 w16se w16cid w16 w16cex w16sdtdh wp14">
   <w:p>
     <w:pPr>
       <w:pStyle w:val="Kopfzeile"/>
@@ -17000,7 +17784,7 @@
 </file>
 
 <file path=word/header3.xml><?xml version="1.0" encoding="utf-8"?>
-<w:hdr xmlns:wpc="http://schemas.microsoft.com/office/word/2010/wordprocessingCanvas" xmlns:cx="http://schemas.microsoft.com/office/drawing/2014/chartex" xmlns:cx1="http://schemas.microsoft.com/office/drawing/2015/9/8/chartex" xmlns:cx2="http://schemas.microsoft.com/office/drawing/2015/10/21/chartex" xmlns:cx3="http://schemas.microsoft.com/office/drawing/2016/5/9/chartex" xmlns:cx4="http://schemas.microsoft.com/office/drawing/2016/5/10/chartex" xmlns:cx5="http://schemas.microsoft.com/office/drawing/2016/5/11/chartex" xmlns:cx6="http://schemas.microsoft.com/office/drawing/2016/5/12/chartex" xmlns:cx7="http://schemas.microsoft.com/office/drawing/2016/5/13/chartex" xmlns:cx8="http://schemas.microsoft.com/office/drawing/2016/5/14/chartex" xmlns:mc="http://schemas.openxmlformats.org/markup-compatibility/2006" xmlns:aink="http://schemas.microsoft.com/office/drawing/2016/ink" xmlns:am3d="http://schemas.microsoft.com/office/drawing/2017/model3d" xmlns:o="urn:schemas-microsoft-com:office:office" xmlns:oel="http://schemas.microsoft.com/office/2019/extlst" xmlns:r="http://schemas.openxmlformats.org/officeDocument/2006/relationships" xmlns:m="http://schemas.openxmlformats.org/officeDocument/2006/math" xmlns:v="urn:schemas-microsoft-com:vml" xmlns:wp14="http://schemas.microsoft.com/office/word/2010/wordprocessingDrawing" xmlns:wp="http://schemas.openxmlformats.org/drawingml/2006/wordprocessingDrawing" xmlns:w10="urn:schemas-microsoft-com:office:word" xmlns:w="http://schemas.openxmlformats.org/wordprocessingml/2006/main" xmlns:w14="http://schemas.microsoft.com/office/word/2010/wordml" xmlns:w15="http://schemas.microsoft.com/office/word/2012/wordml" xmlns:w16cex="http://schemas.microsoft.com/office/word/2018/wordml/cex" xmlns:w16cid="http://schemas.microsoft.com/office/word/2016/wordml/cid" xmlns:w16="http://schemas.microsoft.com/office/word/2018/wordml" xmlns:w16sdtdh="http://schemas.microsoft.com/office/word/2020/wordml/sdtdatahash" xmlns:w16se="http://schemas.microsoft.com/office/word/2015/wordml/symex" xmlns:wpg="http://schemas.microsoft.com/office/word/2010/wordprocessingGroup" xmlns:wpi="http://schemas.microsoft.com/office/word/2010/wordprocessingInk" xmlns:wne="http://schemas.microsoft.com/office/word/2006/wordml" xmlns:wps="http://schemas.microsoft.com/office/word/2010/wordprocessingShape" mc:Ignorable="w14 w15 w16se w16cid w16 w16cex w16sdtdh wp14">
+<w:hdr xmlns:wpc="http://schemas.microsoft.com/office/word/2010/wordprocessingCanvas" xmlns:cx="http://schemas.microsoft.com/office/drawing/2014/chartex" xmlns:cx1="http://schemas.microsoft.com/office/drawing/2015/9/8/chartex" xmlns:cx2="http://schemas.microsoft.com/office/drawing/2015/10/21/chartex" xmlns:cx3="http://schemas.microsoft.com/office/drawing/2016/5/9/chartex" xmlns:cx4="http://schemas.microsoft.com/office/drawing/2016/5/10/chartex" xmlns:cx5="http://schemas.microsoft.com/office/drawing/2016/5/11/chartex" xmlns:cx6="http://schemas.microsoft.com/office/drawing/2016/5/12/chartex" xmlns:cx7="http://schemas.microsoft.com/office/drawing/2016/5/13/chartex" xmlns:cx8="http://schemas.microsoft.com/office/drawing/2016/5/14/chartex" xmlns:mc="http://schemas.openxmlformats.org/markup-compatibility/2006" xmlns:aink="http://schemas.microsoft.com/office/drawing/2016/ink" xmlns:am3d="http://schemas.microsoft.com/office/drawing/2017/model3d" xmlns:o="urn:schemas-microsoft-com:office:office" xmlns:oel="http://schemas.microsoft.com/office/2019/extlst" xmlns:r="http://schemas.openxmlformats.org/officeDocument/2006/relationships" xmlns:m="http://schemas.openxmlformats.org/officeDocument/2006/math" xmlns:v="urn:schemas-microsoft-com:vml" xmlns:wp14="http://schemas.microsoft.com/office/word/2010/wordprocessingDrawing" xmlns:wp="http://schemas.openxmlformats.org/drawingml/2006/wordprocessingDrawing" xmlns:w10="urn:schemas-microsoft-com:office:word" xmlns:w="http://schemas.openxmlformats.org/wordprocessingml/2006/main" xmlns:w14="http://schemas.microsoft.com/office/word/2010/wordml" xmlns:w15="http://schemas.microsoft.com/office/word/2012/wordml" xmlns:w16cex="http://schemas.microsoft.com/office/word/2018/wordml/cex" xmlns:w16cid="http://schemas.microsoft.com/office/word/2016/wordml/cid" xmlns:w16="http://schemas.microsoft.com/office/word/2018/wordml" xmlns:w16du="http://schemas.microsoft.com/office/word/2023/wordml/word16du" xmlns:w16sdtdh="http://schemas.microsoft.com/office/word/2020/wordml/sdtdatahash" xmlns:w16se="http://schemas.microsoft.com/office/word/2015/wordml/symex" xmlns:wpg="http://schemas.microsoft.com/office/word/2010/wordprocessingGroup" xmlns:wpi="http://schemas.microsoft.com/office/word/2010/wordprocessingInk" xmlns:wne="http://schemas.microsoft.com/office/word/2006/wordml" xmlns:wps="http://schemas.microsoft.com/office/word/2010/wordprocessingShape" mc:Ignorable="w14 w15 w16se w16cid w16 w16cex w16sdtdh wp14">
   <w:p>
     <w:pPr>
       <w:pStyle w:val="Kopfzeile"/>
@@ -17010,7 +17794,7 @@
 </file>
 
 <file path=word/numbering.xml><?xml version="1.0" encoding="utf-8"?>
-<w:numbering xmlns:wpc="http://schemas.microsoft.com/office/word/2010/wordprocessingCanvas" xmlns:cx="http://schemas.microsoft.com/office/drawing/2014/chartex" xmlns:cx1="http://schemas.microsoft.com/office/drawing/2015/9/8/chartex" xmlns:cx2="http://schemas.microsoft.com/office/drawing/2015/10/21/chartex" xmlns:cx3="http://schemas.microsoft.com/office/drawing/2016/5/9/chartex" xmlns:cx4="http://schemas.microsoft.com/office/drawing/2016/5/10/chartex" xmlns:cx5="http://schemas.microsoft.com/office/drawing/2016/5/11/chartex" xmlns:cx6="http://schemas.microsoft.com/office/drawing/2016/5/12/chartex" xmlns:cx7="http://schemas.microsoft.com/office/drawing/2016/5/13/chartex" xmlns:cx8="http://schemas.microsoft.com/office/drawing/2016/5/14/chartex" xmlns:mc="http://schemas.openxmlformats.org/markup-compatibility/2006" xmlns:aink="http://schemas.microsoft.com/office/drawing/2016/ink" xmlns:am3d="http://schemas.microsoft.com/office/drawing/2017/model3d" xmlns:o="urn:schemas-microsoft-com:office:office" xmlns:oel="http://schemas.microsoft.com/office/2019/extlst" xmlns:r="http://schemas.openxmlformats.org/officeDocument/2006/relationships" xmlns:m="http://schemas.openxmlformats.org/officeDocument/2006/math" xmlns:v="urn:schemas-microsoft-com:vml" xmlns:wp14="http://schemas.microsoft.com/office/word/2010/wordprocessingDrawing" xmlns:wp="http://schemas.openxmlformats.org/drawingml/2006/wordprocessingDrawing" xmlns:w10="urn:schemas-microsoft-com:office:word" xmlns:w="http://schemas.openxmlformats.org/wordprocessingml/2006/main" xmlns:w14="http://schemas.microsoft.com/office/word/2010/wordml" xmlns:w15="http://schemas.microsoft.com/office/word/2012/wordml" xmlns:w16cex="http://schemas.microsoft.com/office/word/2018/wordml/cex" xmlns:w16cid="http://schemas.microsoft.com/office/word/2016/wordml/cid" xmlns:w16="http://schemas.microsoft.com/office/word/2018/wordml" xmlns:w16sdtdh="http://schemas.microsoft.com/office/word/2020/wordml/sdtdatahash" xmlns:w16se="http://schemas.microsoft.com/office/word/2015/wordml/symex" xmlns:wpg="http://schemas.microsoft.com/office/word/2010/wordprocessingGroup" xmlns:wpi="http://schemas.microsoft.com/office/word/2010/wordprocessingInk" xmlns:wne="http://schemas.microsoft.com/office/word/2006/wordml" xmlns:wps="http://schemas.microsoft.com/office/word/2010/wordprocessingShape" mc:Ignorable="w14 w15 w16se w16cid w16 w16cex w16sdtdh wp14">
+<w:numbering xmlns:wpc="http://schemas.microsoft.com/office/word/2010/wordprocessingCanvas" xmlns:cx="http://schemas.microsoft.com/office/drawing/2014/chartex" xmlns:cx1="http://schemas.microsoft.com/office/drawing/2015/9/8/chartex" xmlns:cx2="http://schemas.microsoft.com/office/drawing/2015/10/21/chartex" xmlns:cx3="http://schemas.microsoft.com/office/drawing/2016/5/9/chartex" xmlns:cx4="http://schemas.microsoft.com/office/drawing/2016/5/10/chartex" xmlns:cx5="http://schemas.microsoft.com/office/drawing/2016/5/11/chartex" xmlns:cx6="http://schemas.microsoft.com/office/drawing/2016/5/12/chartex" xmlns:cx7="http://schemas.microsoft.com/office/drawing/2016/5/13/chartex" xmlns:cx8="http://schemas.microsoft.com/office/drawing/2016/5/14/chartex" xmlns:mc="http://schemas.openxmlformats.org/markup-compatibility/2006" xmlns:aink="http://schemas.microsoft.com/office/drawing/2016/ink" xmlns:am3d="http://schemas.microsoft.com/office/drawing/2017/model3d" xmlns:o="urn:schemas-microsoft-com:office:office" xmlns:oel="http://schemas.microsoft.com/office/2019/extlst" xmlns:r="http://schemas.openxmlformats.org/officeDocument/2006/relationships" xmlns:m="http://schemas.openxmlformats.org/officeDocument/2006/math" xmlns:v="urn:schemas-microsoft-com:vml" xmlns:wp14="http://schemas.microsoft.com/office/word/2010/wordprocessingDrawing" xmlns:wp="http://schemas.openxmlformats.org/drawingml/2006/wordprocessingDrawing" xmlns:w10="urn:schemas-microsoft-com:office:word" xmlns:w="http://schemas.openxmlformats.org/wordprocessingml/2006/main" xmlns:w14="http://schemas.microsoft.com/office/word/2010/wordml" xmlns:w15="http://schemas.microsoft.com/office/word/2012/wordml" xmlns:w16cex="http://schemas.microsoft.com/office/word/2018/wordml/cex" xmlns:w16cid="http://schemas.microsoft.com/office/word/2016/wordml/cid" xmlns:w16="http://schemas.microsoft.com/office/word/2018/wordml" xmlns:w16du="http://schemas.microsoft.com/office/word/2023/wordml/word16du" xmlns:w16sdtdh="http://schemas.microsoft.com/office/word/2020/wordml/sdtdatahash" xmlns:w16se="http://schemas.microsoft.com/office/word/2015/wordml/symex" xmlns:wpg="http://schemas.microsoft.com/office/word/2010/wordprocessingGroup" xmlns:wpi="http://schemas.microsoft.com/office/word/2010/wordprocessingInk" xmlns:wne="http://schemas.microsoft.com/office/word/2006/wordml" xmlns:wps="http://schemas.microsoft.com/office/word/2010/wordprocessingShape" mc:Ignorable="w14 w15 w16se w16cid w16 w16cex w16sdtdh wp14">
   <w:abstractNum w:abstractNumId="0" w15:restartNumberingAfterBreak="0">
     <w:nsid w:val="01C349A5"/>
     <w:multiLevelType w:val="hybridMultilevel"/>
@@ -17262,7 +18046,7 @@
         <w:ind w:left="1440" w:hanging="360"/>
       </w:pPr>
       <w:rPr>
-        <w:rFonts w:ascii="helvetica 45" w:eastAsia="Times New Roman" w:hAnsi="helvetica 45" w:cs="Times New Roman" w:hint="default"/>
+        <w:rFonts w:ascii="Helvetica 45" w:eastAsia="Times New Roman" w:hAnsi="Helvetica 45" w:cs="Times New Roman" w:hint="default"/>
         <w:color w:val="000000"/>
       </w:rPr>
     </w:lvl>
@@ -17275,7 +18059,7 @@
         <w:ind w:left="2340" w:hanging="360"/>
       </w:pPr>
       <w:rPr>
-        <w:rFonts w:ascii="helvetica 45" w:eastAsia="Times New Roman" w:hAnsi="helvetica 45" w:cs="Times New Roman" w:hint="default"/>
+        <w:rFonts w:ascii="Helvetica 45" w:eastAsia="Times New Roman" w:hAnsi="Helvetica 45" w:cs="Times New Roman" w:hint="default"/>
         <w:color w:val="000000"/>
       </w:rPr>
     </w:lvl>
@@ -18040,7 +18824,7 @@
         <w:ind w:left="2340" w:hanging="360"/>
       </w:pPr>
       <w:rPr>
-        <w:rFonts w:ascii="helvetica 45" w:eastAsia="Times New Roman" w:hAnsi="helvetica 45" w:cs="Times New Roman" w:hint="default"/>
+        <w:rFonts w:ascii="Helvetica 45" w:eastAsia="Times New Roman" w:hAnsi="Helvetica 45" w:cs="Times New Roman" w:hint="default"/>
         <w:color w:val="000000"/>
       </w:rPr>
     </w:lvl>
@@ -18493,7 +19277,7 @@
         <w:ind w:left="720" w:hanging="360"/>
       </w:pPr>
       <w:rPr>
-        <w:rFonts w:ascii="helvetica 45" w:eastAsia="Times New Roman" w:hAnsi="helvetica 45" w:cs="Times New Roman" w:hint="default"/>
+        <w:rFonts w:ascii="Helvetica 45" w:eastAsia="Times New Roman" w:hAnsi="Helvetica 45" w:cs="Times New Roman" w:hint="default"/>
         <w:color w:val="000000"/>
       </w:rPr>
     </w:lvl>
@@ -18946,7 +19730,7 @@
         <w:ind w:left="720" w:hanging="360"/>
       </w:pPr>
       <w:rPr>
-        <w:rFonts w:ascii="helvetica 45" w:eastAsia="Times New Roman" w:hAnsi="helvetica 45" w:cs="Times New Roman" w:hint="default"/>
+        <w:rFonts w:ascii="Helvetica 45" w:eastAsia="Times New Roman" w:hAnsi="Helvetica 45" w:cs="Times New Roman" w:hint="default"/>
         <w:color w:val="000000"/>
       </w:rPr>
     </w:lvl>
@@ -19173,7 +19957,7 @@
         <w:ind w:left="720" w:hanging="360"/>
       </w:pPr>
       <w:rPr>
-        <w:rFonts w:ascii="helvetica 45" w:eastAsia="Times New Roman" w:hAnsi="helvetica 45" w:cs="Times New Roman" w:hint="default"/>
+        <w:rFonts w:ascii="Helvetica 45" w:eastAsia="Times New Roman" w:hAnsi="Helvetica 45" w:cs="Times New Roman" w:hint="default"/>
         <w:color w:val="000000"/>
       </w:rPr>
     </w:lvl>
@@ -19198,7 +19982,7 @@
         <w:ind w:left="720" w:hanging="360"/>
       </w:pPr>
       <w:rPr>
-        <w:rFonts w:ascii="helvetica 45" w:eastAsia="Times New Roman" w:hAnsi="helvetica 45" w:cs="Times New Roman" w:hint="default"/>
+        <w:rFonts w:ascii="Helvetica 45" w:eastAsia="Times New Roman" w:hAnsi="Helvetica 45" w:cs="Times New Roman" w:hint="default"/>
         <w:color w:val="000000"/>
       </w:rPr>
     </w:lvl>
@@ -19854,7 +20638,7 @@
         <w:ind w:left="720" w:hanging="360"/>
       </w:pPr>
       <w:rPr>
-        <w:rFonts w:ascii="helvetica 45" w:eastAsia="Times New Roman" w:hAnsi="helvetica 45" w:cs="Times New Roman" w:hint="default"/>
+        <w:rFonts w:ascii="Helvetica 45" w:eastAsia="Times New Roman" w:hAnsi="Helvetica 45" w:cs="Times New Roman" w:hint="default"/>
         <w:color w:val="000000"/>
       </w:rPr>
     </w:lvl>
@@ -20396,7 +21180,7 @@
         <w:ind w:left="720" w:hanging="360"/>
       </w:pPr>
       <w:rPr>
-        <w:rFonts w:ascii="helvetica 45" w:eastAsia="Times New Roman" w:hAnsi="helvetica 45" w:cs="Times New Roman" w:hint="default"/>
+        <w:rFonts w:ascii="Helvetica 45" w:eastAsia="Times New Roman" w:hAnsi="Helvetica 45" w:cs="Times New Roman" w:hint="default"/>
         <w:color w:val="000000"/>
       </w:rPr>
     </w:lvl>
@@ -20534,7 +21318,7 @@
         <w:ind w:left="2340" w:hanging="360"/>
       </w:pPr>
       <w:rPr>
-        <w:rFonts w:ascii="helvetica 45" w:eastAsia="Times New Roman" w:hAnsi="helvetica 45" w:cs="Times New Roman" w:hint="default"/>
+        <w:rFonts w:ascii="Helvetica 45" w:eastAsia="Times New Roman" w:hAnsi="Helvetica 45" w:cs="Times New Roman" w:hint="default"/>
         <w:color w:val="000000"/>
       </w:rPr>
     </w:lvl>
@@ -22301,7 +23085,7 @@
         <w:ind w:left="720" w:hanging="360"/>
       </w:pPr>
       <w:rPr>
-        <w:rFonts w:ascii="helvetica 45" w:eastAsia="Times New Roman" w:hAnsi="helvetica 45" w:cs="Times New Roman" w:hint="default"/>
+        <w:rFonts w:ascii="Helvetica 45" w:eastAsia="Times New Roman" w:hAnsi="Helvetica 45" w:cs="Times New Roman" w:hint="default"/>
         <w:color w:val="000000"/>
       </w:rPr>
     </w:lvl>
@@ -22415,7 +23199,7 @@
         <w:ind w:left="720" w:hanging="360"/>
       </w:pPr>
       <w:rPr>
-        <w:rFonts w:ascii="helvetica 45" w:eastAsia="Times New Roman" w:hAnsi="helvetica 45" w:cs="Times New Roman" w:hint="default"/>
+        <w:rFonts w:ascii="Helvetica 45" w:eastAsia="Times New Roman" w:hAnsi="Helvetica 45" w:cs="Times New Roman" w:hint="default"/>
         <w:color w:val="000000"/>
       </w:rPr>
     </w:lvl>
@@ -22664,6 +23448,14 @@
     <w:abstractNumId w:val="25"/>
   </w:num>
 </w:numbering>
+</file>
+
+<file path=word/people.xml><?xml version="1.0" encoding="utf-8"?>
+<w15:people xmlns:wpc="http://schemas.microsoft.com/office/word/2010/wordprocessingCanvas" xmlns:cx="http://schemas.microsoft.com/office/drawing/2014/chartex" xmlns:cx1="http://schemas.microsoft.com/office/drawing/2015/9/8/chartex" xmlns:cx2="http://schemas.microsoft.com/office/drawing/2015/10/21/chartex" xmlns:cx3="http://schemas.microsoft.com/office/drawing/2016/5/9/chartex" xmlns:cx4="http://schemas.microsoft.com/office/drawing/2016/5/10/chartex" xmlns:cx5="http://schemas.microsoft.com/office/drawing/2016/5/11/chartex" xmlns:cx6="http://schemas.microsoft.com/office/drawing/2016/5/12/chartex" xmlns:cx7="http://schemas.microsoft.com/office/drawing/2016/5/13/chartex" xmlns:cx8="http://schemas.microsoft.com/office/drawing/2016/5/14/chartex" xmlns:mc="http://schemas.openxmlformats.org/markup-compatibility/2006" xmlns:aink="http://schemas.microsoft.com/office/drawing/2016/ink" xmlns:am3d="http://schemas.microsoft.com/office/drawing/2017/model3d" xmlns:o="urn:schemas-microsoft-com:office:office" xmlns:oel="http://schemas.microsoft.com/office/2019/extlst" xmlns:r="http://schemas.openxmlformats.org/officeDocument/2006/relationships" xmlns:m="http://schemas.openxmlformats.org/officeDocument/2006/math" xmlns:v="urn:schemas-microsoft-com:vml" xmlns:wp14="http://schemas.microsoft.com/office/word/2010/wordprocessingDrawing" xmlns:wp="http://schemas.openxmlformats.org/drawingml/2006/wordprocessingDrawing" xmlns:w10="urn:schemas-microsoft-com:office:word" xmlns:w="http://schemas.openxmlformats.org/wordprocessingml/2006/main" xmlns:w14="http://schemas.microsoft.com/office/word/2010/wordml" xmlns:w15="http://schemas.microsoft.com/office/word/2012/wordml" xmlns:w16cex="http://schemas.microsoft.com/office/word/2018/wordml/cex" xmlns:w16cid="http://schemas.microsoft.com/office/word/2016/wordml/cid" xmlns:w16="http://schemas.microsoft.com/office/word/2018/wordml" xmlns:w16du="http://schemas.microsoft.com/office/word/2023/wordml/word16du" xmlns:w16sdtdh="http://schemas.microsoft.com/office/word/2020/wordml/sdtdatahash" xmlns:w16se="http://schemas.microsoft.com/office/word/2015/wordml/symex" xmlns:wpg="http://schemas.microsoft.com/office/word/2010/wordprocessingGroup" xmlns:wpi="http://schemas.microsoft.com/office/word/2010/wordprocessingInk" xmlns:wne="http://schemas.microsoft.com/office/word/2006/wordml" xmlns:wps="http://schemas.microsoft.com/office/word/2010/wordprocessingShape" mc:Ignorable="w14 w15 w16se w16cid w16 w16cex w16sdtdh wp14">
+  <w15:person w15:author="Ira Diethelm">
+    <w15:presenceInfo w15:providerId="Windows Live" w15:userId="aa756e1db070d33c"/>
+  </w15:person>
+</w15:people>
 </file>
 
 <file path=word/styles.xml><?xml version="1.0" encoding="utf-8"?>
@@ -22838,7 +23630,7 @@
     <w:lsdException w:name="Table Web 2" w:semiHidden="1" w:unhideWhenUsed="1"/>
     <w:lsdException w:name="Table Web 3" w:semiHidden="1" w:unhideWhenUsed="1"/>
     <w:lsdException w:name="Balloon Text" w:semiHidden="1" w:unhideWhenUsed="1"/>
-    <w:lsdException w:name="Table Grid" w:semiHidden="1" w:uiPriority="59" w:unhideWhenUsed="1"/>
+    <w:lsdException w:name="Table Grid" w:uiPriority="59"/>
     <w:lsdException w:name="Table Theme" w:semiHidden="1" w:unhideWhenUsed="1"/>
     <w:lsdException w:name="Placeholder Text" w:semiHidden="1"/>
     <w:lsdException w:name="No Spacing" w:uiPriority="1" w:qFormat="1"/>
@@ -23087,7 +23879,7 @@
       <w:outlineLvl w:val="0"/>
     </w:pPr>
     <w:rPr>
-      <w:rFonts w:ascii="helvetica 65" w:hAnsi="helvetica 65"/>
+      <w:rFonts w:ascii="Helvetica 65" w:hAnsi="Helvetica 65"/>
       <w:bCs w:val="0"/>
       <w:color w:val="000000" w:themeColor="text1"/>
       <w:sz w:val="28"/>
@@ -23113,7 +23905,7 @@
       <w:outlineLvl w:val="1"/>
     </w:pPr>
     <w:rPr>
-      <w:rFonts w:ascii="helvetica 65" w:hAnsi="helvetica 65"/>
+      <w:rFonts w:ascii="Helvetica 65" w:hAnsi="Helvetica 65"/>
       <w:bCs w:val="0"/>
       <w:color w:val="000000" w:themeColor="text1"/>
       <w:sz w:val="24"/>
@@ -23139,7 +23931,7 @@
       <w:outlineLvl w:val="2"/>
     </w:pPr>
     <w:rPr>
-      <w:rFonts w:ascii="helvetica 65" w:hAnsi="helvetica 65"/>
+      <w:rFonts w:ascii="Helvetica 65" w:hAnsi="Helvetica 65"/>
       <w:bCs w:val="0"/>
       <w:color w:val="000000" w:themeColor="text1"/>
       <w:sz w:val="22"/>
@@ -34614,7 +35406,7 @@
     <w:link w:val="berschrift1"/>
     <w:uiPriority w:val="9"/>
     <w:rPr>
-      <w:rFonts w:ascii="helvetica 65" w:eastAsia="Arial" w:hAnsi="helvetica 65" w:cs="Arial"/>
+      <w:rFonts w:ascii="Helvetica 65" w:eastAsia="Arial" w:hAnsi="Helvetica 65" w:cs="Arial"/>
       <w:color w:val="000000" w:themeColor="text1"/>
       <w:sz w:val="28"/>
       <w:szCs w:val="36"/>
@@ -34643,7 +35435,7 @@
     <w:link w:val="berschrift2"/>
     <w:uiPriority w:val="9"/>
     <w:rPr>
-      <w:rFonts w:ascii="helvetica 65" w:hAnsi="helvetica 65"/>
+      <w:rFonts w:ascii="Helvetica 65" w:hAnsi="Helvetica 65"/>
       <w:color w:val="000000" w:themeColor="text1"/>
       <w:sz w:val="24"/>
       <w:szCs w:val="28"/>
@@ -34748,7 +35540,7 @@
     <w:link w:val="berschrift3"/>
     <w:uiPriority w:val="9"/>
     <w:rPr>
-      <w:rFonts w:ascii="helvetica 65" w:hAnsi="helvetica 65"/>
+      <w:rFonts w:ascii="Helvetica 65" w:hAnsi="Helvetica 65"/>
       <w:color w:val="000000" w:themeColor="text1"/>
       <w:lang w:eastAsia="de-DE"/>
     </w:rPr>
@@ -35257,7 +36049,7 @@
     <w:link w:val="Listenabsatz"/>
     <w:uiPriority w:val="34"/>
     <w:rPr>
-      <w:rFonts w:ascii="helvetica 45" w:eastAsia="Arial" w:hAnsi="helvetica 45"/>
+      <w:rFonts w:ascii="Helvetica 45" w:eastAsia="Arial" w:hAnsi="Helvetica 45"/>
       <w:bCs/>
       <w:sz w:val="21"/>
       <w:lang w:eastAsia="de-DE"/>
@@ -35269,7 +36061,7 @@
     <w:link w:val="WF-InhaltsverzeichnisZchn"/>
     <w:qFormat/>
     <w:rPr>
-      <w:rFonts w:ascii="helvetica 65" w:hAnsi="helvetica 65"/>
+      <w:rFonts w:ascii="Helvetica 65" w:hAnsi="Helvetica 65"/>
       <w:color w:val="000000" w:themeColor="text1"/>
       <w:sz w:val="28"/>
       <w:szCs w:val="36"/>
@@ -35280,7 +36072,7 @@
     <w:basedOn w:val="berschrift1Zchn"/>
     <w:link w:val="WF-Inhaltsverzeichnis"/>
     <w:rPr>
-      <w:rFonts w:ascii="helvetica 65" w:eastAsia="Arial" w:hAnsi="helvetica 65" w:cs="Arial"/>
+      <w:rFonts w:ascii="Helvetica 65" w:eastAsia="Arial" w:hAnsi="Helvetica 65" w:cs="Arial"/>
       <w:bCs/>
       <w:color w:val="000000" w:themeColor="text1"/>
       <w:sz w:val="28"/>
@@ -35305,7 +36097,7 @@
     <w:basedOn w:val="ListenabsatzZchn"/>
     <w:link w:val="WF-Listenabsatz-1-facherZeilenabstand"/>
     <w:rPr>
-      <w:rFonts w:ascii="helvetica 45" w:eastAsia="Arial" w:hAnsi="helvetica 45"/>
+      <w:rFonts w:ascii="Helvetica 45" w:eastAsia="Arial" w:hAnsi="Helvetica 45"/>
       <w:bCs/>
       <w:sz w:val="21"/>
       <w:lang w:eastAsia="de-DE"/>
@@ -35325,7 +36117,7 @@
     <w:basedOn w:val="Beschriftung"/>
     <w:qFormat/>
     <w:rPr>
-      <w:rFonts w:ascii="helvetica 55" w:hAnsi="helvetica 55"/>
+      <w:rFonts w:ascii="Helvetica 55" w:hAnsi="Helvetica 55"/>
       <w:lang w:val="en-US"/>
     </w:rPr>
   </w:style>
@@ -35360,7 +36152,7 @@
     <w:link w:val="Kommentartext"/>
     <w:uiPriority w:val="99"/>
     <w:rPr>
-      <w:rFonts w:ascii="helvetica 45" w:hAnsi="helvetica 45"/>
+      <w:rFonts w:ascii="Helvetica 45" w:hAnsi="Helvetica 45"/>
       <w:bCs/>
       <w:sz w:val="24"/>
       <w:szCs w:val="24"/>
@@ -35388,7 +36180,7 @@
     <w:uiPriority w:val="99"/>
     <w:semiHidden/>
     <w:rPr>
-      <w:rFonts w:ascii="helvetica 45" w:hAnsi="helvetica 45"/>
+      <w:rFonts w:ascii="Helvetica 45" w:hAnsi="Helvetica 45"/>
       <w:b/>
       <w:bCs/>
       <w:sz w:val="20"/>
@@ -35680,7 +36472,7 @@
 </file>
 
 <file path=customXml/itemProps1.xml><?xml version="1.0" encoding="utf-8"?>
-<ds:datastoreItem xmlns:ds="http://schemas.openxmlformats.org/officeDocument/2006/customXml" ds:itemID="{5D0AEA6B-E499-4EEF-98A3-AFBB261C493E}">
+<ds:datastoreItem xmlns:ds="http://schemas.openxmlformats.org/officeDocument/2006/customXml" ds:itemID="{405C25AE-95E1-484B-8FCE-EDCFB6BD9EBB}">
   <ds:schemaRefs>
     <ds:schemaRef ds:uri="http://schemas.openxmlformats.org/wordprocessingml/2006/main"/>
   </ds:schemaRefs>
@@ -35688,7 +36480,7 @@
 </file>
 
 <file path=customXml/itemProps2.xml><?xml version="1.0" encoding="utf-8"?>
-<ds:datastoreItem xmlns:ds="http://schemas.openxmlformats.org/officeDocument/2006/customXml" ds:itemID="{405C25AE-95E1-484B-8FCE-EDCFB6BD9EBB}">
+<ds:datastoreItem xmlns:ds="http://schemas.openxmlformats.org/officeDocument/2006/customXml" ds:itemID="{5D0AEA6B-E499-4EEF-98A3-AFBB261C493E}">
   <ds:schemaRefs>
     <ds:schemaRef ds:uri="http://schemas.openxmlformats.org/wordprocessingml/2006/main"/>
   </ds:schemaRefs>

</xml_diff>